<commit_message>
resubida de memoria 40% completed
</commit_message>
<xml_diff>
--- a/Adrian_Eduardo.docx
+++ b/Adrian_Eduardo.docx
@@ -1154,6 +1154,13 @@
     </w:p>
     <w:sdt>
       <w:sdtPr>
+        <w:rPr>
+          <w:rFonts w:ascii="Arial" w:eastAsiaTheme="minorHAnsi" w:hAnsi="Arial" w:cstheme="minorBidi"/>
+          <w:color w:val="auto"/>
+          <w:sz w:val="22"/>
+          <w:szCs w:val="22"/>
+          <w:lang w:eastAsia="en-US"/>
+        </w:rPr>
         <w:id w:val="401336003"/>
         <w:docPartObj>
           <w:docPartGallery w:val="Table of Contents"/>
@@ -1162,13 +1169,8 @@
       </w:sdtPr>
       <w:sdtEndPr>
         <w:rPr>
-          <w:rFonts w:ascii="Arial" w:eastAsiaTheme="minorHAnsi" w:hAnsi="Arial" w:cstheme="minorBidi"/>
           <w:b/>
           <w:bCs/>
-          <w:color w:val="auto"/>
-          <w:sz w:val="22"/>
-          <w:szCs w:val="22"/>
-          <w:lang w:eastAsia="en-US"/>
         </w:rPr>
       </w:sdtEndPr>
       <w:sdtContent>
@@ -1209,7 +1211,7 @@
           <w:r>
             <w:fldChar w:fldCharType="separate"/>
           </w:r>
-          <w:hyperlink w:anchor="_Toc227770856" w:history="1">
+          <w:hyperlink w:anchor="_Toc227779294" w:history="1">
             <w:r>
               <w:rPr>
                 <w:rStyle w:val="Hipervnculo"/>
@@ -1236,7 +1238,7 @@
                 <w:noProof/>
                 <w:webHidden/>
               </w:rPr>
-              <w:instrText xml:space="preserve"> PAGEREF _Toc227770856 \h </w:instrText>
+              <w:instrText xml:space="preserve"> PAGEREF _Toc227779294 \h </w:instrText>
             </w:r>
             <w:r>
               <w:rPr>
@@ -1256,7 +1258,7 @@
                 <w:noProof/>
                 <w:webHidden/>
               </w:rPr>
-              <w:t>3</w:t>
+              <w:t>4</w:t>
             </w:r>
             <w:r>
               <w:rPr>
@@ -1279,7 +1281,7 @@
               <w:lang w:eastAsia="es-ES"/>
             </w:rPr>
           </w:pPr>
-          <w:hyperlink w:anchor="_Toc227770857" w:history="1">
+          <w:hyperlink w:anchor="_Toc227779295" w:history="1">
             <w:r>
               <w:rPr>
                 <w:rStyle w:val="Hipervnculo"/>
@@ -1306,7 +1308,7 @@
                 <w:noProof/>
                 <w:webHidden/>
               </w:rPr>
-              <w:instrText xml:space="preserve"> PAGEREF _Toc227770857 \h </w:instrText>
+              <w:instrText xml:space="preserve"> PAGEREF _Toc227779295 \h </w:instrText>
             </w:r>
             <w:r>
               <w:rPr>
@@ -1326,7 +1328,7 @@
                 <w:noProof/>
                 <w:webHidden/>
               </w:rPr>
-              <w:t>3</w:t>
+              <w:t>4</w:t>
             </w:r>
             <w:r>
               <w:rPr>
@@ -1349,7 +1351,7 @@
               <w:lang w:eastAsia="es-ES"/>
             </w:rPr>
           </w:pPr>
-          <w:hyperlink w:anchor="_Toc227770858" w:history="1">
+          <w:hyperlink w:anchor="_Toc227779296" w:history="1">
             <w:r>
               <w:rPr>
                 <w:rStyle w:val="Hipervnculo"/>
@@ -1376,7 +1378,7 @@
                 <w:noProof/>
                 <w:webHidden/>
               </w:rPr>
-              <w:instrText xml:space="preserve"> PAGEREF _Toc227770858 \h </w:instrText>
+              <w:instrText xml:space="preserve"> PAGEREF _Toc227779296 \h </w:instrText>
             </w:r>
             <w:r>
               <w:rPr>
@@ -1396,7 +1398,7 @@
                 <w:noProof/>
                 <w:webHidden/>
               </w:rPr>
-              <w:t>3</w:t>
+              <w:t>4</w:t>
             </w:r>
             <w:r>
               <w:rPr>
@@ -1419,7 +1421,7 @@
               <w:lang w:eastAsia="es-ES"/>
             </w:rPr>
           </w:pPr>
-          <w:hyperlink w:anchor="_Toc227770859" w:history="1">
+          <w:hyperlink w:anchor="_Toc227779297" w:history="1">
             <w:r>
               <w:rPr>
                 <w:rStyle w:val="Hipervnculo"/>
@@ -1446,7 +1448,7 @@
                 <w:noProof/>
                 <w:webHidden/>
               </w:rPr>
-              <w:instrText xml:space="preserve"> PAGEREF _Toc227770859 \h </w:instrText>
+              <w:instrText xml:space="preserve"> PAGEREF _Toc227779297 \h </w:instrText>
             </w:r>
             <w:r>
               <w:rPr>
@@ -1466,7 +1468,7 @@
                 <w:noProof/>
                 <w:webHidden/>
               </w:rPr>
-              <w:t>4</w:t>
+              <w:t>5</w:t>
             </w:r>
             <w:r>
               <w:rPr>
@@ -1489,7 +1491,7 @@
               <w:lang w:eastAsia="es-ES"/>
             </w:rPr>
           </w:pPr>
-          <w:hyperlink w:anchor="_Toc227770860" w:history="1">
+          <w:hyperlink w:anchor="_Toc227779298" w:history="1">
             <w:r>
               <w:rPr>
                 <w:rStyle w:val="Hipervnculo"/>
@@ -1516,7 +1518,7 @@
                 <w:noProof/>
                 <w:webHidden/>
               </w:rPr>
-              <w:instrText xml:space="preserve"> PAGEREF _Toc227770860 \h </w:instrText>
+              <w:instrText xml:space="preserve"> PAGEREF _Toc227779298 \h </w:instrText>
             </w:r>
             <w:r>
               <w:rPr>
@@ -1536,7 +1538,7 @@
                 <w:noProof/>
                 <w:webHidden/>
               </w:rPr>
-              <w:t>4</w:t>
+              <w:t>5</w:t>
             </w:r>
             <w:r>
               <w:rPr>
@@ -1559,7 +1561,7 @@
               <w:lang w:eastAsia="es-ES"/>
             </w:rPr>
           </w:pPr>
-          <w:hyperlink w:anchor="_Toc227770861" w:history="1">
+          <w:hyperlink w:anchor="_Toc227779299" w:history="1">
             <w:r>
               <w:rPr>
                 <w:rStyle w:val="Hipervnculo"/>
@@ -1586,7 +1588,7 @@
                 <w:noProof/>
                 <w:webHidden/>
               </w:rPr>
-              <w:instrText xml:space="preserve"> PAGEREF _Toc227770861 \h </w:instrText>
+              <w:instrText xml:space="preserve"> PAGEREF _Toc227779299 \h </w:instrText>
             </w:r>
             <w:r>
               <w:rPr>
@@ -1606,7 +1608,7 @@
                 <w:noProof/>
                 <w:webHidden/>
               </w:rPr>
-              <w:t>5</w:t>
+              <w:t>6</w:t>
             </w:r>
             <w:r>
               <w:rPr>
@@ -1629,7 +1631,7 @@
               <w:lang w:eastAsia="es-ES"/>
             </w:rPr>
           </w:pPr>
-          <w:hyperlink w:anchor="_Toc227770862" w:history="1">
+          <w:hyperlink w:anchor="_Toc227779300" w:history="1">
             <w:r>
               <w:rPr>
                 <w:rStyle w:val="Hipervnculo"/>
@@ -1656,7 +1658,7 @@
                 <w:noProof/>
                 <w:webHidden/>
               </w:rPr>
-              <w:instrText xml:space="preserve"> PAGEREF _Toc227770862 \h </w:instrText>
+              <w:instrText xml:space="preserve"> PAGEREF _Toc227779300 \h </w:instrText>
             </w:r>
             <w:r>
               <w:rPr>
@@ -1676,7 +1678,7 @@
                 <w:noProof/>
                 <w:webHidden/>
               </w:rPr>
-              <w:t>5</w:t>
+              <w:t>6</w:t>
             </w:r>
             <w:r>
               <w:rPr>
@@ -1699,7 +1701,7 @@
               <w:lang w:eastAsia="es-ES"/>
             </w:rPr>
           </w:pPr>
-          <w:hyperlink w:anchor="_Toc227770863" w:history="1">
+          <w:hyperlink w:anchor="_Toc227779301" w:history="1">
             <w:r>
               <w:rPr>
                 <w:rStyle w:val="Hipervnculo"/>
@@ -1726,7 +1728,7 @@
                 <w:noProof/>
                 <w:webHidden/>
               </w:rPr>
-              <w:instrText xml:space="preserve"> PAGEREF _Toc227770863 \h </w:instrText>
+              <w:instrText xml:space="preserve"> PAGEREF _Toc227779301 \h </w:instrText>
             </w:r>
             <w:r>
               <w:rPr>
@@ -1746,7 +1748,7 @@
                 <w:noProof/>
                 <w:webHidden/>
               </w:rPr>
-              <w:t>6</w:t>
+              <w:t>7</w:t>
             </w:r>
             <w:r>
               <w:rPr>
@@ -1769,7 +1771,7 @@
               <w:lang w:eastAsia="es-ES"/>
             </w:rPr>
           </w:pPr>
-          <w:hyperlink w:anchor="_Toc227770864" w:history="1">
+          <w:hyperlink w:anchor="_Toc227779302" w:history="1">
             <w:r>
               <w:rPr>
                 <w:rStyle w:val="Hipervnculo"/>
@@ -1796,7 +1798,7 @@
                 <w:noProof/>
                 <w:webHidden/>
               </w:rPr>
-              <w:instrText xml:space="preserve"> PAGEREF _Toc227770864 \h </w:instrText>
+              <w:instrText xml:space="preserve"> PAGEREF _Toc227779302 \h </w:instrText>
             </w:r>
             <w:r>
               <w:rPr>
@@ -1816,7 +1818,7 @@
                 <w:noProof/>
                 <w:webHidden/>
               </w:rPr>
-              <w:t>6</w:t>
+              <w:t>7</w:t>
             </w:r>
             <w:r>
               <w:rPr>
@@ -1839,7 +1841,7 @@
               <w:lang w:eastAsia="es-ES"/>
             </w:rPr>
           </w:pPr>
-          <w:hyperlink w:anchor="_Toc227770865" w:history="1">
+          <w:hyperlink w:anchor="_Toc227779303" w:history="1">
             <w:r>
               <w:rPr>
                 <w:rStyle w:val="Hipervnculo"/>
@@ -1866,7 +1868,7 @@
                 <w:noProof/>
                 <w:webHidden/>
               </w:rPr>
-              <w:instrText xml:space="preserve"> PAGEREF _Toc227770865 \h </w:instrText>
+              <w:instrText xml:space="preserve"> PAGEREF _Toc227779303 \h </w:instrText>
             </w:r>
             <w:r>
               <w:rPr>
@@ -1886,7 +1888,7 @@
                 <w:noProof/>
                 <w:webHidden/>
               </w:rPr>
-              <w:t>7</w:t>
+              <w:t>8</w:t>
             </w:r>
             <w:r>
               <w:rPr>
@@ -1909,7 +1911,7 @@
               <w:lang w:eastAsia="es-ES"/>
             </w:rPr>
           </w:pPr>
-          <w:hyperlink w:anchor="_Toc227770866" w:history="1">
+          <w:hyperlink w:anchor="_Toc227779304" w:history="1">
             <w:r>
               <w:rPr>
                 <w:rStyle w:val="Hipervnculo"/>
@@ -1936,7 +1938,7 @@
                 <w:noProof/>
                 <w:webHidden/>
               </w:rPr>
-              <w:instrText xml:space="preserve"> PAGEREF _Toc227770866 \h </w:instrText>
+              <w:instrText xml:space="preserve"> PAGEREF _Toc227779304 \h </w:instrText>
             </w:r>
             <w:r>
               <w:rPr>
@@ -1956,7 +1958,7 @@
                 <w:noProof/>
                 <w:webHidden/>
               </w:rPr>
-              <w:t>7</w:t>
+              <w:t>8</w:t>
             </w:r>
             <w:r>
               <w:rPr>
@@ -1979,7 +1981,7 @@
               <w:lang w:eastAsia="es-ES"/>
             </w:rPr>
           </w:pPr>
-          <w:hyperlink w:anchor="_Toc227770867" w:history="1">
+          <w:hyperlink w:anchor="_Toc227779305" w:history="1">
             <w:r>
               <w:rPr>
                 <w:rStyle w:val="Hipervnculo"/>
@@ -2006,7 +2008,7 @@
                 <w:noProof/>
                 <w:webHidden/>
               </w:rPr>
-              <w:instrText xml:space="preserve"> PAGEREF _Toc227770867 \h </w:instrText>
+              <w:instrText xml:space="preserve"> PAGEREF _Toc227779305 \h </w:instrText>
             </w:r>
             <w:r>
               <w:rPr>
@@ -2026,7 +2028,7 @@
                 <w:noProof/>
                 <w:webHidden/>
               </w:rPr>
-              <w:t>7</w:t>
+              <w:t>8</w:t>
             </w:r>
             <w:r>
               <w:rPr>
@@ -2049,7 +2051,7 @@
               <w:lang w:eastAsia="es-ES"/>
             </w:rPr>
           </w:pPr>
-          <w:hyperlink w:anchor="_Toc227770868" w:history="1">
+          <w:hyperlink w:anchor="_Toc227779306" w:history="1">
             <w:r>
               <w:rPr>
                 <w:rStyle w:val="Hipervnculo"/>
@@ -2076,7 +2078,7 @@
                 <w:noProof/>
                 <w:webHidden/>
               </w:rPr>
-              <w:instrText xml:space="preserve"> PAGEREF _Toc227770868 \h </w:instrText>
+              <w:instrText xml:space="preserve"> PAGEREF _Toc227779306 \h </w:instrText>
             </w:r>
             <w:r>
               <w:rPr>
@@ -2096,7 +2098,7 @@
                 <w:noProof/>
                 <w:webHidden/>
               </w:rPr>
-              <w:t>8</w:t>
+              <w:t>9</w:t>
             </w:r>
             <w:r>
               <w:rPr>
@@ -2119,7 +2121,7 @@
               <w:lang w:eastAsia="es-ES"/>
             </w:rPr>
           </w:pPr>
-          <w:hyperlink w:anchor="_Toc227770869" w:history="1">
+          <w:hyperlink w:anchor="_Toc227779307" w:history="1">
             <w:r>
               <w:rPr>
                 <w:rStyle w:val="Hipervnculo"/>
@@ -2146,7 +2148,7 @@
                 <w:noProof/>
                 <w:webHidden/>
               </w:rPr>
-              <w:instrText xml:space="preserve"> PAGEREF _Toc227770869 \h </w:instrText>
+              <w:instrText xml:space="preserve"> PAGEREF _Toc227779307 \h </w:instrText>
             </w:r>
             <w:r>
               <w:rPr>
@@ -2166,7 +2168,1338 @@
                 <w:noProof/>
                 <w:webHidden/>
               </w:rPr>
-              <w:t>8</w:t>
+              <w:t>9</w:t>
+            </w:r>
+            <w:r>
+              <w:rPr>
+                <w:noProof/>
+                <w:webHidden/>
+              </w:rPr>
+              <w:fldChar w:fldCharType="end"/>
+            </w:r>
+          </w:hyperlink>
+        </w:p>
+        <w:p>
+          <w:pPr>
+            <w:pStyle w:val="TDC1"/>
+            <w:tabs>
+              <w:tab w:val="right" w:leader="dot" w:pos="8494"/>
+            </w:tabs>
+            <w:rPr>
+              <w:rFonts w:asciiTheme="minorHAnsi" w:eastAsiaTheme="minorEastAsia" w:hAnsiTheme="minorHAnsi"/>
+              <w:noProof/>
+              <w:lang w:eastAsia="es-ES"/>
+            </w:rPr>
+          </w:pPr>
+          <w:hyperlink w:anchor="_Toc227779308" w:history="1">
+            <w:r>
+              <w:rPr>
+                <w:rStyle w:val="Hipervnculo"/>
+                <w:noProof/>
+                <w:lang w:eastAsia="es-ES"/>
+              </w:rPr>
+              <w:t>10. Lógica base</w:t>
+            </w:r>
+            <w:r>
+              <w:rPr>
+                <w:noProof/>
+                <w:webHidden/>
+              </w:rPr>
+              <w:tab/>
+            </w:r>
+            <w:r>
+              <w:rPr>
+                <w:noProof/>
+                <w:webHidden/>
+              </w:rPr>
+              <w:fldChar w:fldCharType="begin"/>
+            </w:r>
+            <w:r>
+              <w:rPr>
+                <w:noProof/>
+                <w:webHidden/>
+              </w:rPr>
+              <w:instrText xml:space="preserve"> PAGEREF _Toc227779308 \h </w:instrText>
+            </w:r>
+            <w:r>
+              <w:rPr>
+                <w:noProof/>
+                <w:webHidden/>
+              </w:rPr>
+            </w:r>
+            <w:r>
+              <w:rPr>
+                <w:noProof/>
+                <w:webHidden/>
+              </w:rPr>
+              <w:fldChar w:fldCharType="separate"/>
+            </w:r>
+            <w:r>
+              <w:rPr>
+                <w:noProof/>
+                <w:webHidden/>
+              </w:rPr>
+              <w:t>10</w:t>
+            </w:r>
+            <w:r>
+              <w:rPr>
+                <w:noProof/>
+                <w:webHidden/>
+              </w:rPr>
+              <w:fldChar w:fldCharType="end"/>
+            </w:r>
+          </w:hyperlink>
+        </w:p>
+        <w:p>
+          <w:pPr>
+            <w:pStyle w:val="TDC2"/>
+            <w:tabs>
+              <w:tab w:val="right" w:leader="dot" w:pos="8494"/>
+            </w:tabs>
+            <w:rPr>
+              <w:rFonts w:asciiTheme="minorHAnsi" w:eastAsiaTheme="minorEastAsia" w:hAnsiTheme="minorHAnsi"/>
+              <w:noProof/>
+              <w:lang w:eastAsia="es-ES"/>
+            </w:rPr>
+          </w:pPr>
+          <w:hyperlink w:anchor="_Toc227779309" w:history="1">
+            <w:r>
+              <w:rPr>
+                <w:rStyle w:val="Hipervnculo"/>
+                <w:noProof/>
+              </w:rPr>
+              <w:t>10.1. Algoritmo de Organización y Normalización</w:t>
+            </w:r>
+            <w:r>
+              <w:rPr>
+                <w:noProof/>
+                <w:webHidden/>
+              </w:rPr>
+              <w:tab/>
+            </w:r>
+            <w:r>
+              <w:rPr>
+                <w:noProof/>
+                <w:webHidden/>
+              </w:rPr>
+              <w:fldChar w:fldCharType="begin"/>
+            </w:r>
+            <w:r>
+              <w:rPr>
+                <w:noProof/>
+                <w:webHidden/>
+              </w:rPr>
+              <w:instrText xml:space="preserve"> PAGEREF _Toc227779309 \h </w:instrText>
+            </w:r>
+            <w:r>
+              <w:rPr>
+                <w:noProof/>
+                <w:webHidden/>
+              </w:rPr>
+            </w:r>
+            <w:r>
+              <w:rPr>
+                <w:noProof/>
+                <w:webHidden/>
+              </w:rPr>
+              <w:fldChar w:fldCharType="separate"/>
+            </w:r>
+            <w:r>
+              <w:rPr>
+                <w:noProof/>
+                <w:webHidden/>
+              </w:rPr>
+              <w:t>10</w:t>
+            </w:r>
+            <w:r>
+              <w:rPr>
+                <w:noProof/>
+                <w:webHidden/>
+              </w:rPr>
+              <w:fldChar w:fldCharType="end"/>
+            </w:r>
+          </w:hyperlink>
+        </w:p>
+        <w:p>
+          <w:pPr>
+            <w:pStyle w:val="TDC2"/>
+            <w:tabs>
+              <w:tab w:val="right" w:leader="dot" w:pos="8494"/>
+            </w:tabs>
+            <w:rPr>
+              <w:rFonts w:asciiTheme="minorHAnsi" w:eastAsiaTheme="minorEastAsia" w:hAnsiTheme="minorHAnsi"/>
+              <w:noProof/>
+              <w:lang w:eastAsia="es-ES"/>
+            </w:rPr>
+          </w:pPr>
+          <w:hyperlink w:anchor="_Toc227779310" w:history="1">
+            <w:r>
+              <w:rPr>
+                <w:rStyle w:val="Hipervnculo"/>
+                <w:noProof/>
+              </w:rPr>
+              <w:t>10.2. Estructura de Directorios Dinámica</w:t>
+            </w:r>
+            <w:r>
+              <w:rPr>
+                <w:noProof/>
+                <w:webHidden/>
+              </w:rPr>
+              <w:tab/>
+            </w:r>
+            <w:r>
+              <w:rPr>
+                <w:noProof/>
+                <w:webHidden/>
+              </w:rPr>
+              <w:fldChar w:fldCharType="begin"/>
+            </w:r>
+            <w:r>
+              <w:rPr>
+                <w:noProof/>
+                <w:webHidden/>
+              </w:rPr>
+              <w:instrText xml:space="preserve"> PAGEREF _Toc227779310 \h </w:instrText>
+            </w:r>
+            <w:r>
+              <w:rPr>
+                <w:noProof/>
+                <w:webHidden/>
+              </w:rPr>
+            </w:r>
+            <w:r>
+              <w:rPr>
+                <w:noProof/>
+                <w:webHidden/>
+              </w:rPr>
+              <w:fldChar w:fldCharType="separate"/>
+            </w:r>
+            <w:r>
+              <w:rPr>
+                <w:noProof/>
+                <w:webHidden/>
+              </w:rPr>
+              <w:t>10</w:t>
+            </w:r>
+            <w:r>
+              <w:rPr>
+                <w:noProof/>
+                <w:webHidden/>
+              </w:rPr>
+              <w:fldChar w:fldCharType="end"/>
+            </w:r>
+          </w:hyperlink>
+        </w:p>
+        <w:p>
+          <w:pPr>
+            <w:pStyle w:val="TDC2"/>
+            <w:tabs>
+              <w:tab w:val="right" w:leader="dot" w:pos="8494"/>
+            </w:tabs>
+            <w:rPr>
+              <w:rFonts w:asciiTheme="minorHAnsi" w:eastAsiaTheme="minorEastAsia" w:hAnsiTheme="minorHAnsi"/>
+              <w:noProof/>
+              <w:lang w:eastAsia="es-ES"/>
+            </w:rPr>
+          </w:pPr>
+          <w:hyperlink w:anchor="_Toc227779311" w:history="1">
+            <w:r>
+              <w:rPr>
+                <w:rStyle w:val="Hipervnculo"/>
+                <w:noProof/>
+              </w:rPr>
+              <w:t>10.3. Gestión de la Integridad (CRUD de Archivos)</w:t>
+            </w:r>
+            <w:r>
+              <w:rPr>
+                <w:noProof/>
+                <w:webHidden/>
+              </w:rPr>
+              <w:tab/>
+            </w:r>
+            <w:r>
+              <w:rPr>
+                <w:noProof/>
+                <w:webHidden/>
+              </w:rPr>
+              <w:fldChar w:fldCharType="begin"/>
+            </w:r>
+            <w:r>
+              <w:rPr>
+                <w:noProof/>
+                <w:webHidden/>
+              </w:rPr>
+              <w:instrText xml:space="preserve"> PAGEREF _Toc227779311 \h </w:instrText>
+            </w:r>
+            <w:r>
+              <w:rPr>
+                <w:noProof/>
+                <w:webHidden/>
+              </w:rPr>
+            </w:r>
+            <w:r>
+              <w:rPr>
+                <w:noProof/>
+                <w:webHidden/>
+              </w:rPr>
+              <w:fldChar w:fldCharType="separate"/>
+            </w:r>
+            <w:r>
+              <w:rPr>
+                <w:noProof/>
+                <w:webHidden/>
+              </w:rPr>
+              <w:t>11</w:t>
+            </w:r>
+            <w:r>
+              <w:rPr>
+                <w:noProof/>
+                <w:webHidden/>
+              </w:rPr>
+              <w:fldChar w:fldCharType="end"/>
+            </w:r>
+          </w:hyperlink>
+        </w:p>
+        <w:p>
+          <w:pPr>
+            <w:pStyle w:val="TDC2"/>
+            <w:tabs>
+              <w:tab w:val="right" w:leader="dot" w:pos="8494"/>
+            </w:tabs>
+            <w:rPr>
+              <w:rFonts w:asciiTheme="minorHAnsi" w:eastAsiaTheme="minorEastAsia" w:hAnsiTheme="minorHAnsi"/>
+              <w:noProof/>
+              <w:lang w:eastAsia="es-ES"/>
+            </w:rPr>
+          </w:pPr>
+          <w:hyperlink w:anchor="_Toc227779312" w:history="1">
+            <w:r>
+              <w:rPr>
+                <w:rStyle w:val="Hipervnculo"/>
+                <w:noProof/>
+              </w:rPr>
+              <w:t>10.4. Explicación Técnica de Funcionamiento (Workflow)</w:t>
+            </w:r>
+            <w:r>
+              <w:rPr>
+                <w:noProof/>
+                <w:webHidden/>
+              </w:rPr>
+              <w:tab/>
+            </w:r>
+            <w:r>
+              <w:rPr>
+                <w:noProof/>
+                <w:webHidden/>
+              </w:rPr>
+              <w:fldChar w:fldCharType="begin"/>
+            </w:r>
+            <w:r>
+              <w:rPr>
+                <w:noProof/>
+                <w:webHidden/>
+              </w:rPr>
+              <w:instrText xml:space="preserve"> PAGEREF _Toc227779312 \h </w:instrText>
+            </w:r>
+            <w:r>
+              <w:rPr>
+                <w:noProof/>
+                <w:webHidden/>
+              </w:rPr>
+            </w:r>
+            <w:r>
+              <w:rPr>
+                <w:noProof/>
+                <w:webHidden/>
+              </w:rPr>
+              <w:fldChar w:fldCharType="separate"/>
+            </w:r>
+            <w:r>
+              <w:rPr>
+                <w:noProof/>
+                <w:webHidden/>
+              </w:rPr>
+              <w:t>11</w:t>
+            </w:r>
+            <w:r>
+              <w:rPr>
+                <w:noProof/>
+                <w:webHidden/>
+              </w:rPr>
+              <w:fldChar w:fldCharType="end"/>
+            </w:r>
+          </w:hyperlink>
+        </w:p>
+        <w:p>
+          <w:pPr>
+            <w:pStyle w:val="TDC2"/>
+            <w:tabs>
+              <w:tab w:val="right" w:leader="dot" w:pos="8494"/>
+            </w:tabs>
+            <w:rPr>
+              <w:rFonts w:asciiTheme="minorHAnsi" w:eastAsiaTheme="minorEastAsia" w:hAnsiTheme="minorHAnsi"/>
+              <w:noProof/>
+              <w:lang w:eastAsia="es-ES"/>
+            </w:rPr>
+          </w:pPr>
+          <w:hyperlink w:anchor="_Toc227779313" w:history="1">
+            <w:r>
+              <w:rPr>
+                <w:rStyle w:val="Hipervnculo"/>
+                <w:noProof/>
+              </w:rPr>
+              <w:t>10.5. Ejemplo del Flujo de Nombres</w:t>
+            </w:r>
+            <w:r>
+              <w:rPr>
+                <w:noProof/>
+                <w:webHidden/>
+              </w:rPr>
+              <w:tab/>
+            </w:r>
+            <w:r>
+              <w:rPr>
+                <w:noProof/>
+                <w:webHidden/>
+              </w:rPr>
+              <w:fldChar w:fldCharType="begin"/>
+            </w:r>
+            <w:r>
+              <w:rPr>
+                <w:noProof/>
+                <w:webHidden/>
+              </w:rPr>
+              <w:instrText xml:space="preserve"> PAGEREF _Toc227779313 \h </w:instrText>
+            </w:r>
+            <w:r>
+              <w:rPr>
+                <w:noProof/>
+                <w:webHidden/>
+              </w:rPr>
+            </w:r>
+            <w:r>
+              <w:rPr>
+                <w:noProof/>
+                <w:webHidden/>
+              </w:rPr>
+              <w:fldChar w:fldCharType="separate"/>
+            </w:r>
+            <w:r>
+              <w:rPr>
+                <w:noProof/>
+                <w:webHidden/>
+              </w:rPr>
+              <w:t>12</w:t>
+            </w:r>
+            <w:r>
+              <w:rPr>
+                <w:noProof/>
+                <w:webHidden/>
+              </w:rPr>
+              <w:fldChar w:fldCharType="end"/>
+            </w:r>
+          </w:hyperlink>
+        </w:p>
+        <w:p>
+          <w:pPr>
+            <w:pStyle w:val="TDC1"/>
+            <w:tabs>
+              <w:tab w:val="right" w:leader="dot" w:pos="8494"/>
+            </w:tabs>
+            <w:rPr>
+              <w:rFonts w:asciiTheme="minorHAnsi" w:eastAsiaTheme="minorEastAsia" w:hAnsiTheme="minorHAnsi"/>
+              <w:noProof/>
+              <w:lang w:eastAsia="es-ES"/>
+            </w:rPr>
+          </w:pPr>
+          <w:hyperlink w:anchor="_Toc227779314" w:history="1">
+            <w:r>
+              <w:rPr>
+                <w:rStyle w:val="Hipervnculo"/>
+                <w:noProof/>
+              </w:rPr>
+              <w:t>11. Motor de Ejecución y Gestión de Sesión</w:t>
+            </w:r>
+            <w:r>
+              <w:rPr>
+                <w:noProof/>
+                <w:webHidden/>
+              </w:rPr>
+              <w:tab/>
+            </w:r>
+            <w:r>
+              <w:rPr>
+                <w:noProof/>
+                <w:webHidden/>
+              </w:rPr>
+              <w:fldChar w:fldCharType="begin"/>
+            </w:r>
+            <w:r>
+              <w:rPr>
+                <w:noProof/>
+                <w:webHidden/>
+              </w:rPr>
+              <w:instrText xml:space="preserve"> PAGEREF _Toc227779314 \h </w:instrText>
+            </w:r>
+            <w:r>
+              <w:rPr>
+                <w:noProof/>
+                <w:webHidden/>
+              </w:rPr>
+            </w:r>
+            <w:r>
+              <w:rPr>
+                <w:noProof/>
+                <w:webHidden/>
+              </w:rPr>
+              <w:fldChar w:fldCharType="separate"/>
+            </w:r>
+            <w:r>
+              <w:rPr>
+                <w:noProof/>
+                <w:webHidden/>
+              </w:rPr>
+              <w:t>13</w:t>
+            </w:r>
+            <w:r>
+              <w:rPr>
+                <w:noProof/>
+                <w:webHidden/>
+              </w:rPr>
+              <w:fldChar w:fldCharType="end"/>
+            </w:r>
+          </w:hyperlink>
+        </w:p>
+        <w:p>
+          <w:pPr>
+            <w:pStyle w:val="TDC2"/>
+            <w:tabs>
+              <w:tab w:val="right" w:leader="dot" w:pos="8494"/>
+            </w:tabs>
+            <w:rPr>
+              <w:rFonts w:asciiTheme="minorHAnsi" w:eastAsiaTheme="minorEastAsia" w:hAnsiTheme="minorHAnsi"/>
+              <w:noProof/>
+              <w:lang w:eastAsia="es-ES"/>
+            </w:rPr>
+          </w:pPr>
+          <w:hyperlink w:anchor="_Toc227779315" w:history="1">
+            <w:r>
+              <w:rPr>
+                <w:rStyle w:val="Hipervnculo"/>
+                <w:noProof/>
+              </w:rPr>
+              <w:t>11.1. Gestión Dinámica de Colas Privadas</w:t>
+            </w:r>
+            <w:r>
+              <w:rPr>
+                <w:noProof/>
+                <w:webHidden/>
+              </w:rPr>
+              <w:tab/>
+            </w:r>
+            <w:r>
+              <w:rPr>
+                <w:noProof/>
+                <w:webHidden/>
+              </w:rPr>
+              <w:fldChar w:fldCharType="begin"/>
+            </w:r>
+            <w:r>
+              <w:rPr>
+                <w:noProof/>
+                <w:webHidden/>
+              </w:rPr>
+              <w:instrText xml:space="preserve"> PAGEREF _Toc227779315 \h </w:instrText>
+            </w:r>
+            <w:r>
+              <w:rPr>
+                <w:noProof/>
+                <w:webHidden/>
+              </w:rPr>
+            </w:r>
+            <w:r>
+              <w:rPr>
+                <w:noProof/>
+                <w:webHidden/>
+              </w:rPr>
+              <w:fldChar w:fldCharType="separate"/>
+            </w:r>
+            <w:r>
+              <w:rPr>
+                <w:noProof/>
+                <w:webHidden/>
+              </w:rPr>
+              <w:t>13</w:t>
+            </w:r>
+            <w:r>
+              <w:rPr>
+                <w:noProof/>
+                <w:webHidden/>
+              </w:rPr>
+              <w:fldChar w:fldCharType="end"/>
+            </w:r>
+          </w:hyperlink>
+        </w:p>
+        <w:p>
+          <w:pPr>
+            <w:pStyle w:val="TDC2"/>
+            <w:tabs>
+              <w:tab w:val="right" w:leader="dot" w:pos="8494"/>
+            </w:tabs>
+            <w:rPr>
+              <w:rFonts w:asciiTheme="minorHAnsi" w:eastAsiaTheme="minorEastAsia" w:hAnsiTheme="minorHAnsi"/>
+              <w:noProof/>
+              <w:lang w:eastAsia="es-ES"/>
+            </w:rPr>
+          </w:pPr>
+          <w:hyperlink w:anchor="_Toc227779316" w:history="1">
+            <w:r>
+              <w:rPr>
+                <w:rStyle w:val="Hipervnculo"/>
+                <w:noProof/>
+              </w:rPr>
+              <w:t>11.2. Arquitectura del Reproductor Dual</w:t>
+            </w:r>
+            <w:r>
+              <w:rPr>
+                <w:noProof/>
+                <w:webHidden/>
+              </w:rPr>
+              <w:tab/>
+            </w:r>
+            <w:r>
+              <w:rPr>
+                <w:noProof/>
+                <w:webHidden/>
+              </w:rPr>
+              <w:fldChar w:fldCharType="begin"/>
+            </w:r>
+            <w:r>
+              <w:rPr>
+                <w:noProof/>
+                <w:webHidden/>
+              </w:rPr>
+              <w:instrText xml:space="preserve"> PAGEREF _Toc227779316 \h </w:instrText>
+            </w:r>
+            <w:r>
+              <w:rPr>
+                <w:noProof/>
+                <w:webHidden/>
+              </w:rPr>
+            </w:r>
+            <w:r>
+              <w:rPr>
+                <w:noProof/>
+                <w:webHidden/>
+              </w:rPr>
+              <w:fldChar w:fldCharType="separate"/>
+            </w:r>
+            <w:r>
+              <w:rPr>
+                <w:noProof/>
+                <w:webHidden/>
+              </w:rPr>
+              <w:t>13</w:t>
+            </w:r>
+            <w:r>
+              <w:rPr>
+                <w:noProof/>
+                <w:webHidden/>
+              </w:rPr>
+              <w:fldChar w:fldCharType="end"/>
+            </w:r>
+          </w:hyperlink>
+        </w:p>
+        <w:p>
+          <w:pPr>
+            <w:pStyle w:val="TDC2"/>
+            <w:tabs>
+              <w:tab w:val="right" w:leader="dot" w:pos="8494"/>
+            </w:tabs>
+            <w:rPr>
+              <w:rFonts w:asciiTheme="minorHAnsi" w:eastAsiaTheme="minorEastAsia" w:hAnsiTheme="minorHAnsi"/>
+              <w:noProof/>
+              <w:lang w:eastAsia="es-ES"/>
+            </w:rPr>
+          </w:pPr>
+          <w:hyperlink w:anchor="_Toc227779317" w:history="1">
+            <w:r>
+              <w:rPr>
+                <w:rStyle w:val="Hipervnculo"/>
+                <w:noProof/>
+              </w:rPr>
+              <w:t>11.3. Motor de Sincronización Avanzada</w:t>
+            </w:r>
+            <w:r>
+              <w:rPr>
+                <w:noProof/>
+                <w:webHidden/>
+              </w:rPr>
+              <w:tab/>
+            </w:r>
+            <w:r>
+              <w:rPr>
+                <w:noProof/>
+                <w:webHidden/>
+              </w:rPr>
+              <w:fldChar w:fldCharType="begin"/>
+            </w:r>
+            <w:r>
+              <w:rPr>
+                <w:noProof/>
+                <w:webHidden/>
+              </w:rPr>
+              <w:instrText xml:space="preserve"> PAGEREF _Toc227779317 \h </w:instrText>
+            </w:r>
+            <w:r>
+              <w:rPr>
+                <w:noProof/>
+                <w:webHidden/>
+              </w:rPr>
+            </w:r>
+            <w:r>
+              <w:rPr>
+                <w:noProof/>
+                <w:webHidden/>
+              </w:rPr>
+              <w:fldChar w:fldCharType="separate"/>
+            </w:r>
+            <w:r>
+              <w:rPr>
+                <w:noProof/>
+                <w:webHidden/>
+              </w:rPr>
+              <w:t>13</w:t>
+            </w:r>
+            <w:r>
+              <w:rPr>
+                <w:noProof/>
+                <w:webHidden/>
+              </w:rPr>
+              <w:fldChar w:fldCharType="end"/>
+            </w:r>
+          </w:hyperlink>
+        </w:p>
+        <w:p>
+          <w:pPr>
+            <w:pStyle w:val="TDC2"/>
+            <w:tabs>
+              <w:tab w:val="right" w:leader="dot" w:pos="8494"/>
+            </w:tabs>
+            <w:rPr>
+              <w:rFonts w:asciiTheme="minorHAnsi" w:eastAsiaTheme="minorEastAsia" w:hAnsiTheme="minorHAnsi"/>
+              <w:noProof/>
+              <w:lang w:eastAsia="es-ES"/>
+            </w:rPr>
+          </w:pPr>
+          <w:hyperlink w:anchor="_Toc227779318" w:history="1">
+            <w:r>
+              <w:rPr>
+                <w:rStyle w:val="Hipervnculo"/>
+                <w:noProof/>
+              </w:rPr>
+              <w:t>11.4. Interfaz de Escenario</w:t>
+            </w:r>
+            <w:r>
+              <w:rPr>
+                <w:noProof/>
+                <w:webHidden/>
+              </w:rPr>
+              <w:tab/>
+            </w:r>
+            <w:r>
+              <w:rPr>
+                <w:noProof/>
+                <w:webHidden/>
+              </w:rPr>
+              <w:fldChar w:fldCharType="begin"/>
+            </w:r>
+            <w:r>
+              <w:rPr>
+                <w:noProof/>
+                <w:webHidden/>
+              </w:rPr>
+              <w:instrText xml:space="preserve"> PAGEREF _Toc227779318 \h </w:instrText>
+            </w:r>
+            <w:r>
+              <w:rPr>
+                <w:noProof/>
+                <w:webHidden/>
+              </w:rPr>
+            </w:r>
+            <w:r>
+              <w:rPr>
+                <w:noProof/>
+                <w:webHidden/>
+              </w:rPr>
+              <w:fldChar w:fldCharType="separate"/>
+            </w:r>
+            <w:r>
+              <w:rPr>
+                <w:noProof/>
+                <w:webHidden/>
+              </w:rPr>
+              <w:t>14</w:t>
+            </w:r>
+            <w:r>
+              <w:rPr>
+                <w:noProof/>
+                <w:webHidden/>
+              </w:rPr>
+              <w:fldChar w:fldCharType="end"/>
+            </w:r>
+          </w:hyperlink>
+        </w:p>
+        <w:p>
+          <w:pPr>
+            <w:pStyle w:val="TDC1"/>
+            <w:tabs>
+              <w:tab w:val="right" w:leader="dot" w:pos="8494"/>
+            </w:tabs>
+            <w:rPr>
+              <w:rFonts w:asciiTheme="minorHAnsi" w:eastAsiaTheme="minorEastAsia" w:hAnsiTheme="minorHAnsi"/>
+              <w:noProof/>
+              <w:lang w:eastAsia="es-ES"/>
+            </w:rPr>
+          </w:pPr>
+          <w:hyperlink w:anchor="_Toc227779319" w:history="1">
+            <w:r>
+              <w:rPr>
+                <w:rStyle w:val="Hipervnculo"/>
+                <w:noProof/>
+              </w:rPr>
+              <w:t>12. Navegación y Flujo de Trabajo (User Flow)</w:t>
+            </w:r>
+            <w:r>
+              <w:rPr>
+                <w:noProof/>
+                <w:webHidden/>
+              </w:rPr>
+              <w:tab/>
+            </w:r>
+            <w:r>
+              <w:rPr>
+                <w:noProof/>
+                <w:webHidden/>
+              </w:rPr>
+              <w:fldChar w:fldCharType="begin"/>
+            </w:r>
+            <w:r>
+              <w:rPr>
+                <w:noProof/>
+                <w:webHidden/>
+              </w:rPr>
+              <w:instrText xml:space="preserve"> PAGEREF _Toc227779319 \h </w:instrText>
+            </w:r>
+            <w:r>
+              <w:rPr>
+                <w:noProof/>
+                <w:webHidden/>
+              </w:rPr>
+            </w:r>
+            <w:r>
+              <w:rPr>
+                <w:noProof/>
+                <w:webHidden/>
+              </w:rPr>
+              <w:fldChar w:fldCharType="separate"/>
+            </w:r>
+            <w:r>
+              <w:rPr>
+                <w:noProof/>
+                <w:webHidden/>
+              </w:rPr>
+              <w:t>14</w:t>
+            </w:r>
+            <w:r>
+              <w:rPr>
+                <w:noProof/>
+                <w:webHidden/>
+              </w:rPr>
+              <w:fldChar w:fldCharType="end"/>
+            </w:r>
+          </w:hyperlink>
+        </w:p>
+        <w:p>
+          <w:pPr>
+            <w:pStyle w:val="TDC2"/>
+            <w:tabs>
+              <w:tab w:val="right" w:leader="dot" w:pos="8494"/>
+            </w:tabs>
+            <w:rPr>
+              <w:rFonts w:asciiTheme="minorHAnsi" w:eastAsiaTheme="minorEastAsia" w:hAnsiTheme="minorHAnsi"/>
+              <w:noProof/>
+              <w:lang w:eastAsia="es-ES"/>
+            </w:rPr>
+          </w:pPr>
+          <w:hyperlink w:anchor="_Toc227779320" w:history="1">
+            <w:r>
+              <w:rPr>
+                <w:rStyle w:val="Hipervnculo"/>
+                <w:noProof/>
+              </w:rPr>
+              <w:t>12.1. Mapa del Sitio (Sitemap)</w:t>
+            </w:r>
+            <w:r>
+              <w:rPr>
+                <w:noProof/>
+                <w:webHidden/>
+              </w:rPr>
+              <w:tab/>
+            </w:r>
+            <w:r>
+              <w:rPr>
+                <w:noProof/>
+                <w:webHidden/>
+              </w:rPr>
+              <w:fldChar w:fldCharType="begin"/>
+            </w:r>
+            <w:r>
+              <w:rPr>
+                <w:noProof/>
+                <w:webHidden/>
+              </w:rPr>
+              <w:instrText xml:space="preserve"> PAGEREF _Toc227779320 \h </w:instrText>
+            </w:r>
+            <w:r>
+              <w:rPr>
+                <w:noProof/>
+                <w:webHidden/>
+              </w:rPr>
+            </w:r>
+            <w:r>
+              <w:rPr>
+                <w:noProof/>
+                <w:webHidden/>
+              </w:rPr>
+              <w:fldChar w:fldCharType="separate"/>
+            </w:r>
+            <w:r>
+              <w:rPr>
+                <w:noProof/>
+                <w:webHidden/>
+              </w:rPr>
+              <w:t>14</w:t>
+            </w:r>
+            <w:r>
+              <w:rPr>
+                <w:noProof/>
+                <w:webHidden/>
+              </w:rPr>
+              <w:fldChar w:fldCharType="end"/>
+            </w:r>
+          </w:hyperlink>
+        </w:p>
+        <w:p>
+          <w:pPr>
+            <w:pStyle w:val="TDC2"/>
+            <w:tabs>
+              <w:tab w:val="right" w:leader="dot" w:pos="8494"/>
+            </w:tabs>
+            <w:rPr>
+              <w:rFonts w:asciiTheme="minorHAnsi" w:eastAsiaTheme="minorEastAsia" w:hAnsiTheme="minorHAnsi"/>
+              <w:noProof/>
+              <w:lang w:eastAsia="es-ES"/>
+            </w:rPr>
+          </w:pPr>
+          <w:hyperlink w:anchor="_Toc227779321" w:history="1">
+            <w:r>
+              <w:rPr>
+                <w:rStyle w:val="Hipervnculo"/>
+                <w:noProof/>
+              </w:rPr>
+              <w:t>12.2. Descripción de los Flujos Principales</w:t>
+            </w:r>
+            <w:r>
+              <w:rPr>
+                <w:noProof/>
+                <w:webHidden/>
+              </w:rPr>
+              <w:tab/>
+            </w:r>
+            <w:r>
+              <w:rPr>
+                <w:noProof/>
+                <w:webHidden/>
+              </w:rPr>
+              <w:fldChar w:fldCharType="begin"/>
+            </w:r>
+            <w:r>
+              <w:rPr>
+                <w:noProof/>
+                <w:webHidden/>
+              </w:rPr>
+              <w:instrText xml:space="preserve"> PAGEREF _Toc227779321 \h </w:instrText>
+            </w:r>
+            <w:r>
+              <w:rPr>
+                <w:noProof/>
+                <w:webHidden/>
+              </w:rPr>
+            </w:r>
+            <w:r>
+              <w:rPr>
+                <w:noProof/>
+                <w:webHidden/>
+              </w:rPr>
+              <w:fldChar w:fldCharType="separate"/>
+            </w:r>
+            <w:r>
+              <w:rPr>
+                <w:noProof/>
+                <w:webHidden/>
+              </w:rPr>
+              <w:t>14</w:t>
+            </w:r>
+            <w:r>
+              <w:rPr>
+                <w:noProof/>
+                <w:webHidden/>
+              </w:rPr>
+              <w:fldChar w:fldCharType="end"/>
+            </w:r>
+          </w:hyperlink>
+        </w:p>
+        <w:p>
+          <w:pPr>
+            <w:pStyle w:val="TDC2"/>
+            <w:tabs>
+              <w:tab w:val="right" w:leader="dot" w:pos="8494"/>
+            </w:tabs>
+            <w:rPr>
+              <w:rFonts w:asciiTheme="minorHAnsi" w:eastAsiaTheme="minorEastAsia" w:hAnsiTheme="minorHAnsi"/>
+              <w:noProof/>
+              <w:lang w:eastAsia="es-ES"/>
+            </w:rPr>
+          </w:pPr>
+          <w:hyperlink w:anchor="_Toc227779322" w:history="1">
+            <w:r>
+              <w:rPr>
+                <w:rStyle w:val="Hipervnculo"/>
+                <w:noProof/>
+              </w:rPr>
+              <w:t>12.3. Diseño de la Interfaz</w:t>
+            </w:r>
+            <w:r>
+              <w:rPr>
+                <w:noProof/>
+                <w:webHidden/>
+              </w:rPr>
+              <w:tab/>
+            </w:r>
+            <w:r>
+              <w:rPr>
+                <w:noProof/>
+                <w:webHidden/>
+              </w:rPr>
+              <w:fldChar w:fldCharType="begin"/>
+            </w:r>
+            <w:r>
+              <w:rPr>
+                <w:noProof/>
+                <w:webHidden/>
+              </w:rPr>
+              <w:instrText xml:space="preserve"> PAGEREF _Toc227779322 \h </w:instrText>
+            </w:r>
+            <w:r>
+              <w:rPr>
+                <w:noProof/>
+                <w:webHidden/>
+              </w:rPr>
+            </w:r>
+            <w:r>
+              <w:rPr>
+                <w:noProof/>
+                <w:webHidden/>
+              </w:rPr>
+              <w:fldChar w:fldCharType="separate"/>
+            </w:r>
+            <w:r>
+              <w:rPr>
+                <w:noProof/>
+                <w:webHidden/>
+              </w:rPr>
+              <w:t>15</w:t>
+            </w:r>
+            <w:r>
+              <w:rPr>
+                <w:noProof/>
+                <w:webHidden/>
+              </w:rPr>
+              <w:fldChar w:fldCharType="end"/>
+            </w:r>
+          </w:hyperlink>
+        </w:p>
+        <w:p>
+          <w:pPr>
+            <w:pStyle w:val="TDC1"/>
+            <w:tabs>
+              <w:tab w:val="right" w:leader="dot" w:pos="8494"/>
+            </w:tabs>
+            <w:rPr>
+              <w:rFonts w:asciiTheme="minorHAnsi" w:eastAsiaTheme="minorEastAsia" w:hAnsiTheme="minorHAnsi"/>
+              <w:noProof/>
+              <w:lang w:eastAsia="es-ES"/>
+            </w:rPr>
+          </w:pPr>
+          <w:hyperlink w:anchor="_Toc227779323" w:history="1">
+            <w:r>
+              <w:rPr>
+                <w:rStyle w:val="Hipervnculo"/>
+                <w:noProof/>
+              </w:rPr>
+              <w:t>13. Conectividad e Infraestructura de Comunicación</w:t>
+            </w:r>
+            <w:r>
+              <w:rPr>
+                <w:noProof/>
+                <w:webHidden/>
+              </w:rPr>
+              <w:tab/>
+            </w:r>
+            <w:r>
+              <w:rPr>
+                <w:noProof/>
+                <w:webHidden/>
+              </w:rPr>
+              <w:fldChar w:fldCharType="begin"/>
+            </w:r>
+            <w:r>
+              <w:rPr>
+                <w:noProof/>
+                <w:webHidden/>
+              </w:rPr>
+              <w:instrText xml:space="preserve"> PAGEREF _Toc227779323 \h </w:instrText>
+            </w:r>
+            <w:r>
+              <w:rPr>
+                <w:noProof/>
+                <w:webHidden/>
+              </w:rPr>
+            </w:r>
+            <w:r>
+              <w:rPr>
+                <w:noProof/>
+                <w:webHidden/>
+              </w:rPr>
+              <w:fldChar w:fldCharType="separate"/>
+            </w:r>
+            <w:r>
+              <w:rPr>
+                <w:noProof/>
+                <w:webHidden/>
+              </w:rPr>
+              <w:t>18</w:t>
+            </w:r>
+            <w:r>
+              <w:rPr>
+                <w:noProof/>
+                <w:webHidden/>
+              </w:rPr>
+              <w:fldChar w:fldCharType="end"/>
+            </w:r>
+          </w:hyperlink>
+        </w:p>
+        <w:p>
+          <w:pPr>
+            <w:pStyle w:val="TDC2"/>
+            <w:tabs>
+              <w:tab w:val="right" w:leader="dot" w:pos="8494"/>
+            </w:tabs>
+            <w:rPr>
+              <w:rFonts w:asciiTheme="minorHAnsi" w:eastAsiaTheme="minorEastAsia" w:hAnsiTheme="minorHAnsi"/>
+              <w:noProof/>
+              <w:lang w:eastAsia="es-ES"/>
+            </w:rPr>
+          </w:pPr>
+          <w:hyperlink w:anchor="_Toc227779324" w:history="1">
+            <w:r>
+              <w:rPr>
+                <w:rStyle w:val="Hipervnculo"/>
+                <w:noProof/>
+              </w:rPr>
+              <w:t>13.1. Comunicación Cliente-Servidor (HTTP/API)</w:t>
+            </w:r>
+            <w:r>
+              <w:rPr>
+                <w:noProof/>
+                <w:webHidden/>
+              </w:rPr>
+              <w:tab/>
+            </w:r>
+            <w:r>
+              <w:rPr>
+                <w:noProof/>
+                <w:webHidden/>
+              </w:rPr>
+              <w:fldChar w:fldCharType="begin"/>
+            </w:r>
+            <w:r>
+              <w:rPr>
+                <w:noProof/>
+                <w:webHidden/>
+              </w:rPr>
+              <w:instrText xml:space="preserve"> PAGEREF _Toc227779324 \h </w:instrText>
+            </w:r>
+            <w:r>
+              <w:rPr>
+                <w:noProof/>
+                <w:webHidden/>
+              </w:rPr>
+            </w:r>
+            <w:r>
+              <w:rPr>
+                <w:noProof/>
+                <w:webHidden/>
+              </w:rPr>
+              <w:fldChar w:fldCharType="separate"/>
+            </w:r>
+            <w:r>
+              <w:rPr>
+                <w:noProof/>
+                <w:webHidden/>
+              </w:rPr>
+              <w:t>18</w:t>
+            </w:r>
+            <w:r>
+              <w:rPr>
+                <w:noProof/>
+                <w:webHidden/>
+              </w:rPr>
+              <w:fldChar w:fldCharType="end"/>
+            </w:r>
+          </w:hyperlink>
+        </w:p>
+        <w:p>
+          <w:pPr>
+            <w:pStyle w:val="TDC2"/>
+            <w:tabs>
+              <w:tab w:val="right" w:leader="dot" w:pos="8494"/>
+            </w:tabs>
+            <w:rPr>
+              <w:rFonts w:asciiTheme="minorHAnsi" w:eastAsiaTheme="minorEastAsia" w:hAnsiTheme="minorHAnsi"/>
+              <w:noProof/>
+              <w:lang w:eastAsia="es-ES"/>
+            </w:rPr>
+          </w:pPr>
+          <w:hyperlink w:anchor="_Toc227779325" w:history="1">
+            <w:r>
+              <w:rPr>
+                <w:rStyle w:val="Hipervnculo"/>
+                <w:noProof/>
+              </w:rPr>
+              <w:t>13.2. Gestión de Recursos Multimedia</w:t>
+            </w:r>
+            <w:r>
+              <w:rPr>
+                <w:noProof/>
+                <w:webHidden/>
+              </w:rPr>
+              <w:tab/>
+            </w:r>
+            <w:r>
+              <w:rPr>
+                <w:noProof/>
+                <w:webHidden/>
+              </w:rPr>
+              <w:fldChar w:fldCharType="begin"/>
+            </w:r>
+            <w:r>
+              <w:rPr>
+                <w:noProof/>
+                <w:webHidden/>
+              </w:rPr>
+              <w:instrText xml:space="preserve"> PAGEREF _Toc227779325 \h </w:instrText>
+            </w:r>
+            <w:r>
+              <w:rPr>
+                <w:noProof/>
+                <w:webHidden/>
+              </w:rPr>
+            </w:r>
+            <w:r>
+              <w:rPr>
+                <w:noProof/>
+                <w:webHidden/>
+              </w:rPr>
+              <w:fldChar w:fldCharType="separate"/>
+            </w:r>
+            <w:r>
+              <w:rPr>
+                <w:noProof/>
+                <w:webHidden/>
+              </w:rPr>
+              <w:t>18</w:t>
+            </w:r>
+            <w:r>
+              <w:rPr>
+                <w:noProof/>
+                <w:webHidden/>
+              </w:rPr>
+              <w:fldChar w:fldCharType="end"/>
+            </w:r>
+          </w:hyperlink>
+        </w:p>
+        <w:p>
+          <w:pPr>
+            <w:pStyle w:val="TDC2"/>
+            <w:tabs>
+              <w:tab w:val="right" w:leader="dot" w:pos="8494"/>
+            </w:tabs>
+            <w:rPr>
+              <w:rFonts w:asciiTheme="minorHAnsi" w:eastAsiaTheme="minorEastAsia" w:hAnsiTheme="minorHAnsi"/>
+              <w:noProof/>
+              <w:lang w:eastAsia="es-ES"/>
+            </w:rPr>
+          </w:pPr>
+          <w:hyperlink w:anchor="_Toc227779326" w:history="1">
+            <w:r>
+              <w:rPr>
+                <w:rStyle w:val="Hipervnculo"/>
+                <w:noProof/>
+              </w:rPr>
+              <w:t>13.3. Conectividad entre Contextos</w:t>
+            </w:r>
+            <w:r>
+              <w:rPr>
+                <w:noProof/>
+                <w:webHidden/>
+              </w:rPr>
+              <w:tab/>
+            </w:r>
+            <w:r>
+              <w:rPr>
+                <w:noProof/>
+                <w:webHidden/>
+              </w:rPr>
+              <w:fldChar w:fldCharType="begin"/>
+            </w:r>
+            <w:r>
+              <w:rPr>
+                <w:noProof/>
+                <w:webHidden/>
+              </w:rPr>
+              <w:instrText xml:space="preserve"> PAGEREF _Toc227779326 \h </w:instrText>
+            </w:r>
+            <w:r>
+              <w:rPr>
+                <w:noProof/>
+                <w:webHidden/>
+              </w:rPr>
+            </w:r>
+            <w:r>
+              <w:rPr>
+                <w:noProof/>
+                <w:webHidden/>
+              </w:rPr>
+              <w:fldChar w:fldCharType="separate"/>
+            </w:r>
+            <w:r>
+              <w:rPr>
+                <w:noProof/>
+                <w:webHidden/>
+              </w:rPr>
+              <w:t>18</w:t>
             </w:r>
             <w:r>
               <w:rPr>
@@ -2183,6 +3516,7 @@
               <w:b/>
               <w:bCs/>
             </w:rPr>
+            <w:lastRenderedPageBreak/>
             <w:fldChar w:fldCharType="end"/>
           </w:r>
         </w:p>
@@ -2197,7 +3531,7 @@
       <w:pPr>
         <w:pStyle w:val="Ttulo1"/>
       </w:pPr>
-      <w:bookmarkStart w:id="0" w:name="_Toc227770856"/>
+      <w:bookmarkStart w:id="0" w:name="_Toc227779294"/>
       <w:r>
         <w:lastRenderedPageBreak/>
         <w:t>1. Introducción</w:t>
@@ -2336,7 +3670,7 @@
       <w:pPr>
         <w:pStyle w:val="Ttulo1"/>
       </w:pPr>
-      <w:bookmarkStart w:id="1" w:name="_Toc227770857"/>
+      <w:bookmarkStart w:id="1" w:name="_Toc227779295"/>
       <w:r>
         <w:t>2. Descripción del proyecto</w:t>
       </w:r>
@@ -2373,7 +3707,7 @@
       <w:pPr>
         <w:pStyle w:val="Ttulo2"/>
       </w:pPr>
-      <w:bookmarkStart w:id="2" w:name="_Toc227770858"/>
+      <w:bookmarkStart w:id="2" w:name="_Toc227779296"/>
       <w:r>
         <w:t>2.1 Usuarios del sistema</w:t>
       </w:r>
@@ -2460,7 +3794,7 @@
       <w:pPr>
         <w:pStyle w:val="Ttulo2"/>
       </w:pPr>
-      <w:bookmarkStart w:id="3" w:name="_Toc227770859"/>
+      <w:bookmarkStart w:id="3" w:name="_Toc227779297"/>
       <w:r>
         <w:t>2.2 Funcionalidades para usuarios</w:t>
       </w:r>
@@ -2528,7 +3862,7 @@
       <w:pPr>
         <w:pStyle w:val="Ttulo2"/>
       </w:pPr>
-      <w:bookmarkStart w:id="4" w:name="_Toc227770860"/>
+      <w:bookmarkStart w:id="4" w:name="_Toc227779298"/>
       <w:r>
         <w:t>2.3 Funcionalidades para administradores</w:t>
       </w:r>
@@ -2585,7 +3919,7 @@
       <w:pPr>
         <w:pStyle w:val="Ttulo1"/>
       </w:pPr>
-      <w:bookmarkStart w:id="5" w:name="_Toc227770861"/>
+      <w:bookmarkStart w:id="5" w:name="_Toc227779299"/>
       <w:r>
         <w:t>3. Objetivos del proyecto</w:t>
       </w:r>
@@ -2657,7 +3991,7 @@
       <w:pPr>
         <w:pStyle w:val="Ttulo1"/>
       </w:pPr>
-      <w:bookmarkStart w:id="6" w:name="_Toc227770862"/>
+      <w:bookmarkStart w:id="6" w:name="_Toc227779300"/>
       <w:r>
         <w:t>4. Tecnologías utilizadas</w:t>
       </w:r>
@@ -2668,11 +4002,9 @@
       <w:r>
         <w:t xml:space="preserve">Para el desarrollo de la aplicación web se han seleccionado tecnologías y herramientas que permiten un desarrollo ágil, flexible y compatible con la mayoría de dispositivos. A </w:t>
       </w:r>
-      <w:proofErr w:type="gramStart"/>
-      <w:r>
-        <w:t>continuación</w:t>
-      </w:r>
-      <w:proofErr w:type="gramEnd"/>
+      <w:r>
+        <w:t>continuación,</w:t>
+      </w:r>
       <w:r>
         <w:t xml:space="preserve"> se detallan las principales tecnologías empleadas.</w:t>
       </w:r>
@@ -2847,7 +4179,7 @@
       <w:pPr>
         <w:pStyle w:val="Ttulo1"/>
       </w:pPr>
-      <w:bookmarkStart w:id="7" w:name="_Toc227770863"/>
+      <w:bookmarkStart w:id="7" w:name="_Toc227779301"/>
       <w:r>
         <w:t>5. Organización del equipo</w:t>
       </w:r>
@@ -2878,7 +4210,7 @@
       <w:pPr>
         <w:pStyle w:val="Ttulo1"/>
       </w:pPr>
-      <w:bookmarkStart w:id="8" w:name="_Toc227770864"/>
+      <w:bookmarkStart w:id="8" w:name="_Toc227779302"/>
       <w:r>
         <w:t>6. Planificación inicial</w:t>
       </w:r>
@@ -2989,7 +4321,7 @@
       <w:pPr>
         <w:pStyle w:val="Ttulo1"/>
       </w:pPr>
-      <w:bookmarkStart w:id="9" w:name="_Toc227770865"/>
+      <w:bookmarkStart w:id="9" w:name="_Toc227779303"/>
       <w:r>
         <w:t>7. Arquitectura del sistema</w:t>
       </w:r>
@@ -3034,7 +4366,7 @@
       <w:pPr>
         <w:pStyle w:val="Ttulo1"/>
       </w:pPr>
-      <w:bookmarkStart w:id="10" w:name="_Toc227770866"/>
+      <w:bookmarkStart w:id="10" w:name="_Toc227779304"/>
       <w:r>
         <w:t>8. Estado actual y viabilidad</w:t>
       </w:r>
@@ -3078,15 +4410,12 @@
       <w:pPr>
         <w:pStyle w:val="Ttulo1"/>
       </w:pPr>
-      <w:bookmarkStart w:id="11" w:name="_Toc227770867"/>
+      <w:bookmarkStart w:id="11" w:name="_Toc227779305"/>
       <w:r>
         <w:t>9</w:t>
       </w:r>
       <w:r>
-        <w:t xml:space="preserve">. </w:t>
-      </w:r>
-      <w:r>
-        <w:t>Modelo de base de datos</w:t>
+        <w:t>. Modelo de base de datos</w:t>
       </w:r>
       <w:bookmarkEnd w:id="11"/>
       <w:r>
@@ -3106,10 +4435,7 @@
         <w:t>MariaDB</w:t>
       </w:r>
       <w:r>
-        <w:t xml:space="preserve"> </w:t>
-      </w:r>
-      <w:r>
-        <w:t xml:space="preserve">gestionado mediante la interfaz </w:t>
+        <w:t xml:space="preserve"> gestionado mediante la interfaz </w:t>
       </w:r>
       <w:r>
         <w:rPr>
@@ -3134,23 +4460,7 @@
         <w:t>karaoke</w:t>
       </w:r>
       <w:r>
-        <w:t>, se compone de cuatro tablas interconectadas mediante claves foráneas (</w:t>
-      </w:r>
-      <w:proofErr w:type="spellStart"/>
-      <w:r>
-        <w:t>Foreign</w:t>
-      </w:r>
-      <w:proofErr w:type="spellEnd"/>
-      <w:r>
-        <w:t xml:space="preserve"> </w:t>
-      </w:r>
-      <w:proofErr w:type="spellStart"/>
-      <w:r>
-        <w:t>Keys</w:t>
-      </w:r>
-      <w:proofErr w:type="spellEnd"/>
-      <w:r>
-        <w:t>):</w:t>
+        <w:t>, se compone de cuatro tablas interconectadas mediante claves foráneas (Foreign Keys):</w:t>
       </w:r>
     </w:p>
     <w:p>
@@ -3160,181 +4470,136 @@
           <w:bCs/>
         </w:rPr>
         <w:lastRenderedPageBreak/>
-        <w:t>usuarios</w:t>
-      </w:r>
+        <w:t>usuarios:</w:t>
+      </w:r>
+      <w:r>
+        <w:t xml:space="preserve"> Gestiona el acceso al sistema. Almacena el nombre, email, contraseña y el </w:t>
+      </w:r>
+      <w:r>
+        <w:t>rol</w:t>
+      </w:r>
+      <w:r>
+        <w:t xml:space="preserve"> (Usuario o Administrador). Incluye un campo </w:t>
+      </w:r>
+      <w:r>
+        <w:t>estado</w:t>
+      </w:r>
+      <w:r>
+        <w:t xml:space="preserve"> para el control de bloqueos de cuenta.</w:t>
+      </w:r>
+    </w:p>
+    <w:p>
       <w:r>
         <w:rPr>
           <w:b/>
           <w:bCs/>
         </w:rPr>
-        <w:t>:</w:t>
-      </w:r>
-      <w:r>
-        <w:t xml:space="preserve"> Gestiona el acceso al sistema. Almacena el nombre, email, contraseña y el </w:t>
-      </w:r>
-      <w:r>
-        <w:t>rol</w:t>
-      </w:r>
-      <w:r>
-        <w:t xml:space="preserve"> (Usuario o Administrador). Incluye un campo </w:t>
-      </w:r>
-      <w:r>
-        <w:t>estado</w:t>
-      </w:r>
-      <w:r>
-        <w:t xml:space="preserve"> para el control de bloqueos de cuenta.</w:t>
-      </w:r>
-    </w:p>
-    <w:p>
+        <w:t>canciones:</w:t>
+      </w:r>
+      <w:r>
+        <w:t xml:space="preserve"> Es el núcleo del catálogo. No solo guarda metadatos (título, artista, estilo), sino que gestiona las rutas de sistema de archivos para los tres componentes esenciales del karaoke: el audio con </w:t>
+      </w:r>
       <w:r>
         <w:rPr>
           <w:b/>
           <w:bCs/>
         </w:rPr>
-        <w:t>canciones</w:t>
+        <w:t>voz</w:t>
+      </w:r>
+      <w:r>
+        <w:t xml:space="preserve">, la pista </w:t>
       </w:r>
       <w:r>
         <w:rPr>
           <w:b/>
           <w:bCs/>
         </w:rPr>
-        <w:t>:</w:t>
-      </w:r>
-      <w:r>
-        <w:t xml:space="preserve"> Es el núcleo del catálogo. No solo guarda metadatos (título, artista, estilo), sino que gestiona las rutas de sistema de archivos para los tres componentes esenciales del karaoke: el audio con </w:t>
+        <w:t>instrumental</w:t>
+      </w:r>
+      <w:r>
+        <w:t xml:space="preserve"> y el archivo de </w:t>
       </w:r>
       <w:r>
         <w:rPr>
           <w:b/>
           <w:bCs/>
         </w:rPr>
-        <w:t>voz</w:t>
-      </w:r>
-      <w:r>
-        <w:t xml:space="preserve">, la pista </w:t>
-      </w:r>
+        <w:t>letra</w:t>
+      </w:r>
+      <w:r>
+        <w:t xml:space="preserve"> (formato .lrc).</w:t>
+      </w:r>
+    </w:p>
+    <w:p>
       <w:r>
         <w:rPr>
           <w:b/>
           <w:bCs/>
         </w:rPr>
-        <w:t>instrumental</w:t>
-      </w:r>
-      <w:r>
-        <w:t xml:space="preserve"> y el archivo de </w:t>
-      </w:r>
+        <w:t>cola:</w:t>
+      </w:r>
+      <w:r>
+        <w:t xml:space="preserve"> Actúa como la tabla dinámica de la sesión. Relaciona qué usuario ha pedido qué canción, permitiendo gestionar el orden de actuación.</w:t>
+      </w:r>
+    </w:p>
+    <w:p>
       <w:r>
         <w:rPr>
           <w:b/>
           <w:bCs/>
         </w:rPr>
-        <w:t>letra</w:t>
-      </w:r>
-      <w:r>
-        <w:t xml:space="preserve"> (formato .</w:t>
-      </w:r>
-      <w:proofErr w:type="spellStart"/>
-      <w:r>
-        <w:t>lrc</w:t>
-      </w:r>
-      <w:proofErr w:type="spellEnd"/>
-      <w:r>
-        <w:t>).</w:t>
-      </w:r>
-    </w:p>
-    <w:p>
-      <w:r>
-        <w:rPr>
-          <w:b/>
-          <w:bCs/>
-        </w:rPr>
+        <w:t>peticiones:</w:t>
+      </w:r>
+      <w:r>
+        <w:t xml:space="preserve"> Permite a los usuarios solicitar canciones que aún no están en el catálogo, incluyendo un control de </w:t>
+      </w:r>
+      <w:r>
+        <w:t>estado</w:t>
+      </w:r>
+      <w:r>
+        <w:t xml:space="preserve"> (pendiente o realizado) y marca de tiempo.</w:t>
+      </w:r>
+    </w:p>
+    <w:p>
+      <w:pPr>
+        <w:pStyle w:val="Ttulo2"/>
+      </w:pPr>
+      <w:bookmarkStart w:id="12" w:name="_Toc227779306"/>
+      <w:r>
+        <w:t>8.1 Integridad y Persistencia</w:t>
+      </w:r>
+      <w:bookmarkEnd w:id="12"/>
+    </w:p>
+    <w:p/>
+    <w:p>
+      <w:r>
+        <w:t xml:space="preserve">Se han implementado restricciones de integridad para garantizar que, si un usuario o canción se elimina, las entradas correspondientes en la </w:t>
+      </w:r>
+      <w:r>
         <w:t>cola</w:t>
       </w:r>
       <w:r>
-        <w:rPr>
-          <w:b/>
-          <w:bCs/>
-        </w:rPr>
-        <w:t>:</w:t>
-      </w:r>
-      <w:r>
-        <w:t xml:space="preserve"> Actúa como la tabla dinámica de la sesión. Relaciona qué usuario ha pedido qué canción, permitiendo gestionar el orden de actuación.</w:t>
-      </w:r>
-    </w:p>
-    <w:p>
-      <w:r>
-        <w:rPr>
-          <w:b/>
-          <w:bCs/>
-        </w:rPr>
+        <w:t xml:space="preserve"> o en </w:t>
+      </w:r>
+      <w:r>
         <w:t>peticiones</w:t>
       </w:r>
       <w:r>
-        <w:rPr>
-          <w:b/>
-          <w:bCs/>
-        </w:rPr>
-        <w:t>:</w:t>
-      </w:r>
-      <w:r>
-        <w:t xml:space="preserve"> Permite a los usuarios solicitar canciones que aún no están en el catálogo, incluyendo un control de </w:t>
-      </w:r>
-      <w:r>
-        <w:t>estado</w:t>
-      </w:r>
-      <w:r>
-        <w:t xml:space="preserve"> (pendiente o realizado) y marca de tiempo.</w:t>
-      </w:r>
-    </w:p>
+        <w:t xml:space="preserve"> se gestionen automáticamente </w:t>
+      </w:r>
+      <w:r>
+        <w:t>(mediante ON DELETE CASCADE</w:t>
+      </w:r>
+      <w:r>
+        <w:t>), evitando registros huérfanos.</w:t>
+      </w:r>
+    </w:p>
+    <w:p/>
     <w:p>
       <w:pPr>
         <w:pStyle w:val="Ttulo2"/>
       </w:pPr>
-      <w:bookmarkStart w:id="12" w:name="_Toc227770868"/>
-      <w:r>
-        <w:t xml:space="preserve">8.1 </w:t>
-      </w:r>
-      <w:r>
-        <w:t>Integridad y Persistencia</w:t>
-      </w:r>
-      <w:bookmarkEnd w:id="12"/>
-    </w:p>
-    <w:p/>
-    <w:p>
-      <w:r>
-        <w:t xml:space="preserve">Se han implementado restricciones de integridad para garantizar </w:t>
-      </w:r>
-      <w:r>
-        <w:t>que,</w:t>
-      </w:r>
-      <w:r>
-        <w:t xml:space="preserve"> si un usuario o canción se elimina, las entradas correspondientes en la </w:t>
-      </w:r>
-      <w:r>
-        <w:t>cola</w:t>
-      </w:r>
-      <w:r>
-        <w:t xml:space="preserve"> o en </w:t>
-      </w:r>
-      <w:r>
-        <w:t>peticiones</w:t>
-      </w:r>
-      <w:r>
-        <w:t xml:space="preserve"> se gestionen automáticamente </w:t>
-      </w:r>
-      <w:r>
-        <w:t>(mediante ON DELETE CASCADE</w:t>
-      </w:r>
-      <w:r>
-        <w:t>), evitando registros huérfanos.</w:t>
-      </w:r>
-    </w:p>
-    <w:p/>
-    <w:p>
-      <w:pPr>
-        <w:pStyle w:val="Ttulo2"/>
-      </w:pPr>
-      <w:bookmarkStart w:id="13" w:name="_Toc227770869"/>
+      <w:bookmarkStart w:id="13" w:name="_Toc227779307"/>
       <w:r>
         <w:t>8.2 Relaciones y esquema E/R</w:t>
       </w:r>
@@ -3459,6 +4724,7 @@
       </w:pPr>
       <w:r>
         <w:rPr>
+          <w:noProof/>
           <w:lang w:eastAsia="es-ES"/>
         </w:rPr>
         <w:drawing>
@@ -3513,18 +4779,20 @@
           <w:lang w:eastAsia="es-ES"/>
         </w:rPr>
       </w:pPr>
+      <w:bookmarkStart w:id="14" w:name="_Toc227779308"/>
       <w:r>
         <w:rPr>
           <w:lang w:eastAsia="es-ES"/>
         </w:rPr>
-        <w:t>10. L</w:t>
+        <w:t>10.</w:t>
       </w:r>
       <w:r>
         <w:rPr>
           <w:lang w:eastAsia="es-ES"/>
         </w:rPr>
-        <w:t>ÓGICA BASE</w:t>
-      </w:r>
+        <w:t xml:space="preserve"> Lógica base</w:t>
+      </w:r>
+      <w:bookmarkEnd w:id="14"/>
     </w:p>
     <w:p>
       <w:pPr>
@@ -3552,9 +4820,11 @@
       <w:pPr>
         <w:pStyle w:val="Ttulo2"/>
       </w:pPr>
+      <w:bookmarkStart w:id="15" w:name="_Toc227779309"/>
       <w:r>
         <w:t>10.1. Algoritmo de Organización y Normalización</w:t>
       </w:r>
+      <w:bookmarkEnd w:id="15"/>
     </w:p>
     <w:p/>
     <w:p>
@@ -3573,48 +4843,71 @@
       <w:r>
         <w:t xml:space="preserve"> Se utiliza la función </w:t>
       </w:r>
-      <w:proofErr w:type="spellStart"/>
       <w:r>
         <w:rPr>
           <w:b/>
           <w:bCs/>
         </w:rPr>
-        <w:t>preg_replace</w:t>
-      </w:r>
-      <w:proofErr w:type="spellEnd"/>
+        <w:t xml:space="preserve">preg_replace('/[^A-Za-z0-9\- ]/', '', $string) </w:t>
+      </w:r>
+      <w:r>
+        <w:t>para sanear los nombres. Esta técnica es fundamental para eliminar caracteres que el sistema de archivos podría interpretar como comandos o rutas (como ../ o símbolos de sistema), garantizando la portabilidad entre servidores Linux y Windows.</w:t>
+      </w:r>
+    </w:p>
+    <w:p>
       <w:r>
         <w:rPr>
           <w:b/>
           <w:bCs/>
         </w:rPr>
-        <w:t>('/[^A-Za-z0-9\- ]/', '', $</w:t>
-      </w:r>
-      <w:proofErr w:type="spellStart"/>
+        <w:t>Tratamiento de Espacios:</w:t>
+      </w:r>
+      <w:r>
+        <w:t xml:space="preserve"> Se aplica </w:t>
+      </w:r>
       <w:r>
         <w:rPr>
           <w:b/>
           <w:bCs/>
         </w:rPr>
-        <w:t>string</w:t>
-      </w:r>
-      <w:proofErr w:type="spellEnd"/>
+        <w:t>str_replace(' ', '_', $string)</w:t>
+      </w:r>
+      <w:r>
+        <w:t>. El uso de guiones bajos en lugar de espacios evita los errores de "espacios escapados" (%20) en las URLs, lo que facilita la carga directa de los recursos en el reproductor HTML5.</w:t>
+      </w:r>
+    </w:p>
+    <w:p>
       <w:r>
         <w:rPr>
           <w:b/>
           <w:bCs/>
         </w:rPr>
-        <w:t xml:space="preserve">) </w:t>
-      </w:r>
-      <w:r>
-        <w:t>para sanear los nombres. Esta técnica es fundamental para eliminar caracteres que el sistema de archivos podría interpretar como comandos o rutas (como</w:t>
-      </w:r>
-      <w:proofErr w:type="gramStart"/>
-      <w:r>
-        <w:t xml:space="preserve"> ..</w:t>
-      </w:r>
-      <w:proofErr w:type="gramEnd"/>
-      <w:r>
-        <w:t>/ o símbolos de sistema), garantizando la portabilidad entre servidores Linux y Windows.</w:t>
+        <w:t>Prevención de Colisiones mediante Entropía Temporal:</w:t>
+      </w:r>
+      <w:r>
+        <w:t xml:space="preserve"> Se añade un timestamp dinámico a cada archivo. Esto asegura que, si dos versiones de la misma canción son subidas, el sistema genere nombres únicos, evitando la pérdida de datos por </w:t>
+      </w:r>
+      <w:r>
+        <w:t>sobreescritura</w:t>
+      </w:r>
+      <w:r>
+        <w:t xml:space="preserve"> accidental.</w:t>
+      </w:r>
+    </w:p>
+    <w:p>
+      <w:pPr>
+        <w:pStyle w:val="Ttulo2"/>
+      </w:pPr>
+      <w:bookmarkStart w:id="16" w:name="_Toc227779310"/>
+      <w:r>
+        <w:t>10.2. Estructura de Directorios Dinámica</w:t>
+      </w:r>
+      <w:bookmarkEnd w:id="16"/>
+    </w:p>
+    <w:p/>
+    <w:p>
+      <w:r>
+        <w:t>El sistema implementa una arquitectura de almacenamiento por nodos de artista, gestionada mediante las siguientes funciones nativas de PHP:</w:t>
       </w:r>
     </w:p>
     <w:p>
@@ -3623,53 +4916,71 @@
           <w:b/>
           <w:bCs/>
         </w:rPr>
-        <w:t>Tratamiento de Espacios:</w:t>
-      </w:r>
-      <w:r>
-        <w:t xml:space="preserve"> Se aplica </w:t>
-      </w:r>
-      <w:proofErr w:type="spellStart"/>
+        <w:t>Verificación de Existencia (is_dir):</w:t>
+      </w:r>
+      <w:r>
+        <w:t xml:space="preserve"> Antes de cada operación de escritura, el script comprueba si la rama del árbol de directorios ya existe, evitando errores de duplicidad.</w:t>
+      </w:r>
+    </w:p>
+    <w:p>
       <w:r>
         <w:rPr>
           <w:b/>
           <w:bCs/>
         </w:rPr>
-        <w:t>str_replace</w:t>
-      </w:r>
-      <w:proofErr w:type="spellEnd"/>
+        <w:t>Creación Recursiva (mkdir):</w:t>
+      </w:r>
+      <w:r>
+        <w:t xml:space="preserve"> Si el artista es nuevo en el catálogo, se ejecuta </w:t>
+      </w:r>
       <w:r>
         <w:rPr>
           <w:b/>
           <w:bCs/>
         </w:rPr>
-        <w:t>(' ', '_', $</w:t>
-      </w:r>
-      <w:proofErr w:type="spellStart"/>
+        <w:t>mkdir($ruta, 0777, true</w:t>
+      </w:r>
+      <w:r>
+        <w:t xml:space="preserve">). El parámetro true es crítico, ya que permite la creación de carpetas anidadas de forma recursiva en un solo paso, mientras que el permiso 0777 asegura que el servidor tenga privilegios de lectura/escritura sobre los nuevos </w:t>
+      </w:r>
       <w:r>
         <w:rPr>
           <w:b/>
           <w:bCs/>
         </w:rPr>
-        <w:t>string</w:t>
-      </w:r>
-      <w:proofErr w:type="spellEnd"/>
+        <w:t>assets.</w:t>
+      </w:r>
+    </w:p>
+    <w:p>
       <w:r>
         <w:rPr>
           <w:b/>
           <w:bCs/>
         </w:rPr>
-        <w:t>)</w:t>
-      </w:r>
-      <w:r>
-        <w:t xml:space="preserve">. El uso de guiones bajos en lugar de espacios evita los errores de "espacios escapados" (%20) en las </w:t>
-      </w:r>
-      <w:proofErr w:type="spellStart"/>
-      <w:r>
-        <w:t>URLs</w:t>
-      </w:r>
-      <w:proofErr w:type="spellEnd"/>
-      <w:r>
-        <w:t>, lo que facilita la carga directa de los recursos en el reproductor HTML5.</w:t>
+        <w:t>Distribución de Componentes:</w:t>
+      </w:r>
+      <w:r>
+        <w:t xml:space="preserve"> Se segmentan los recursos en /uploads/canciones/ para flujos binarios de audio y /uploads/letras/ para archivos de texto sincronizado, manteniendo una separación de intereses clara en el servidor.</w:t>
+      </w:r>
+    </w:p>
+    <w:p>
+      <w:pPr>
+        <w:pStyle w:val="Ttulo2"/>
+      </w:pPr>
+    </w:p>
+    <w:p>
+      <w:pPr>
+        <w:pStyle w:val="Ttulo2"/>
+      </w:pPr>
+      <w:bookmarkStart w:id="17" w:name="_Toc227779311"/>
+      <w:r>
+        <w:t>10.3. Gestión de la Integridad (CRUD de Archivos)</w:t>
+      </w:r>
+      <w:bookmarkEnd w:id="17"/>
+    </w:p>
+    <w:p>
+      <w:r>
+        <w:t>Se ha implementado una lógica de "borrado inteligente" para mantener una sincronización perfecta entre la base de datos y el almacenamiento físico (Estado Espejo).</w:t>
       </w:r>
     </w:p>
     <w:p>
@@ -3678,40 +4989,10 @@
           <w:b/>
           <w:bCs/>
         </w:rPr>
-        <w:t>Prevención de Colisiones mediante Entropía Temporal:</w:t>
-      </w:r>
-      <w:r>
-        <w:t xml:space="preserve"> Se añade un </w:t>
-      </w:r>
-      <w:proofErr w:type="spellStart"/>
-      <w:r>
-        <w:t>timestamp</w:t>
-      </w:r>
-      <w:proofErr w:type="spellEnd"/>
-      <w:r>
-        <w:t xml:space="preserve"> dinámico a cada archivo. Esto asegura que, si dos versiones de la misma canción son subidas, el sistema genere nombres únicos, evitando la pérdida de datos por </w:t>
-      </w:r>
-      <w:proofErr w:type="spellStart"/>
-      <w:r>
-        <w:t>sobrescritura</w:t>
-      </w:r>
-      <w:proofErr w:type="spellEnd"/>
-      <w:r>
-        <w:t xml:space="preserve"> accidental.</w:t>
-      </w:r>
-    </w:p>
-    <w:p>
-      <w:pPr>
-        <w:pStyle w:val="Ttulo2"/>
-      </w:pPr>
-      <w:r>
-        <w:t>10.2. Estructura de Directorios Dinámica</w:t>
-      </w:r>
-    </w:p>
-    <w:p/>
-    <w:p>
-      <w:r>
-        <w:t>El sistema implementa una arquitectura de almacenamiento por nodos de artista, gestionada mediante las siguientes funciones nativas de PHP:</w:t>
+        <w:t>Sincronización de Borrado (unlink):</w:t>
+      </w:r>
+      <w:r>
+        <w:t xml:space="preserve"> Al eliminar un registro, el sistema no solo borra la fila en SQL, sino que utiliza las rutas almacenadas para invocar la función unlink(). Esto libera espacio en el disco de forma inmediata.</w:t>
       </w:r>
     </w:p>
     <w:p>
@@ -3720,10 +5001,10 @@
           <w:b/>
           <w:bCs/>
         </w:rPr>
-        <w:t>Verificación de Existencia (is_dir):</w:t>
-      </w:r>
-      <w:r>
-        <w:t xml:space="preserve"> Antes de cada operación de escritura, el script comprueba si la rama del árbol de directorios ya existe, evitando errores de duplicidad.</w:t>
+        <w:t>Análisis de Residuos (scandir):</w:t>
+      </w:r>
+      <w:r>
+        <w:t xml:space="preserve"> Tras la eliminación de los archivos, se escanea el directorio del artista. El sistema cuenta los elementos devueltos por scandir(), ignorando los punteros de navegación de sistema (. y ..).</w:t>
       </w:r>
     </w:p>
     <w:p>
@@ -3732,107 +5013,106 @@
           <w:b/>
           <w:bCs/>
         </w:rPr>
-        <w:t>Creación Recursiva (</w:t>
-      </w:r>
-      <w:proofErr w:type="spellStart"/>
+        <w:t>Recursividad Inversa de Limpieza (rmdir):</w:t>
+      </w:r>
+      <w:r>
+        <w:t xml:space="preserve"> Si el contador de archivos es cero, el sistema interpreta que el artista ya no tiene canciones en el catálogo y procede a eliminar la carpeta física con rmdir(). Esto evita la acumulación de carpetas vacías (directorios huérfanos) que degradarían el rendimiento del sistema de archivos a largo plazo.</w:t>
+      </w:r>
+    </w:p>
+    <w:p>
+      <w:r>
+        <w:pict w14:anchorId="56F4B9E3">
+          <v:rect id="_x0000_i1025" style="width:0;height:1.5pt" o:hralign="center" o:hrstd="t" o:hr="t" fillcolor="#a0a0a0" stroked="f"/>
+        </w:pict>
+      </w:r>
+    </w:p>
+    <w:p>
+      <w:pPr>
+        <w:pStyle w:val="Ttulo2"/>
+      </w:pPr>
+      <w:bookmarkStart w:id="18" w:name="_Toc227779312"/>
+      <w:r>
+        <w:t>10.4. Explicación Técnica de Funcionamiento (Workflow)</w:t>
+      </w:r>
+      <w:bookmarkEnd w:id="18"/>
+    </w:p>
+    <w:p/>
+    <w:p>
+      <w:r>
+        <w:t>Para entender el proceso completo desde la interfaz hasta el disco, el flujo se divide en cuatro etapas técnicas:</w:t>
+      </w:r>
+    </w:p>
+    <w:p>
       <w:r>
         <w:rPr>
           <w:b/>
           <w:bCs/>
         </w:rPr>
-        <w:t>mkdir</w:t>
-      </w:r>
-      <w:proofErr w:type="spellEnd"/>
+        <w:t>Etapa de Captura:</w:t>
+      </w:r>
+      <w:r>
+        <w:t xml:space="preserve"> El formulario </w:t>
+      </w:r>
       <w:r>
         <w:rPr>
           <w:b/>
           <w:bCs/>
         </w:rPr>
-        <w:t>):</w:t>
-      </w:r>
-      <w:r>
-        <w:t xml:space="preserve"> Si el artista es nuevo en el catálogo, se ejecuta </w:t>
-      </w:r>
-      <w:proofErr w:type="spellStart"/>
+        <w:t>multipart/form-data</w:t>
+      </w:r>
+      <w:r>
+        <w:t xml:space="preserve"> envía los arrays globales $_POST (datos) y $_FILES (binarios). El sistema valida que los archivos no superen el límite de subida del servidor </w:t>
+      </w:r>
       <w:r>
         <w:rPr>
           <w:b/>
           <w:bCs/>
         </w:rPr>
-        <w:t>mkdir</w:t>
-      </w:r>
-      <w:proofErr w:type="spellEnd"/>
+        <w:t>(upload_max_filesize).</w:t>
+      </w:r>
+    </w:p>
+    <w:p>
       <w:r>
         <w:rPr>
           <w:b/>
           <w:bCs/>
         </w:rPr>
-        <w:t>($ruta, 0777, true</w:t>
-      </w:r>
-      <w:r>
-        <w:t xml:space="preserve">). El parámetro true es crítico, ya que permite la creación de carpetas anidadas de forma recursiva en un solo paso, mientras que el permiso 0777 asegura que el servidor tenga privilegios de lectura/escritura sobre los nuevos </w:t>
-      </w:r>
-      <w:proofErr w:type="spellStart"/>
+        <w:t>Etapa de Saneamiento:</w:t>
+      </w:r>
+      <w:r>
+        <w:t xml:space="preserve"> Se limpian los nombres del artista y título. Se escapan las cadenas con </w:t>
+      </w:r>
       <w:r>
         <w:rPr>
           <w:b/>
           <w:bCs/>
         </w:rPr>
-        <w:t>assets</w:t>
-      </w:r>
-      <w:proofErr w:type="spellEnd"/>
+        <w:t>mysqli_real_escape_string()</w:t>
+      </w:r>
+      <w:r>
+        <w:t xml:space="preserve"> para asegurar que caracteres como el apóstrofe (ej. "Guns N' Roses") no corrompan la sentencia SQL posterior.</w:t>
+      </w:r>
+    </w:p>
+    <w:p>
       <w:r>
         <w:rPr>
           <w:b/>
           <w:bCs/>
         </w:rPr>
-        <w:t>.</w:t>
-      </w:r>
-    </w:p>
-    <w:p>
+        <w:t>Etapa de Persistencia Física:</w:t>
+      </w:r>
+      <w:r>
+        <w:t xml:space="preserve"> Se utiliza </w:t>
+      </w:r>
       <w:r>
         <w:rPr>
           <w:b/>
           <w:bCs/>
         </w:rPr>
-        <w:t>Distribución de Componentes:</w:t>
-      </w:r>
-      <w:r>
-        <w:t xml:space="preserve"> Se segmentan los recursos en /</w:t>
-      </w:r>
-      <w:proofErr w:type="spellStart"/>
-      <w:r>
-        <w:t>uploads</w:t>
-      </w:r>
-      <w:proofErr w:type="spellEnd"/>
-      <w:r>
-        <w:t>/canciones/ para flujos binarios de audio y /</w:t>
-      </w:r>
-      <w:proofErr w:type="spellStart"/>
-      <w:r>
-        <w:t>uploads</w:t>
-      </w:r>
-      <w:proofErr w:type="spellEnd"/>
-      <w:r>
-        <w:t>/letras/ para archivos de texto sincronizado, manteniendo una separación de intereses clara en el servidor.</w:t>
-      </w:r>
-    </w:p>
-    <w:p>
-      <w:pPr>
-        <w:pStyle w:val="Ttulo2"/>
-      </w:pPr>
-    </w:p>
-    <w:p>
-      <w:pPr>
-        <w:pStyle w:val="Ttulo2"/>
-      </w:pPr>
-      <w:r>
-        <w:t>10.3. Gestión de la Integridad (CRUD de Archivos)</w:t>
-      </w:r>
-    </w:p>
-    <w:p>
-      <w:r>
-        <w:t>Se ha implementado una lógica de "borrado inteligente" para mantener una sincronización perfecta entre la base de datos y el almacenamiento físico (Estado Espejo).</w:t>
+        <w:t>move_uploaded_file()</w:t>
+      </w:r>
+      <w:r>
+        <w:t>. Esta función es una medida de seguridad vital en PHP, ya que verifica que el archivo que se intenta mover es realmente un archivo subido mediante HTTP POST y no un ataque de inclusión de archivos locales.</w:t>
       </w:r>
     </w:p>
     <w:p>
@@ -3841,291 +5121,6 @@
           <w:b/>
           <w:bCs/>
         </w:rPr>
-        <w:t>Sincronización de Borrado (</w:t>
-      </w:r>
-      <w:proofErr w:type="spellStart"/>
-      <w:r>
-        <w:rPr>
-          <w:b/>
-          <w:bCs/>
-        </w:rPr>
-        <w:t>unlink</w:t>
-      </w:r>
-      <w:proofErr w:type="spellEnd"/>
-      <w:r>
-        <w:rPr>
-          <w:b/>
-          <w:bCs/>
-        </w:rPr>
-        <w:t>):</w:t>
-      </w:r>
-      <w:r>
-        <w:t xml:space="preserve"> Al eliminar un registro, el sistema no solo borra la fila en SQL, sino que utiliza las rutas almacenadas para invocar la función </w:t>
-      </w:r>
-      <w:proofErr w:type="spellStart"/>
-      <w:r>
-        <w:t>unlink</w:t>
-      </w:r>
-      <w:proofErr w:type="spellEnd"/>
-      <w:r>
-        <w:t>(). Esto libera espacio en el disco de forma inmediata.</w:t>
-      </w:r>
-    </w:p>
-    <w:p>
-      <w:r>
-        <w:rPr>
-          <w:b/>
-          <w:bCs/>
-        </w:rPr>
-        <w:t>Análisis de Residuos (</w:t>
-      </w:r>
-      <w:proofErr w:type="spellStart"/>
-      <w:r>
-        <w:rPr>
-          <w:b/>
-          <w:bCs/>
-        </w:rPr>
-        <w:t>scandir</w:t>
-      </w:r>
-      <w:proofErr w:type="spellEnd"/>
-      <w:r>
-        <w:rPr>
-          <w:b/>
-          <w:bCs/>
-        </w:rPr>
-        <w:t>):</w:t>
-      </w:r>
-      <w:r>
-        <w:t xml:space="preserve"> Tras la eliminación de los archivos, se escanea el directorio del artista. El sistema cuenta los elementos devueltos por </w:t>
-      </w:r>
-      <w:proofErr w:type="spellStart"/>
-      <w:r>
-        <w:t>scandir</w:t>
-      </w:r>
-      <w:proofErr w:type="spellEnd"/>
-      <w:r>
-        <w:t>(), ignorando los punteros de navegación de sistema (. y</w:t>
-      </w:r>
-      <w:proofErr w:type="gramStart"/>
-      <w:r>
-        <w:t xml:space="preserve"> ..</w:t>
-      </w:r>
-      <w:proofErr w:type="gramEnd"/>
-      <w:r>
-        <w:t>).</w:t>
-      </w:r>
-    </w:p>
-    <w:p>
-      <w:r>
-        <w:rPr>
-          <w:b/>
-          <w:bCs/>
-        </w:rPr>
-        <w:t>Recursividad Inversa de Limpieza (</w:t>
-      </w:r>
-      <w:proofErr w:type="spellStart"/>
-      <w:r>
-        <w:rPr>
-          <w:b/>
-          <w:bCs/>
-        </w:rPr>
-        <w:t>rmdir</w:t>
-      </w:r>
-      <w:proofErr w:type="spellEnd"/>
-      <w:r>
-        <w:rPr>
-          <w:b/>
-          <w:bCs/>
-        </w:rPr>
-        <w:t>):</w:t>
-      </w:r>
-      <w:r>
-        <w:t xml:space="preserve"> Si el contador de archivos es cero, el sistema interpreta que el artista ya no tiene canciones en el catálogo y procede a eliminar la carpeta física con </w:t>
-      </w:r>
-      <w:proofErr w:type="spellStart"/>
-      <w:r>
-        <w:t>rmdir</w:t>
-      </w:r>
-      <w:proofErr w:type="spellEnd"/>
-      <w:r>
-        <w:t>(). Esto evita la acumulación de carpetas vacías (directorios huérfanos) que degradarían el rendimiento del sistema de archivos a largo plazo.</w:t>
-      </w:r>
-    </w:p>
-    <w:p>
-      <w:r>
-        <w:pict w14:anchorId="56F4B9E3">
-          <v:rect id="_x0000_i1067" style="width:0;height:1.5pt" o:hralign="center" o:hrstd="t" o:hr="t" fillcolor="#a0a0a0" stroked="f"/>
-        </w:pict>
-      </w:r>
-    </w:p>
-    <w:p>
-      <w:pPr>
-        <w:pStyle w:val="Ttulo2"/>
-      </w:pPr>
-      <w:r>
-        <w:t>10.4. Explicación Técnica de Funcionamiento (Workflow)</w:t>
-      </w:r>
-    </w:p>
-    <w:p/>
-    <w:p>
-      <w:r>
-        <w:t>Para entender el proceso completo desde la interfaz hasta el disco, el flujo se divide en cuatro etapas técnicas:</w:t>
-      </w:r>
-    </w:p>
-    <w:p>
-      <w:r>
-        <w:rPr>
-          <w:b/>
-          <w:bCs/>
-        </w:rPr>
-        <w:t>Etapa de Captura:</w:t>
-      </w:r>
-      <w:r>
-        <w:t xml:space="preserve"> El formulario </w:t>
-      </w:r>
-      <w:proofErr w:type="spellStart"/>
-      <w:r>
-        <w:rPr>
-          <w:b/>
-          <w:bCs/>
-        </w:rPr>
-        <w:t>multipart</w:t>
-      </w:r>
-      <w:proofErr w:type="spellEnd"/>
-      <w:r>
-        <w:rPr>
-          <w:b/>
-          <w:bCs/>
-        </w:rPr>
-        <w:t>/</w:t>
-      </w:r>
-      <w:proofErr w:type="spellStart"/>
-      <w:r>
-        <w:rPr>
-          <w:b/>
-          <w:bCs/>
-        </w:rPr>
-        <w:t>form</w:t>
-      </w:r>
-      <w:proofErr w:type="spellEnd"/>
-      <w:r>
-        <w:rPr>
-          <w:b/>
-          <w:bCs/>
-        </w:rPr>
-        <w:t>-data</w:t>
-      </w:r>
-      <w:r>
-        <w:t xml:space="preserve"> envía los </w:t>
-      </w:r>
-      <w:proofErr w:type="spellStart"/>
-      <w:r>
-        <w:t>arrays</w:t>
-      </w:r>
-      <w:proofErr w:type="spellEnd"/>
-      <w:r>
-        <w:t xml:space="preserve"> globales $_POST (datos) y $_FILES (binarios). El sistema valida que los archivos no superen el límite de subida del servidor </w:t>
-      </w:r>
-      <w:r>
-        <w:rPr>
-          <w:b/>
-          <w:bCs/>
-        </w:rPr>
-        <w:t>(</w:t>
-      </w:r>
-      <w:proofErr w:type="spellStart"/>
-      <w:r>
-        <w:rPr>
-          <w:b/>
-          <w:bCs/>
-        </w:rPr>
-        <w:t>upload_max_filesize</w:t>
-      </w:r>
-      <w:proofErr w:type="spellEnd"/>
-      <w:r>
-        <w:rPr>
-          <w:b/>
-          <w:bCs/>
-        </w:rPr>
-        <w:t>).</w:t>
-      </w:r>
-    </w:p>
-    <w:p>
-      <w:r>
-        <w:rPr>
-          <w:b/>
-          <w:bCs/>
-        </w:rPr>
-        <w:t>Etapa de Saneamiento:</w:t>
-      </w:r>
-      <w:r>
-        <w:t xml:space="preserve"> Se limpian los nombres del artista y título. Se escapan las cadenas con </w:t>
-      </w:r>
-      <w:proofErr w:type="spellStart"/>
-      <w:r>
-        <w:rPr>
-          <w:b/>
-          <w:bCs/>
-        </w:rPr>
-        <w:t>mysqli_real_escape_string</w:t>
-      </w:r>
-      <w:proofErr w:type="spellEnd"/>
-      <w:r>
-        <w:rPr>
-          <w:b/>
-          <w:bCs/>
-        </w:rPr>
-        <w:t>()</w:t>
-      </w:r>
-      <w:r>
-        <w:t xml:space="preserve"> para asegurar que caracteres como el apóstrofe (ej. "</w:t>
-      </w:r>
-      <w:proofErr w:type="spellStart"/>
-      <w:r>
-        <w:t>Guns</w:t>
-      </w:r>
-      <w:proofErr w:type="spellEnd"/>
-      <w:r>
-        <w:t xml:space="preserve"> N' Roses") no corrompan la sentencia SQL posterior.</w:t>
-      </w:r>
-    </w:p>
-    <w:p>
-      <w:r>
-        <w:rPr>
-          <w:b/>
-          <w:bCs/>
-        </w:rPr>
-        <w:t>Etapa de Persistencia Física:</w:t>
-      </w:r>
-      <w:r>
-        <w:t xml:space="preserve"> Se utiliza </w:t>
-      </w:r>
-      <w:proofErr w:type="spellStart"/>
-      <w:r>
-        <w:rPr>
-          <w:b/>
-          <w:bCs/>
-        </w:rPr>
-        <w:t>move_uploaded_file</w:t>
-      </w:r>
-      <w:proofErr w:type="spellEnd"/>
-      <w:r>
-        <w:rPr>
-          <w:b/>
-          <w:bCs/>
-        </w:rPr>
-        <w:t>()</w:t>
-      </w:r>
-      <w:r>
-        <w:t>. Esta función es una medida de seguridad vital en PHP, ya que verifica que el archivo que se intenta mover es realmente un archivo subido mediante HTTP POST y no un ataque de inclusión de archivos locales.</w:t>
-      </w:r>
-    </w:p>
-    <w:p>
-      <w:r>
-        <w:rPr>
-          <w:b/>
-          <w:bCs/>
-        </w:rPr>
         <w:t>Etapa de Registro:</w:t>
       </w:r>
       <w:r>
@@ -4159,9 +5154,11 @@
       <w:pPr>
         <w:pStyle w:val="Ttulo2"/>
       </w:pPr>
+      <w:bookmarkStart w:id="19" w:name="_Toc227779313"/>
       <w:r>
         <w:t>10.5. Ejemplo del Flujo de Nombres</w:t>
       </w:r>
+      <w:bookmarkEnd w:id="19"/>
     </w:p>
     <w:p/>
     <w:tbl>
@@ -4400,7 +5397,6 @@
             <w:hideMark/>
           </w:tcPr>
           <w:p>
-            <w:proofErr w:type="spellStart"/>
             <w:r>
               <w:rPr>
                 <w:b/>
@@ -4408,7 +5404,6 @@
               </w:rPr>
               <w:t>Timestamp</w:t>
             </w:r>
-            <w:proofErr w:type="spellEnd"/>
           </w:p>
         </w:tc>
         <w:tc>
@@ -4473,13 +5468,8 @@
       </w:r>
     </w:p>
     <w:p>
-      <w:proofErr w:type="spellStart"/>
-      <w:r>
-        <w:t>uploads</w:t>
-      </w:r>
-      <w:proofErr w:type="spellEnd"/>
-      <w:r>
-        <w:t>/canciones/La_Vela_Puerca/Zafar_(voz)_1711834200.mp3</w:t>
+      <w:r>
+        <w:t>uploads/canciones/La_Vela_Puerca/Zafar_(voz)_1711834200.mp3</w:t>
       </w:r>
     </w:p>
     <w:p>
@@ -4488,13 +5478,8 @@
       </w:r>
     </w:p>
     <w:p>
-      <w:proofErr w:type="spellStart"/>
-      <w:r>
-        <w:t>uploads</w:t>
-      </w:r>
-      <w:proofErr w:type="spellEnd"/>
-      <w:r>
-        <w:t>/letras/La_Vela_Puerca/Zafar_1711834200.lrc</w:t>
+      <w:r>
+        <w:t>uploads/letras/La_Vela_Puerca/Zafar_1711834200.lrc</w:t>
       </w:r>
     </w:p>
     <w:p>
@@ -4516,27 +5501,44 @@
           <w:b/>
           <w:bCs/>
         </w:rPr>
-        <w:t xml:space="preserve">Ejemplo de como se </w:t>
-      </w:r>
-      <w:proofErr w:type="gramStart"/>
+        <w:t xml:space="preserve">Ejemplo de </w:t>
+      </w:r>
+      <w:proofErr w:type="spellStart"/>
       <w:r>
         <w:rPr>
           <w:b/>
           <w:bCs/>
         </w:rPr>
-        <w:t>guardara</w:t>
-      </w:r>
-      <w:proofErr w:type="gramEnd"/>
+        <w:t>como</w:t>
+      </w:r>
+      <w:proofErr w:type="spellEnd"/>
       <w:r>
         <w:rPr>
           <w:b/>
           <w:bCs/>
         </w:rPr>
+        <w:t xml:space="preserve"> se </w:t>
+      </w:r>
+      <w:r>
+        <w:rPr>
+          <w:b/>
+          <w:bCs/>
+        </w:rPr>
+        <w:t>guardará</w:t>
+      </w:r>
+      <w:r>
+        <w:rPr>
+          <w:b/>
+          <w:bCs/>
+        </w:rPr>
         <w:t xml:space="preserve"> las carpetas para las canciones y letras</w:t>
       </w:r>
     </w:p>
     <w:p>
       <w:r>
+        <w:rPr>
+          <w:noProof/>
+        </w:rPr>
         <w:drawing>
           <wp:inline distT="0" distB="0" distL="0" distR="0" wp14:anchorId="72A62D87" wp14:editId="12D6955A">
             <wp:extent cx="5400040" cy="707390"/>
@@ -4591,6 +5593,9 @@
     </w:p>
     <w:p>
       <w:r>
+        <w:rPr>
+          <w:noProof/>
+        </w:rPr>
         <w:drawing>
           <wp:inline distT="0" distB="0" distL="0" distR="0" wp14:anchorId="4CC56970" wp14:editId="5E54F72C">
             <wp:extent cx="5400040" cy="676910"/>
@@ -4645,6 +5650,9 @@
     </w:p>
     <w:p>
       <w:r>
+        <w:rPr>
+          <w:noProof/>
+        </w:rPr>
         <w:drawing>
           <wp:inline distT="0" distB="0" distL="0" distR="0" wp14:anchorId="173E5C1B" wp14:editId="7562E1B3">
             <wp:extent cx="5400040" cy="1123315"/>
@@ -4698,44 +5706,32 @@
       <w:pPr>
         <w:pStyle w:val="Ttulo1"/>
       </w:pPr>
+      <w:bookmarkStart w:id="20" w:name="_Toc227779314"/>
       <w:r>
         <w:t>11. Motor de Ejecución y Gestión de Sesión</w:t>
       </w:r>
+      <w:bookmarkEnd w:id="20"/>
     </w:p>
     <w:p/>
     <w:p>
       <w:r>
-        <w:t>Este apartado describe la lógica central de "</w:t>
-      </w:r>
-      <w:proofErr w:type="spellStart"/>
-      <w:r>
-        <w:t>Kantabile</w:t>
-      </w:r>
-      <w:proofErr w:type="spellEnd"/>
-      <w:r>
-        <w:t>", que gestiona la interacción en tiempo real entre el usuario, la base de datos y los flujos multimedia sincronizados.</w:t>
+        <w:t>Este apartado describe la lógica central de "Kantabile", que gestiona la interacción en tiempo real entre el usuario, la base de datos y los flujos multimedia sincronizados.</w:t>
       </w:r>
     </w:p>
     <w:p>
       <w:pPr>
         <w:pStyle w:val="Ttulo2"/>
       </w:pPr>
+      <w:bookmarkStart w:id="21" w:name="_Toc227779315"/>
       <w:r>
         <w:t>11.1. Gestión Dinámica de Colas Privadas</w:t>
       </w:r>
+      <w:bookmarkEnd w:id="21"/>
     </w:p>
     <w:p/>
     <w:p>
       <w:r>
-        <w:t>El sistema implementa una arquitectura de cola personalizada mediante el uso de sesiones de PHP y consultas SQL filtradas por identificador de usuario ($</w:t>
-      </w:r>
-      <w:proofErr w:type="spellStart"/>
-      <w:r>
-        <w:t>idUsuario</w:t>
-      </w:r>
-      <w:proofErr w:type="spellEnd"/>
-      <w:r>
-        <w:t>).</w:t>
+        <w:t>El sistema implementa una arquitectura de cola personalizada mediante el uso de sesiones de PHP y consultas SQL filtradas por identificador de usuario ($idUsuario).</w:t>
       </w:r>
     </w:p>
     <w:p>
@@ -4747,23 +5743,7 @@
         <w:t xml:space="preserve">Aislamiento de Sesión: </w:t>
       </w:r>
       <w:r>
-        <w:t xml:space="preserve">Mediante la instrucción WHERE </w:t>
-      </w:r>
-      <w:proofErr w:type="spellStart"/>
-      <w:r>
-        <w:t>id_usuario</w:t>
-      </w:r>
-      <w:proofErr w:type="spellEnd"/>
-      <w:r>
-        <w:t xml:space="preserve"> = '$</w:t>
-      </w:r>
-      <w:proofErr w:type="spellStart"/>
-      <w:r>
-        <w:t>idUsuario</w:t>
-      </w:r>
-      <w:proofErr w:type="spellEnd"/>
-      <w:r>
-        <w:t>', el sistema garantiza que la experiencia sea multi-instancia, permitiendo que cada usuario gestione su propia lista de reproducción sin interferencias.</w:t>
+        <w:t>Mediante la instrucción WHERE id_usuario = '$idUsuario', el sistema garantiza que la experiencia sea multi-instancia, permitiendo que cada usuario gestione su propia lista de reproducción sin interferencias.</w:t>
       </w:r>
     </w:p>
     <w:p>
@@ -4794,49 +5774,78 @@
           <w:b/>
           <w:bCs/>
         </w:rPr>
-        <w:t>(</w:t>
-      </w:r>
-      <w:proofErr w:type="spellStart"/>
+        <w:t>(cancion_mover.php, cancion_quitar.php</w:t>
+      </w:r>
+      <w:r>
+        <w:t>) que permiten al usuario reordenar su cola en tiempo real, modificando la prioridad de los registros en la base de datos.</w:t>
+      </w:r>
+    </w:p>
+    <w:p>
+      <w:pPr>
+        <w:pStyle w:val="Ttulo2"/>
+      </w:pPr>
+      <w:bookmarkStart w:id="22" w:name="_Toc227779316"/>
+      <w:r>
+        <w:t>11.2. Arquitectura del Reproductor Dual</w:t>
+      </w:r>
+      <w:bookmarkEnd w:id="22"/>
+    </w:p>
+    <w:p/>
+    <w:p>
+      <w:r>
+        <w:t>Una de las innovaciones técnicas del proyecto es el uso de un sistema de audio sincronizado por software.</w:t>
+      </w:r>
+    </w:p>
+    <w:p>
       <w:r>
         <w:rPr>
           <w:b/>
           <w:bCs/>
         </w:rPr>
-        <w:t>cancion_mover.php</w:t>
-      </w:r>
-      <w:proofErr w:type="spellEnd"/>
+        <w:t>Dualidad de Pistas:</w:t>
+      </w:r>
+      <w:r>
+        <w:t xml:space="preserve"> El reproductor carga simultáneamente dos nodos de audio HTML5: la pista de Voz (guía) y la pista Instrumental.</w:t>
+      </w:r>
+    </w:p>
+    <w:p>
       <w:r>
         <w:rPr>
           <w:b/>
           <w:bCs/>
         </w:rPr>
-        <w:t xml:space="preserve">, </w:t>
-      </w:r>
-      <w:proofErr w:type="spellStart"/>
+        <w:t>Sincronización de Flujos:</w:t>
+      </w:r>
+      <w:r>
+        <w:t xml:space="preserve"> Mediante JavaScript, se ha vinculado el currentTime de ambas pistas. Al pausar, reproducir o desplazar la barra de progreso (evento onseeking), los dos archivos se mantienen en fase con una precisión de milisegundos.</w:t>
+      </w:r>
+    </w:p>
+    <w:p>
       <w:r>
         <w:rPr>
           <w:b/>
           <w:bCs/>
         </w:rPr>
-        <w:t>cancion_quitar.php</w:t>
-      </w:r>
-      <w:proofErr w:type="spellEnd"/>
-      <w:r>
-        <w:t>) que permiten al usuario reordenar su cola en tiempo real, modificando la prioridad de los registros en la base de datos.</w:t>
+        <w:t>Modo Guía Dinámico:</w:t>
+      </w:r>
+      <w:r>
+        <w:t xml:space="preserve"> Se implementó una función de mutado selectivo que permite al usuario alternar entre la versión con voz y la instrumental sin interrumpir la reproducción, facilitando el aprendizaje de la canción.</w:t>
       </w:r>
     </w:p>
     <w:p>
       <w:pPr>
         <w:pStyle w:val="Ttulo2"/>
       </w:pPr>
-      <w:r>
-        <w:t>11.2. Arquitectura del Reproductor Dual</w:t>
-      </w:r>
+      <w:bookmarkStart w:id="23" w:name="_Toc227779317"/>
+      <w:r>
+        <w:t>11.3. Motor de Sincronización Avanzada</w:t>
+      </w:r>
+      <w:bookmarkEnd w:id="23"/>
     </w:p>
     <w:p/>
     <w:p>
       <w:r>
-        <w:t>Una de las innovaciones técnicas del proyecto es el uso de un sistema de audio sincronizado por software.</w:t>
+        <w:t>El sistema utiliza un algoritmo de procesamiento en el lado del cliente para transformar archivos de texto .lrc en una experiencia visual interactiva.</w:t>
       </w:r>
     </w:p>
     <w:p>
@@ -4845,10 +5854,10 @@
           <w:b/>
           <w:bCs/>
         </w:rPr>
-        <w:t>Dualidad de Pistas:</w:t>
-      </w:r>
-      <w:r>
-        <w:t xml:space="preserve"> El reproductor carga simultáneamente dos nodos de audio HTML5: la pista de Voz (guía) y la pista Instrumental.</w:t>
+        <w:t>Parsing de Micro-tiempos:</w:t>
+      </w:r>
+      <w:r>
+        <w:t xml:space="preserve"> A diferencia de reproductores básicos que solo detectan líneas, este motor utiliza Expresiones Regulares (RegExp) para detectar marcas de tiempo de frase [...] y marcas de palabra &lt;...&gt;. Esto permite un resaltado progresivo (tipo "bola de rebote") dentro de la misma frase.</w:t>
       </w:r>
     </w:p>
     <w:p>
@@ -4857,26 +5866,17 @@
           <w:b/>
           <w:bCs/>
         </w:rPr>
-        <w:t>Sincronización de Flujos:</w:t>
-      </w:r>
-      <w:r>
-        <w:t xml:space="preserve"> Mediante JavaScript, se ha vinculado el </w:t>
-      </w:r>
-      <w:proofErr w:type="spellStart"/>
-      <w:r>
-        <w:t>currentTime</w:t>
-      </w:r>
-      <w:proofErr w:type="spellEnd"/>
-      <w:r>
-        <w:t xml:space="preserve"> de ambas pistas. Al pausar, reproducir o desplazar la barra de progreso (evento </w:t>
-      </w:r>
-      <w:proofErr w:type="spellStart"/>
-      <w:r>
-        <w:t>onseeking</w:t>
-      </w:r>
-      <w:proofErr w:type="spellEnd"/>
-      <w:r>
-        <w:t>), los dos archivos se mantienen en fase con una precisión de milisegundos.</w:t>
+        <w:t>Ciclo de Renderizado:</w:t>
+      </w:r>
+      <w:r>
+        <w:t xml:space="preserve"> En lugar de intervalos fijos, se utiliza el método requestAnimationFrame. Esto permite que el "engine" de sincronización se ejecute a la </w:t>
+      </w:r>
+      <w:r>
+        <w:lastRenderedPageBreak/>
+        <w:t>tasa de refresco del monitor (normalmente 60fps), garantizando una transición suave en las barras de progreso de cada palabra mediante variables CSS</w:t>
+      </w:r>
+      <w:r>
+        <w:t>.</w:t>
       </w:r>
     </w:p>
     <w:p>
@@ -4885,577 +5885,356 @@
           <w:b/>
           <w:bCs/>
         </w:rPr>
-        <w:t>Modo Guía Dinámico:</w:t>
-      </w:r>
-      <w:r>
-        <w:t xml:space="preserve"> Se implementó una función de mutado selectivo que permite al usuario alternar entre la versión con voz y la instrumental sin interrumpir la reproducción, facilitando el aprendizaje de la canción.</w:t>
+        <w:t>Lógica de Pre-visualización</w:t>
+      </w:r>
+      <w:r>
+        <w:t xml:space="preserve">: El motor calcula dinámicamente el índice de la frase actual y la siguiente, permitiendo al usuario anticipar la letra que debe cantar (campo </w:t>
+      </w:r>
+      <w:r>
+        <w:t>línea</w:t>
+      </w:r>
+      <w:r>
+        <w:t>-siguiente).</w:t>
       </w:r>
     </w:p>
     <w:p>
       <w:pPr>
         <w:pStyle w:val="Ttulo2"/>
       </w:pPr>
-      <w:r>
-        <w:t>11.3. Motor de Sincronización Avanzada</w:t>
+      <w:bookmarkStart w:id="24" w:name="_Toc227779318"/>
+      <w:r>
+        <w:t>11.4. Interfaz de Escenario</w:t>
+      </w:r>
+      <w:bookmarkEnd w:id="24"/>
+    </w:p>
+    <w:p>
+      <w:pPr>
+        <w:rPr>
+          <w:u w:val="single"/>
+        </w:rPr>
+      </w:pPr>
+    </w:p>
+    <w:p>
+      <w:r>
+        <w:t>Para profesionalizar la experiencia de usuario, se ha desarrollado un módulo de Escenario Externo.</w:t>
+      </w:r>
+    </w:p>
+    <w:p>
+      <w:r>
+        <w:t>Comunicación Inter-Ventana: Utilizando el objeto window.open, el sistema abre una ventana secundaria independiente del panel de control.</w:t>
+      </w:r>
+    </w:p>
+    <w:p>
+      <w:r>
+        <w:t>Sincronización del DOM: Mediante un puente de datos en JavaScript, la ventana principal inyecta el contenido procesado de las letras en la ventana del escenario en tiempo real. Esto permite que el monitor principal sea utilizado para la gestión (cola/búsqueda) mientras el monitor secundario muestra exclusivamente la letra al cantante, simulando un entorno de karaoke profesional.</w:t>
       </w:r>
     </w:p>
     <w:p/>
     <w:p>
-      <w:r>
-        <w:t>El sistema utiliza un algoritmo de procesamiento en el lado del cliente para transformar archivos de texto .</w:t>
-      </w:r>
-      <w:proofErr w:type="spellStart"/>
-      <w:r>
-        <w:t>lrc</w:t>
-      </w:r>
-      <w:proofErr w:type="spellEnd"/>
-      <w:r>
-        <w:t xml:space="preserve"> en una experiencia visual interactiva.</w:t>
-      </w:r>
-    </w:p>
-    <w:p>
-      <w:proofErr w:type="spellStart"/>
+      <w:pPr>
+        <w:pStyle w:val="Ttulo1"/>
+      </w:pPr>
+      <w:bookmarkStart w:id="25" w:name="_Toc227779319"/>
+      <w:r>
+        <w:t>12</w:t>
+      </w:r>
+      <w:r>
+        <w:t>. Navegación y Flujo de Trabajo (User Flow)</w:t>
+      </w:r>
+      <w:bookmarkEnd w:id="25"/>
+    </w:p>
+    <w:p/>
+    <w:p>
+      <w:r>
+        <w:t>En este apartado se describe la arquitectura de navegación de la aplicación, diseñada bajo un enfoque de experiencia de usuario (UX) simplificada para evitar distracciones en entornos de ocio (karaoke).</w:t>
+      </w:r>
+    </w:p>
+    <w:p>
+      <w:pPr>
+        <w:pStyle w:val="Ttulo2"/>
+      </w:pPr>
+      <w:bookmarkStart w:id="26" w:name="_Toc227779320"/>
+      <w:r>
+        <w:t>12</w:t>
+      </w:r>
+      <w:r>
+        <w:t>.1. Mapa del Sitio (Sitemap)</w:t>
+      </w:r>
+      <w:bookmarkEnd w:id="26"/>
+    </w:p>
+    <w:p>
+      <w:r>
+        <w:t>La aplicación se estructura en cuatro nodos principales interconectados:</w:t>
+      </w:r>
+    </w:p>
+    <w:p>
       <w:r>
         <w:rPr>
           <w:b/>
           <w:bCs/>
         </w:rPr>
-        <w:t>Parsing</w:t>
-      </w:r>
-      <w:proofErr w:type="spellEnd"/>
+        <w:t>Index / Login:</w:t>
+      </w:r>
+      <w:r>
+        <w:t xml:space="preserve"> Puerta de entrada donde se gestiona la autenticación.</w:t>
+      </w:r>
+    </w:p>
+    <w:p>
       <w:r>
         <w:rPr>
           <w:b/>
           <w:bCs/>
         </w:rPr>
-        <w:t xml:space="preserve"> de </w:t>
-      </w:r>
-      <w:proofErr w:type="spellStart"/>
+        <w:t>Dashboard</w:t>
+      </w:r>
+      <w:r>
+        <w:t xml:space="preserve"> (Biblioteca): El centro neurálgico donde el usuario busca canciones y gestiona su perfil.</w:t>
+      </w:r>
+      <w:r>
+        <w:t xml:space="preserve"> </w:t>
+      </w:r>
+    </w:p>
+    <w:p>
       <w:r>
         <w:rPr>
           <w:b/>
           <w:bCs/>
         </w:rPr>
-        <w:t>Micro-tiempos</w:t>
-      </w:r>
-      <w:proofErr w:type="spellEnd"/>
+        <w:t>Reproductor de Karaoke:</w:t>
+      </w:r>
+      <w:r>
+        <w:t xml:space="preserve"> Interfaz de ejecución donde se procesa el audio y la letra.</w:t>
+      </w:r>
+    </w:p>
+    <w:p>
       <w:r>
         <w:rPr>
           <w:b/>
           <w:bCs/>
         </w:rPr>
-        <w:t>:</w:t>
-      </w:r>
-      <w:r>
-        <w:t xml:space="preserve"> A diferencia de reproductores básicos que solo detectan líneas, este motor utiliza Expresiones Regulares (</w:t>
-      </w:r>
-      <w:proofErr w:type="spellStart"/>
-      <w:r>
-        <w:t>RegExp</w:t>
-      </w:r>
-      <w:proofErr w:type="spellEnd"/>
-      <w:r>
-        <w:t>) para detectar marcas de tiempo de frase [...] y marcas de palabra &lt;...&gt;. Esto permite un resaltado progresivo (tipo "bola de rebote") dentro de la misma frase.</w:t>
-      </w:r>
-    </w:p>
-    <w:p>
+        <w:t xml:space="preserve">Ventana de Escenario: </w:t>
+      </w:r>
+      <w:r>
+        <w:t>Una extensión visual independiente para la proyección de la letra.</w:t>
+      </w:r>
+    </w:p>
+    <w:p>
+      <w:pPr>
+        <w:pStyle w:val="Ttulo2"/>
+      </w:pPr>
+      <w:bookmarkStart w:id="27" w:name="_Toc227779321"/>
+      <w:r>
+        <w:t>12</w:t>
+      </w:r>
+      <w:r>
+        <w:t>.2. Descripción de los Flujos Principales</w:t>
+      </w:r>
+      <w:bookmarkEnd w:id="27"/>
+    </w:p>
+    <w:p/>
+    <w:p>
+      <w:pPr>
+        <w:rPr>
+          <w:i/>
+          <w:iCs/>
+        </w:rPr>
+      </w:pPr>
+      <w:r>
+        <w:rPr>
+          <w:i/>
+          <w:iCs/>
+        </w:rPr>
+        <w:t>Flujo de Selección de Canción</w:t>
+      </w:r>
+    </w:p>
+    <w:p>
+      <w:pPr>
+        <w:ind w:left="360"/>
+      </w:pPr>
+      <w:r>
+        <w:t>Para que un usuario pueda cantar, el sistema sigue este camino lógico:</w:t>
+      </w:r>
+    </w:p>
+    <w:p>
+      <w:pPr>
+        <w:ind w:left="360"/>
+      </w:pPr>
       <w:r>
         <w:rPr>
           <w:b/>
           <w:bCs/>
         </w:rPr>
-        <w:t>Ciclo de Renderizado:</w:t>
-      </w:r>
-      <w:r>
-        <w:t xml:space="preserve"> En lugar de intervalos fijos, se utiliza el método </w:t>
-      </w:r>
-      <w:proofErr w:type="spellStart"/>
-      <w:r>
-        <w:t>requestAnimationFrame</w:t>
-      </w:r>
-      <w:proofErr w:type="spellEnd"/>
-      <w:r>
-        <w:t>. Esto permite que el "</w:t>
-      </w:r>
-      <w:proofErr w:type="spellStart"/>
-      <w:r>
-        <w:t>engine</w:t>
-      </w:r>
-      <w:proofErr w:type="spellEnd"/>
-      <w:r>
-        <w:t xml:space="preserve">" de sincronización se ejecute a la </w:t>
-      </w:r>
-      <w:r>
-        <w:lastRenderedPageBreak/>
-        <w:t>tasa de refresco del monitor (normalmente 60fps), garantizando una transición suave en las barras de progreso de cada palabra mediante variables CSS</w:t>
-      </w:r>
-      <w:r>
-        <w:t>.</w:t>
-      </w:r>
-    </w:p>
-    <w:p>
+        <w:t>Búsqueda:</w:t>
+      </w:r>
+      <w:r>
+        <w:t xml:space="preserve"> El usuario utiliza el buscador dinámico. El sistema filtra en tiempo real sobre la base de datos.</w:t>
+      </w:r>
+    </w:p>
+    <w:p>
+      <w:pPr>
+        <w:ind w:left="360"/>
+      </w:pPr>
       <w:r>
         <w:rPr>
           <w:b/>
           <w:bCs/>
         </w:rPr>
-        <w:t xml:space="preserve">Lógica de </w:t>
-      </w:r>
-      <w:proofErr w:type="spellStart"/>
+        <w:t>Registro en Cola:</w:t>
+      </w:r>
+      <w:r>
+        <w:t xml:space="preserve"> Al hacer clic en "Añadir a la cola", se dispara una petición POST que registra el id_cancion y el alias del cantante.</w:t>
+      </w:r>
+    </w:p>
+    <w:p>
+      <w:pPr>
+        <w:ind w:left="360"/>
+      </w:pPr>
       <w:r>
         <w:rPr>
           <w:b/>
           <w:bCs/>
         </w:rPr>
-        <w:t>Pre-visualización</w:t>
-      </w:r>
-      <w:proofErr w:type="spellEnd"/>
-      <w:r>
-        <w:t xml:space="preserve">: El motor calcula dinámicamente el índice de la frase actual y la siguiente, permitiendo al usuario anticipar la letra que debe cantar (campo </w:t>
-      </w:r>
-      <w:proofErr w:type="spellStart"/>
-      <w:r>
-        <w:t>linea</w:t>
-      </w:r>
-      <w:proofErr w:type="spellEnd"/>
-      <w:r>
-        <w:t>-siguiente).</w:t>
-      </w:r>
-    </w:p>
-    <w:p>
-      <w:pPr>
-        <w:pStyle w:val="Ttulo2"/>
-      </w:pPr>
-      <w:r>
-        <w:t>11.4. Interfaz de Escenario</w:t>
-      </w:r>
-    </w:p>
-    <w:p>
-      <w:pPr>
-        <w:rPr>
-          <w:u w:val="single"/>
-        </w:rPr>
-      </w:pPr>
-    </w:p>
-    <w:p>
-      <w:r>
-        <w:t>Para profesionalizar la experiencia de usuario, se ha desarrollado un módulo de Escenario Externo.</w:t>
-      </w:r>
-    </w:p>
-    <w:p>
-      <w:r>
-        <w:t xml:space="preserve">Comunicación Inter-Ventana: Utilizando el objeto </w:t>
-      </w:r>
-      <w:proofErr w:type="spellStart"/>
-      <w:r>
-        <w:t>window.open</w:t>
-      </w:r>
-      <w:proofErr w:type="spellEnd"/>
-      <w:r>
-        <w:t>, el sistema abre una ventana secundaria independiente del panel de control.</w:t>
-      </w:r>
-    </w:p>
-    <w:p>
-      <w:r>
-        <w:t>Sincronización del DOM: Mediante un puente de datos en JavaScript, la ventana principal inyecta el contenido procesado de las letras en la ventana del escenario en tiempo real. Esto permite que el monitor principal sea utilizado para la gestión (cola/búsqueda) mientras el monitor secundario muestra exclusivamente la letra al cantante, simulando un entorno de karaoke profesional.</w:t>
-      </w:r>
-    </w:p>
-    <w:p/>
-    <w:p>
-      <w:pPr>
-        <w:pStyle w:val="Ttulo1"/>
-      </w:pPr>
-      <w:r>
-        <w:t>12</w:t>
-      </w:r>
-      <w:r>
-        <w:t>. Navegación y Flujo de Trabajo (</w:t>
-      </w:r>
-      <w:proofErr w:type="spellStart"/>
-      <w:r>
-        <w:t>User</w:t>
-      </w:r>
-      <w:proofErr w:type="spellEnd"/>
-      <w:r>
-        <w:t xml:space="preserve"> Flow)</w:t>
-      </w:r>
-    </w:p>
-    <w:p/>
-    <w:p>
-      <w:r>
-        <w:t>En este apartado se describe la arquitectura de navegación de la aplicación, diseñada bajo un enfoque de experiencia de usuario (UX) simplificada para evitar distracciones en entornos de ocio (karaoke).</w:t>
-      </w:r>
-    </w:p>
-    <w:p>
-      <w:pPr>
-        <w:pStyle w:val="Ttulo2"/>
-      </w:pPr>
-      <w:r>
-        <w:t>12</w:t>
-      </w:r>
-      <w:r>
-        <w:t>.1. Mapa del Sitio (</w:t>
-      </w:r>
-      <w:proofErr w:type="spellStart"/>
-      <w:r>
-        <w:t>Sitemap</w:t>
-      </w:r>
-      <w:proofErr w:type="spellEnd"/>
-      <w:r>
-        <w:t>)</w:t>
-      </w:r>
-    </w:p>
-    <w:p>
-      <w:r>
-        <w:t>La aplicación se estructura en cuatro nodos principales interconectados:</w:t>
-      </w:r>
-    </w:p>
-    <w:p>
-      <w:proofErr w:type="spellStart"/>
+        <w:lastRenderedPageBreak/>
+        <w:t>Carga de Assets:</w:t>
+      </w:r>
+      <w:r>
+        <w:t xml:space="preserve"> Cuando llega el turno, el sistema carga simultáneamente tres elementos: el audio guía, el audio instrumental y el archivo de texto .lrc.</w:t>
+      </w:r>
+    </w:p>
+    <w:p>
+      <w:pPr>
+        <w:rPr>
+          <w:i/>
+          <w:iCs/>
+        </w:rPr>
+      </w:pPr>
+      <w:r>
+        <w:rPr>
+          <w:i/>
+          <w:iCs/>
+        </w:rPr>
+        <w:t>Flujo de Control de Visualización</w:t>
+      </w:r>
+    </w:p>
+    <w:p>
+      <w:pPr>
+        <w:ind w:left="708"/>
+      </w:pPr>
+      <w:r>
+        <w:t>Una de las innovaciones de "Kantabile" es su flujo de visualización dual, pensado para monitores externos o proyectores:</w:t>
+      </w:r>
+    </w:p>
+    <w:p>
+      <w:pPr>
+        <w:ind w:left="708"/>
+      </w:pPr>
       <w:r>
         <w:rPr>
           <w:b/>
           <w:bCs/>
         </w:rPr>
-        <w:t>Index</w:t>
-      </w:r>
-      <w:proofErr w:type="spellEnd"/>
+        <w:t>Acción del Usuario:</w:t>
+      </w:r>
+      <w:r>
+        <w:t xml:space="preserve"> Desde el reproductor, el usuario pulsa "Modo Escenario".</w:t>
+      </w:r>
+    </w:p>
+    <w:p>
+      <w:pPr>
+        <w:ind w:left="708"/>
+      </w:pPr>
       <w:r>
         <w:rPr>
           <w:b/>
           <w:bCs/>
         </w:rPr>
-        <w:t xml:space="preserve"> / </w:t>
-      </w:r>
-      <w:proofErr w:type="spellStart"/>
+        <w:t>Apertura de Nodo:</w:t>
+      </w:r>
+      <w:r>
+        <w:t xml:space="preserve"> JavaScript abre una ventana pop-up limpia (sin controles, solo letra).</w:t>
+      </w:r>
+    </w:p>
+    <w:p>
+      <w:pPr>
+        <w:ind w:left="708"/>
+      </w:pPr>
       <w:r>
         <w:rPr>
           <w:b/>
           <w:bCs/>
         </w:rPr>
-        <w:t>Login</w:t>
-      </w:r>
-      <w:proofErr w:type="spellEnd"/>
+        <w:t>Sincronización:</w:t>
+      </w:r>
+      <w:r>
+        <w:t xml:space="preserve"> El flujo de datos de la ventana principal se "espeja" en la secundaria. Esto permite que el gestor controle el volumen y la cola mientras el cantante solo ve la letra.</w:t>
+      </w:r>
+    </w:p>
+    <w:p>
+      <w:pPr>
+        <w:pStyle w:val="Ttulo2"/>
+      </w:pPr>
+      <w:bookmarkStart w:id="28" w:name="_Toc227779322"/>
+      <w:r>
+        <w:t>12</w:t>
+      </w:r>
+      <w:r>
+        <w:t>.3. Diseño de la Interfaz</w:t>
+      </w:r>
+      <w:bookmarkEnd w:id="28"/>
+    </w:p>
+    <w:p/>
+    <w:p>
+      <w:r>
+        <w:t xml:space="preserve">La navegación se ha diseñado para </w:t>
+      </w:r>
+      <w:r>
+        <w:t>no ser intrusiva.</w:t>
+      </w:r>
+    </w:p>
+    <w:p>
       <w:r>
         <w:rPr>
           <w:b/>
           <w:bCs/>
         </w:rPr>
-        <w:t>:</w:t>
-      </w:r>
-      <w:r>
-        <w:t xml:space="preserve"> Puerta de entrada donde se gestiona la autenticación.</w:t>
-      </w:r>
-    </w:p>
-    <w:p>
-      <w:proofErr w:type="spellStart"/>
+        <w:t>Sidebar Fijo:</w:t>
+      </w:r>
+      <w:r>
+        <w:t xml:space="preserve"> El menú lateral permite saltar entre la biblioteca y la cola de espera sin detener la música que esté sonando.</w:t>
+      </w:r>
+    </w:p>
+    <w:p>
       <w:r>
         <w:rPr>
           <w:b/>
           <w:bCs/>
         </w:rPr>
-        <w:t>Dashboard</w:t>
-      </w:r>
-      <w:proofErr w:type="spellEnd"/>
-      <w:r>
-        <w:t xml:space="preserve"> (Biblioteca): El centro neurálgico donde el usuario busca canciones y gestiona su perfil.</w:t>
-      </w:r>
-      <w:r>
-        <w:t xml:space="preserve"> </w:t>
-      </w:r>
-    </w:p>
-    <w:p>
-      <w:r>
-        <w:rPr>
-          <w:b/>
-          <w:bCs/>
-        </w:rPr>
-        <w:t>Reproductor de Karaoke:</w:t>
-      </w:r>
-      <w:r>
-        <w:t xml:space="preserve"> Interfaz de ejecución donde se procesa el audio y la letra.</w:t>
-      </w:r>
-    </w:p>
-    <w:p>
-      <w:r>
-        <w:rPr>
-          <w:b/>
-          <w:bCs/>
-        </w:rPr>
-        <w:t xml:space="preserve">Ventana de Escenario: </w:t>
-      </w:r>
-      <w:r>
-        <w:t>Una extensión visual independiente para la proyección de la letra.</w:t>
-      </w:r>
-    </w:p>
-    <w:p>
-      <w:pPr>
-        <w:pStyle w:val="Ttulo2"/>
-      </w:pPr>
-      <w:r>
-        <w:t>12</w:t>
-      </w:r>
-      <w:r>
-        <w:t>.2. Descripción de los Flujos Principales</w:t>
+        <w:t>Feedback Visual:</w:t>
+      </w:r>
+      <w:r>
+        <w:t xml:space="preserve"> Se han implementado estados de "Cargando" y notificaciones de éxito cuando una canción se añade correctamente a la lista.</w:t>
+      </w:r>
+    </w:p>
+    <w:p>
+      <w:r>
+        <w:t xml:space="preserve">Un ejemplo visual de la interfaz </w:t>
+      </w:r>
+      <w:r>
+        <w:t>sería</w:t>
+      </w:r>
+      <w:r>
+        <w:t xml:space="preserve"> el que veremos a continuación</w:t>
       </w:r>
     </w:p>
     <w:p/>
     <w:p>
       <w:pPr>
-        <w:rPr>
-          <w:i/>
-          <w:iCs/>
-        </w:rPr>
-      </w:pPr>
-      <w:r>
-        <w:rPr>
-          <w:i/>
-          <w:iCs/>
-        </w:rPr>
-        <w:t>Flujo de Selección de Canción</w:t>
-      </w:r>
-    </w:p>
-    <w:p>
-      <w:pPr>
-        <w:ind w:left="360"/>
-      </w:pPr>
-      <w:r>
-        <w:t>Para que un usuario pueda cantar, el sistema sigue este camino lógico:</w:t>
-      </w:r>
-    </w:p>
-    <w:p>
-      <w:pPr>
-        <w:ind w:left="360"/>
-      </w:pPr>
-      <w:r>
-        <w:rPr>
-          <w:b/>
-          <w:bCs/>
-        </w:rPr>
-        <w:t>Búsqueda:</w:t>
-      </w:r>
-      <w:r>
-        <w:t xml:space="preserve"> El usuario utiliza el buscador dinámico. El sistema filtra en tiempo real sobre la base de datos.</w:t>
-      </w:r>
-    </w:p>
-    <w:p>
-      <w:pPr>
-        <w:ind w:left="360"/>
-      </w:pPr>
-      <w:r>
-        <w:rPr>
-          <w:b/>
-          <w:bCs/>
-        </w:rPr>
-        <w:t>Registro en Cola:</w:t>
-      </w:r>
-      <w:r>
-        <w:t xml:space="preserve"> Al hacer clic en "Añadir a la cola", se dispara una petición POST que registra el </w:t>
-      </w:r>
-      <w:proofErr w:type="spellStart"/>
-      <w:r>
-        <w:t>id_cancion</w:t>
-      </w:r>
-      <w:proofErr w:type="spellEnd"/>
-      <w:r>
-        <w:t xml:space="preserve"> y el alias del cantante.</w:t>
-      </w:r>
-    </w:p>
-    <w:p>
-      <w:pPr>
-        <w:ind w:left="360"/>
-      </w:pPr>
-      <w:r>
-        <w:rPr>
-          <w:b/>
-          <w:bCs/>
-        </w:rPr>
-        <w:lastRenderedPageBreak/>
-        <w:t xml:space="preserve">Carga de </w:t>
-      </w:r>
-      <w:proofErr w:type="spellStart"/>
-      <w:r>
-        <w:rPr>
-          <w:b/>
-          <w:bCs/>
-        </w:rPr>
-        <w:t>Assets</w:t>
-      </w:r>
-      <w:proofErr w:type="spellEnd"/>
-      <w:r>
-        <w:rPr>
-          <w:b/>
-          <w:bCs/>
-        </w:rPr>
-        <w:t>:</w:t>
-      </w:r>
-      <w:r>
-        <w:t xml:space="preserve"> Cuando llega el turno, el sistema carga simultáneamente tres elementos: el audio guía, el audio instrumental y el archivo de texto .</w:t>
-      </w:r>
-      <w:proofErr w:type="spellStart"/>
-      <w:r>
-        <w:t>lrc</w:t>
-      </w:r>
-      <w:proofErr w:type="spellEnd"/>
-      <w:r>
-        <w:t>.</w:t>
-      </w:r>
-    </w:p>
-    <w:p>
-      <w:pPr>
-        <w:rPr>
-          <w:i/>
-          <w:iCs/>
-        </w:rPr>
-      </w:pPr>
-      <w:r>
-        <w:rPr>
-          <w:i/>
-          <w:iCs/>
-        </w:rPr>
-        <w:t>Flujo de Control de Visualización</w:t>
-      </w:r>
-    </w:p>
-    <w:p>
-      <w:pPr>
-        <w:ind w:left="708"/>
-      </w:pPr>
-      <w:r>
-        <w:t>Una de las innovaciones de "</w:t>
-      </w:r>
-      <w:proofErr w:type="spellStart"/>
-      <w:r>
-        <w:t>Kantabile</w:t>
-      </w:r>
-      <w:proofErr w:type="spellEnd"/>
-      <w:r>
-        <w:t>" es su flujo de visualización dual, pensado para monitores externos o proyectores:</w:t>
-      </w:r>
-    </w:p>
-    <w:p>
-      <w:pPr>
-        <w:ind w:left="708"/>
-      </w:pPr>
-      <w:r>
-        <w:rPr>
-          <w:b/>
-          <w:bCs/>
-        </w:rPr>
-        <w:t>Acción del Usuario:</w:t>
-      </w:r>
-      <w:r>
-        <w:t xml:space="preserve"> Desde el reproductor, el usuario pulsa "Modo Escenario".</w:t>
-      </w:r>
-    </w:p>
-    <w:p>
-      <w:pPr>
-        <w:ind w:left="708"/>
-      </w:pPr>
-      <w:r>
-        <w:rPr>
-          <w:b/>
-          <w:bCs/>
-        </w:rPr>
-        <w:t>Apertura de Nodo:</w:t>
-      </w:r>
-      <w:r>
-        <w:t xml:space="preserve"> JavaScript abre una ventana pop-up limpia (sin controles, solo letra).</w:t>
-      </w:r>
-    </w:p>
-    <w:p>
-      <w:pPr>
-        <w:ind w:left="708"/>
-      </w:pPr>
-      <w:r>
-        <w:rPr>
-          <w:b/>
-          <w:bCs/>
-        </w:rPr>
-        <w:t>Sincronización:</w:t>
-      </w:r>
-      <w:r>
-        <w:t xml:space="preserve"> El flujo de datos de la ventana principal se "espeja" en la secundaria. Esto permite que el gestor controle el volumen y la cola mientras el cantante solo ve la letra.</w:t>
-      </w:r>
-    </w:p>
-    <w:p>
-      <w:pPr>
-        <w:pStyle w:val="Ttulo2"/>
-      </w:pPr>
-      <w:r>
-        <w:t>12</w:t>
-      </w:r>
-      <w:r>
-        <w:t>.3. Diseño de la Interfaz</w:t>
-      </w:r>
-    </w:p>
-    <w:p/>
-    <w:p>
-      <w:r>
-        <w:t xml:space="preserve">La navegación se ha diseñado para </w:t>
-      </w:r>
-      <w:r>
-        <w:t>no ser intrusiva.</w:t>
-      </w:r>
-    </w:p>
-    <w:p>
-      <w:proofErr w:type="spellStart"/>
-      <w:r>
-        <w:rPr>
-          <w:b/>
-          <w:bCs/>
-        </w:rPr>
-        <w:t>Sidebar</w:t>
-      </w:r>
-      <w:proofErr w:type="spellEnd"/>
-      <w:r>
-        <w:rPr>
-          <w:b/>
-          <w:bCs/>
-        </w:rPr>
-        <w:t xml:space="preserve"> Fijo:</w:t>
-      </w:r>
-      <w:r>
-        <w:t xml:space="preserve"> El menú lateral permite saltar entre la biblioteca y la cola de espera sin detener la música que esté sonando.</w:t>
-      </w:r>
-    </w:p>
-    <w:p>
-      <w:proofErr w:type="spellStart"/>
-      <w:r>
-        <w:rPr>
-          <w:b/>
-          <w:bCs/>
-        </w:rPr>
-        <w:t>Feedback</w:t>
-      </w:r>
-      <w:proofErr w:type="spellEnd"/>
-      <w:r>
-        <w:rPr>
-          <w:b/>
-          <w:bCs/>
-        </w:rPr>
-        <w:t xml:space="preserve"> Visual:</w:t>
-      </w:r>
-      <w:r>
-        <w:t xml:space="preserve"> Se han implementado estados de "Cargando" y notificaciones de éxito cuando una canción se añade correctamente a la lista.</w:t>
-      </w:r>
-    </w:p>
-    <w:p>
-      <w:r>
-        <w:t xml:space="preserve">Un ejemplo visual de la interfaz </w:t>
-      </w:r>
-      <w:r>
-        <w:t>sería</w:t>
-      </w:r>
-      <w:r>
-        <w:t xml:space="preserve"> el que veremos a continuación</w:t>
-      </w:r>
-    </w:p>
-    <w:p/>
-    <w:p>
-      <w:pPr>
         <w:jc w:val="center"/>
       </w:pPr>
       <w:r>
+        <w:rPr>
+          <w:noProof/>
+        </w:rPr>
         <w:drawing>
           <wp:inline distT="0" distB="0" distL="0" distR="0" wp14:anchorId="66D345C5" wp14:editId="4D73157F">
             <wp:extent cx="3763311" cy="1587813"/>
@@ -5500,15 +6279,7 @@
     </w:p>
     <w:p>
       <w:r>
-        <w:t xml:space="preserve">En la siguiente imagen se observará la interfaz completa de una sola pagina donde se ve mediante </w:t>
-      </w:r>
-      <w:proofErr w:type="spellStart"/>
-      <w:r>
-        <w:t>tabs</w:t>
-      </w:r>
-      <w:proofErr w:type="spellEnd"/>
-      <w:r>
-        <w:t xml:space="preserve"> tanto la biblioteca con un buscador y un input para el alias como la gestión de colas de reproducción.</w:t>
+        <w:t>En la siguiente imagen se observará la interfaz completa de una sola pagina donde se ve mediante tabs tanto la biblioteca con un buscador y un input para el alias como la gestión de colas de reproducción.</w:t>
       </w:r>
     </w:p>
     <w:p>
@@ -5522,6 +6293,9 @@
         <w:jc w:val="center"/>
       </w:pPr>
       <w:r>
+        <w:rPr>
+          <w:noProof/>
+        </w:rPr>
         <w:lastRenderedPageBreak/>
         <w:drawing>
           <wp:inline distT="0" distB="0" distL="0" distR="0" wp14:anchorId="034EB45C" wp14:editId="65FA135D">
@@ -5565,6 +6339,9 @@
         <w:jc w:val="center"/>
       </w:pPr>
       <w:r>
+        <w:rPr>
+          <w:noProof/>
+        </w:rPr>
         <w:drawing>
           <wp:inline distT="0" distB="0" distL="0" distR="0" wp14:anchorId="61A2DC37" wp14:editId="4A8D675C">
             <wp:extent cx="4608999" cy="4433398"/>
@@ -5607,6 +6384,9 @@
         <w:jc w:val="center"/>
       </w:pPr>
       <w:r>
+        <w:rPr>
+          <w:noProof/>
+        </w:rPr>
         <w:lastRenderedPageBreak/>
         <w:drawing>
           <wp:inline distT="0" distB="0" distL="0" distR="0" wp14:anchorId="7F8FB8C3" wp14:editId="1A48D341">
@@ -5648,6 +6428,9 @@
     <w:p/>
     <w:p>
       <w:r>
+        <w:rPr>
+          <w:noProof/>
+        </w:rPr>
         <w:drawing>
           <wp:inline distT="0" distB="0" distL="0" distR="0" wp14:anchorId="08971CF6" wp14:editId="73F1D394">
             <wp:extent cx="5400040" cy="1096010"/>
@@ -5687,6 +6470,9 @@
     </w:p>
     <w:p>
       <w:r>
+        <w:rPr>
+          <w:noProof/>
+        </w:rPr>
         <w:drawing>
           <wp:inline distT="0" distB="0" distL="0" distR="0" wp14:anchorId="01181744" wp14:editId="646C9B7F">
             <wp:extent cx="5400040" cy="2386330"/>
@@ -5738,66 +6524,43 @@
       <w:pPr>
         <w:pStyle w:val="Ttulo1"/>
       </w:pPr>
-      <w:r>
+      <w:bookmarkStart w:id="29" w:name="_Toc227779323"/>
+      <w:r>
+        <w:t>13. Conectividad e Infraestructura de Comunicación</w:t>
+      </w:r>
+      <w:bookmarkEnd w:id="29"/>
+    </w:p>
+    <w:p/>
+    <w:p>
+      <w:r>
+        <w:t>La robustez de "Kantabile" reside en la comunicación eficiente entre sus distintos componentes. A continuación, se describen los niveles de conectividad implementados:</w:t>
+      </w:r>
+    </w:p>
+    <w:p>
+      <w:pPr>
+        <w:pStyle w:val="Ttulo2"/>
+      </w:pPr>
+      <w:bookmarkStart w:id="30" w:name="_Toc227779324"/>
+      <w:r>
+        <w:rPr>
+          <w:rStyle w:val="Ttulo2Car"/>
+        </w:rPr>
         <w:t>13</w:t>
       </w:r>
       <w:r>
-        <w:t>. Conectividad e Infraestructura de Comunicación</w:t>
-      </w:r>
-    </w:p>
-    <w:p/>
-    <w:p>
-      <w:r>
-        <w:t>La robustez de "</w:t>
-      </w:r>
-      <w:proofErr w:type="spellStart"/>
-      <w:r>
-        <w:t>Kantabile</w:t>
-      </w:r>
-      <w:proofErr w:type="spellEnd"/>
-      <w:r>
-        <w:t>" reside en la comunicación eficiente entre sus distintos componentes. A continuación, se describen los niveles de conectividad implementados:</w:t>
-      </w:r>
-    </w:p>
-    <w:p>
-      <w:pPr>
-        <w:pStyle w:val="Ttulo2"/>
-      </w:pPr>
-      <w:r>
         <w:rPr>
           <w:rStyle w:val="Ttulo2Car"/>
         </w:rPr>
-        <w:t>13</w:t>
-      </w:r>
-      <w:r>
-        <w:rPr>
-          <w:rStyle w:val="Ttulo2Car"/>
-        </w:rPr>
         <w:t>.1. Comunicación Cliente-Servidor (HTTP/API</w:t>
       </w:r>
       <w:r>
         <w:t>)</w:t>
       </w:r>
-    </w:p>
-    <w:p>
-      <w:r>
-        <w:t xml:space="preserve">La interacción entre el </w:t>
-      </w:r>
-      <w:proofErr w:type="spellStart"/>
-      <w:r>
-        <w:t>front-end</w:t>
-      </w:r>
-      <w:proofErr w:type="spellEnd"/>
-      <w:r>
-        <w:t xml:space="preserve"> (navegador) y el back-</w:t>
-      </w:r>
-      <w:proofErr w:type="spellStart"/>
-      <w:r>
-        <w:t>end</w:t>
-      </w:r>
-      <w:proofErr w:type="spellEnd"/>
-      <w:r>
-        <w:t xml:space="preserve"> (PHP) se basa en el protocolo HTTP. Se han utilizado peticiones asíncronas para las siguientes tareas:</w:t>
+      <w:bookmarkEnd w:id="30"/>
+    </w:p>
+    <w:p>
+      <w:r>
+        <w:t>La interacción entre el front-end (navegador) y el back-end (PHP) se basa en el protocolo HTTP. Se han utilizado peticiones asíncronas para las siguientes tareas:</w:t>
       </w:r>
     </w:p>
     <w:p>
@@ -5840,9 +6603,14 @@
       <w:pPr>
         <w:pStyle w:val="Ttulo2"/>
       </w:pPr>
-      <w:r>
-        <w:t>4.2. Gestión de Recursos Multimedia</w:t>
-      </w:r>
+      <w:bookmarkStart w:id="31" w:name="_Toc227779325"/>
+      <w:r>
+        <w:t>13</w:t>
+      </w:r>
+      <w:r>
+        <w:t>.2. Gestión de Recursos Multimedia</w:t>
+      </w:r>
+      <w:bookmarkEnd w:id="31"/>
     </w:p>
     <w:p/>
     <w:p>
@@ -5898,9 +6666,14 @@
       <w:pPr>
         <w:pStyle w:val="Ttulo2"/>
       </w:pPr>
-      <w:r>
-        <w:t>4.3. Conectividad entre Contextos</w:t>
-      </w:r>
+      <w:bookmarkStart w:id="32" w:name="_Toc227779326"/>
+      <w:r>
+        <w:t>13</w:t>
+      </w:r>
+      <w:r>
+        <w:t>.3. Conectividad entre Contextos</w:t>
+      </w:r>
+      <w:bookmarkEnd w:id="32"/>
     </w:p>
     <w:p/>
     <w:p>
@@ -5929,15 +6702,7 @@
         <w:t>Sincronismo:</w:t>
       </w:r>
       <w:r>
-        <w:t xml:space="preserve"> El objeto </w:t>
-      </w:r>
-      <w:proofErr w:type="spellStart"/>
-      <w:r>
-        <w:t>window.open</w:t>
-      </w:r>
-      <w:proofErr w:type="spellEnd"/>
-      <w:r>
-        <w:t xml:space="preserve"> permite que la ventana maestra actúe como servidor de contenidos y la ventana esclava como receptor de renderizado, asegurando que la letra se vea exactamente igual en ambas pantallas sin desfase.</w:t>
+        <w:t xml:space="preserve"> El objeto window.open permite que la ventana maestra actúe como servidor de contenidos y la ventana esclava como receptor de renderizado, asegurando que la letra se vea exactamente igual en ambas pantallas sin desfase.</w:t>
       </w:r>
     </w:p>
     <w:p/>
@@ -13059,6 +13824,7 @@
   <w:style w:type="character" w:default="1" w:styleId="Fuentedeprrafopredeter">
     <w:name w:val="Default Paragraph Font"/>
     <w:uiPriority w:val="1"/>
+    <w:semiHidden/>
     <w:unhideWhenUsed/>
   </w:style>
   <w:style w:type="table" w:default="1" w:styleId="Tablanormal">

</xml_diff>

<commit_message>
Ampliacion de memoria explicacion sobre workflows en servidor
</commit_message>
<xml_diff>
--- a/Adrian_Eduardo.docx
+++ b/Adrian_Eduardo.docx
@@ -3528,21 +3528,7 @@
                 <w:rStyle w:val="Hipervnculo"/>
                 <w:noProof/>
               </w:rPr>
-              <w:t>14. Manual d</w:t>
-            </w:r>
-            <w:r>
-              <w:rPr>
-                <w:rStyle w:val="Hipervnculo"/>
-                <w:noProof/>
-              </w:rPr>
-              <w:t>e</w:t>
-            </w:r>
-            <w:r>
-              <w:rPr>
-                <w:rStyle w:val="Hipervnculo"/>
-                <w:noProof/>
-              </w:rPr>
-              <w:t xml:space="preserve"> incorporación de canciones al sistema de karaoke</w:t>
+              <w:t>14. Manual de incorporación de canciones al sistema de karaoke</w:t>
             </w:r>
             <w:r>
               <w:rPr>
@@ -3793,7 +3779,7 @@
                 <w:noProof/>
                 <w:webHidden/>
               </w:rPr>
-              <w:t>20</w:t>
+              <w:t>21</w:t>
             </w:r>
             <w:r>
               <w:rPr>
@@ -3863,7 +3849,7 @@
                 <w:noProof/>
                 <w:webHidden/>
               </w:rPr>
-              <w:t>21</w:t>
+              <w:t>25</w:t>
             </w:r>
             <w:r>
               <w:rPr>
@@ -3933,7 +3919,7 @@
                 <w:noProof/>
                 <w:webHidden/>
               </w:rPr>
-              <w:t>22</w:t>
+              <w:t>26</w:t>
             </w:r>
             <w:r>
               <w:rPr>
@@ -4003,7 +3989,7 @@
                 <w:noProof/>
                 <w:webHidden/>
               </w:rPr>
-              <w:t>22</w:t>
+              <w:t>27</w:t>
             </w:r>
             <w:r>
               <w:rPr>
@@ -7190,418 +7176,313 @@
     <w:p/>
     <w:p>
       <w:pPr>
-        <w:pStyle w:val="Ttulo1"/>
-      </w:pPr>
-      <w:bookmarkStart w:id="33" w:name="_Toc231392589"/>
-      <w:r>
-        <w:t>14. Manual de incorporación de canciones al sistema de karaoke</w:t>
-      </w:r>
-      <w:bookmarkEnd w:id="33"/>
+        <w:pStyle w:val="Ttulo2"/>
+      </w:pPr>
+      <w:r>
+        <w:t>13.4. Automatización de Infraestructura y Despliegue Continuo (CI/CD)</w:t>
+      </w:r>
     </w:p>
     <w:p/>
     <w:p>
-      <w:r>
-        <w:t>Este documento describe el procedimiento completo para añadir una nueva canción al catálogo del sistema de karaoke. El proceso incluye la obtención de la canción original, la generación de las pistas de audio necesarias, la sincronización de la letra y la carga final de todos los archivos en el panel de administración.</w:t>
-      </w:r>
-    </w:p>
-    <w:p>
-      <w:r>
+      <w:pPr>
+        <w:rPr>
+          <w:lang w:eastAsia="es-ES"/>
+        </w:rPr>
+      </w:pPr>
+      <w:r>
+        <w:rPr>
+          <w:lang w:eastAsia="es-ES"/>
+        </w:rPr>
+        <w:t>Una vez que la aplicación web funciona y las distintas pantallas se comunican entre sí, el siguiente reto ha sido garantizar que el sistema sea fácil de mantener, seguro y que esté siempre actualizado sin necesidad de hacer trabajos manuales repetitivos.</w:t>
+      </w:r>
+    </w:p>
+    <w:p>
+      <w:pPr>
+        <w:rPr>
+          <w:lang w:eastAsia="es-ES"/>
+        </w:rPr>
+      </w:pPr>
+      <w:r>
+        <w:rPr>
+          <w:lang w:eastAsia="es-ES"/>
+        </w:rPr>
+        <w:t xml:space="preserve">En los proyectos web tradicionales, cuando los desarrolladores hacen un cambio en el código, tienen que subir los archivos modificados uno a uno al servidor de internet utilizando programas de envío manual (como los clientes FTP). Este método antiguo </w:t>
+      </w:r>
+      <w:r>
+        <w:rPr>
+          <w:lang w:eastAsia="es-ES"/>
+        </w:rPr>
         <w:lastRenderedPageBreak/>
-        <w:t>Es importante seguir cada uno de los pasos descritos para garantizar que la canción se reproduzca correctamente y que la letra aparezca sincronizada durante la interpretación.</w:t>
-      </w:r>
-    </w:p>
-    <w:p>
-      <w:pPr>
-        <w:pStyle w:val="Ttulo2"/>
-      </w:pPr>
-      <w:bookmarkStart w:id="34" w:name="_Toc231392590"/>
-      <w:r>
-        <w:t>14.1. Paso 1. Obtención de la canción</w:t>
-      </w:r>
-      <w:bookmarkEnd w:id="34"/>
+        <w:t>tiene dos grandes problemas para cualquier organización: por un lado, es muy fácil cometer un error humano y olvidar subir un archivo, lo que rompería la página; y por otro lado, mientras se copian los archivos, la web puede dejar de funcionar temporalmente para los usuarios.</w:t>
+      </w:r>
+    </w:p>
+    <w:p>
+      <w:pPr>
+        <w:rPr>
+          <w:lang w:eastAsia="es-ES"/>
+        </w:rPr>
+      </w:pPr>
+      <w:r>
+        <w:rPr>
+          <w:lang w:eastAsia="es-ES"/>
+        </w:rPr>
+        <w:t xml:space="preserve">Para evitar estos fallos y trabajar como se hace actualmente en las empresas tecnológicas, hemos </w:t>
+      </w:r>
+      <w:r>
+        <w:rPr>
+          <w:lang w:eastAsia="es-ES"/>
+        </w:rPr>
+        <w:t xml:space="preserve">decidido </w:t>
+      </w:r>
+      <w:r>
+        <w:rPr>
+          <w:lang w:eastAsia="es-ES"/>
+        </w:rPr>
+        <w:t>crea</w:t>
+      </w:r>
+      <w:r>
+        <w:rPr>
+          <w:lang w:eastAsia="es-ES"/>
+        </w:rPr>
+        <w:t>r</w:t>
+      </w:r>
+      <w:r>
+        <w:rPr>
+          <w:lang w:eastAsia="es-ES"/>
+        </w:rPr>
+        <w:t xml:space="preserve"> un sistema de </w:t>
+      </w:r>
+      <w:r>
+        <w:rPr>
+          <w:b/>
+          <w:bCs/>
+          <w:lang w:eastAsia="es-ES"/>
+        </w:rPr>
+        <w:t>automatización del mantenimiento</w:t>
+      </w:r>
+      <w:r>
+        <w:rPr>
+          <w:lang w:eastAsia="es-ES"/>
+        </w:rPr>
+        <w:t>. Esto significa que el servidor se cuida y se actualiza de forma autónoma gracias a dos herramientas:</w:t>
+      </w:r>
+    </w:p>
+    <w:p>
+      <w:pPr>
+        <w:rPr>
+          <w:lang w:eastAsia="es-ES"/>
+        </w:rPr>
+      </w:pPr>
+      <w:r>
+        <w:rPr>
+          <w:lang w:eastAsia="es-ES"/>
+        </w:rPr>
+        <w:t xml:space="preserve">Un sistema de </w:t>
+      </w:r>
+      <w:r>
+        <w:rPr>
+          <w:b/>
+          <w:bCs/>
+          <w:lang w:eastAsia="es-ES"/>
+        </w:rPr>
+        <w:t>Actualización Continua (mediante GitHub Actions)</w:t>
+      </w:r>
+      <w:r>
+        <w:rPr>
+          <w:lang w:eastAsia="es-ES"/>
+        </w:rPr>
+        <w:t>: Cada vez que los programadores guardan una versión terminada en su repositorio de trabajo, el servidor de internet detecta el cambio, descarga las novedades de forma automática en pocos segundos y las aplica sin que la web deje de estar disponible.</w:t>
+      </w:r>
+    </w:p>
+    <w:p>
+      <w:pPr>
+        <w:rPr>
+          <w:lang w:eastAsia="es-ES"/>
+        </w:rPr>
+      </w:pPr>
+      <w:r>
+        <w:rPr>
+          <w:lang w:eastAsia="es-ES"/>
+        </w:rPr>
+        <w:t xml:space="preserve">Un sistema de </w:t>
+      </w:r>
+      <w:r>
+        <w:rPr>
+          <w:b/>
+          <w:bCs/>
+          <w:lang w:eastAsia="es-ES"/>
+        </w:rPr>
+        <w:t>Mantenimiento de Permisos (mediante Cron Jobs)</w:t>
+      </w:r>
+      <w:r>
+        <w:rPr>
+          <w:lang w:eastAsia="es-ES"/>
+        </w:rPr>
+        <w:t>: Una tarea invisible que se ejecuta sola en el servidor cada cierto tiempo para revisar que las carpetas de las canciones y los archivos multimedia tengan los permisos correctos. Esto evita que la aplicación falle cuando un usuario intenta subir música nueva.</w:t>
+      </w:r>
+    </w:p>
+    <w:p>
+      <w:r>
+        <w:t>Para lograr que el servidor se actualice solo cada vez que guardamos el trabajo, no hace falta instalar programas complejos en el servidor. Todo se gestiona creando un canal de comunicación seguro entre nuestro almacén de código (GitHub) y el ordenador donde está alojada la web (el servidor de producción).</w:t>
+      </w:r>
+    </w:p>
+    <w:p>
+      <w:pPr>
+        <w:rPr>
+          <w:lang w:eastAsia="es-ES"/>
+        </w:rPr>
+      </w:pPr>
+      <w:r>
+        <w:t>El proceso que hemos seguido para ponerlo en marcha se resume en tres pasos:</w:t>
+      </w:r>
+    </w:p>
+    <w:p>
+      <w:pPr>
+        <w:pStyle w:val="Ttulo3"/>
+      </w:pPr>
+    </w:p>
+    <w:p>
+      <w:pPr>
+        <w:pStyle w:val="Ttulo3"/>
+      </w:pPr>
+      <w:r>
+        <w:t>13.4.1</w:t>
+      </w:r>
+      <w:r>
+        <w:t xml:space="preserve"> Crear la "hoja de instrucciones" (</w:t>
+      </w:r>
+      <w:r>
+        <w:rPr>
+          <w:rStyle w:val="CdigoHTML"/>
+          <w:rFonts w:asciiTheme="majorHAnsi" w:eastAsiaTheme="majorEastAsia" w:hAnsiTheme="majorHAnsi" w:cstheme="majorBidi"/>
+          <w:sz w:val="24"/>
+          <w:szCs w:val="24"/>
+        </w:rPr>
+        <w:t>main.yml</w:t>
+      </w:r>
+      <w:r>
+        <w:t>)</w:t>
+      </w:r>
     </w:p>
     <w:p/>
     <w:p>
       <w:r>
-        <w:t>El primer paso consiste en obtener la canción que se desea incorporar al sistema.</w:t>
-      </w:r>
-    </w:p>
-    <w:p>
-      <w:pPr>
-        <w:rPr>
-          <w:b/>
-          <w:bCs/>
-        </w:rPr>
-      </w:pPr>
-      <w:r>
-        <w:rPr>
-          <w:b/>
-          <w:bCs/>
-        </w:rPr>
-        <w:t>Requisitos del archivo</w:t>
-      </w:r>
-    </w:p>
-    <w:p>
-      <w:pPr>
-        <w:pStyle w:val="Prrafodelista"/>
-        <w:numPr>
-          <w:ilvl w:val="0"/>
-          <w:numId w:val="2"/>
-        </w:numPr>
-      </w:pPr>
-      <w:r>
-        <w:t>La canción debe estar disponible en formato MP3.</w:t>
-      </w:r>
-    </w:p>
-    <w:p>
-      <w:pPr>
-        <w:pStyle w:val="Prrafodelista"/>
-        <w:numPr>
-          <w:ilvl w:val="0"/>
-          <w:numId w:val="2"/>
-        </w:numPr>
-      </w:pPr>
-      <w:r>
-        <w:t>Debe tratarse de una versión completa y de buena calidad.</w:t>
-      </w:r>
-    </w:p>
-    <w:p>
-      <w:pPr>
-        <w:pStyle w:val="Prrafodelista"/>
-        <w:numPr>
-          <w:ilvl w:val="0"/>
-          <w:numId w:val="2"/>
-        </w:numPr>
-      </w:pPr>
-      <w:r>
-        <w:t>Se recomienda utilizar un archivo con una tasa de bits adecuada para garantizar una correcta reproducción.</w:t>
-      </w:r>
-    </w:p>
-    <w:p/>
-    <w:p>
-      <w:pPr>
-        <w:rPr>
-          <w:b/>
-          <w:bCs/>
-        </w:rPr>
-      </w:pPr>
-      <w:r>
-        <w:rPr>
-          <w:b/>
-          <w:bCs/>
-        </w:rPr>
-        <w:t>Verificaciones previas</w:t>
-      </w:r>
-    </w:p>
-    <w:p>
-      <w:r>
-        <w:t>Antes de continuar con el proceso:</w:t>
-      </w:r>
-    </w:p>
-    <w:p>
-      <w:pPr>
-        <w:pStyle w:val="Prrafodelista"/>
-        <w:numPr>
-          <w:ilvl w:val="0"/>
-          <w:numId w:val="3"/>
-        </w:numPr>
-      </w:pPr>
-      <w:r>
-        <w:t>Comprobar que el archivo se reproduce correctamente.</w:t>
-      </w:r>
-    </w:p>
-    <w:p>
-      <w:pPr>
-        <w:pStyle w:val="Prrafodelista"/>
-        <w:numPr>
-          <w:ilvl w:val="0"/>
-          <w:numId w:val="3"/>
-        </w:numPr>
-      </w:pPr>
-      <w:r>
-        <w:t>Verificar que la canción corresponde exactamente a la versión que se desea publicar.</w:t>
-      </w:r>
-    </w:p>
-    <w:p>
-      <w:pPr>
-        <w:pStyle w:val="Prrafodelista"/>
-        <w:numPr>
-          <w:ilvl w:val="0"/>
-          <w:numId w:val="3"/>
-        </w:numPr>
-      </w:pPr>
-      <w:r>
-        <w:t>Confirmar que el título y el artista son correctos.</w:t>
-      </w:r>
-    </w:p>
-    <w:p>
-      <w:r>
-        <w:t>Una vez validado el archivo MP3, se puede proceder al procesamiento de audio.</w:t>
-      </w:r>
-    </w:p>
-    <w:p>
-      <w:pPr>
-        <w:pStyle w:val="Ttulo2"/>
-      </w:pPr>
-      <w:bookmarkStart w:id="35" w:name="_Toc231392591"/>
-      <w:r>
-        <w:t>14.2. Paso 2. Procesamiento de audio con Moises</w:t>
-      </w:r>
-      <w:bookmarkEnd w:id="35"/>
-    </w:p>
-    <w:p/>
-    <w:p>
-      <w:r>
-        <w:t xml:space="preserve">Una vez obtenida la canción original, se utiliza la plataforma </w:t>
-      </w:r>
-      <w:r>
-        <w:rPr>
-          <w:b/>
-          <w:bCs/>
-        </w:rPr>
-        <w:t>Moises</w:t>
-      </w:r>
-      <w:r>
-        <w:t xml:space="preserve"> para separar las distintas pistas de audio necesarias para el funcionamiento del karaoke.</w:t>
-      </w:r>
-    </w:p>
-    <w:p>
-      <w:pPr>
-        <w:rPr>
-          <w:b/>
-          <w:bCs/>
-        </w:rPr>
-      </w:pPr>
-      <w:r>
-        <w:rPr>
-          <w:b/>
-          <w:bCs/>
-        </w:rPr>
-        <w:t>Objetivo</w:t>
-      </w:r>
-    </w:p>
-    <w:p>
-      <w:r>
-        <w:t>El objetivo de este paso es generar las pistas que utilizará posteriormente el sistema:</w:t>
-      </w:r>
-    </w:p>
-    <w:p>
-      <w:pPr>
-        <w:pStyle w:val="Prrafodelista"/>
-        <w:numPr>
-          <w:ilvl w:val="0"/>
-          <w:numId w:val="4"/>
-        </w:numPr>
-      </w:pPr>
-      <w:r>
-        <w:t>Pista instrumental.</w:t>
-      </w:r>
-    </w:p>
-    <w:p>
-      <w:pPr>
-        <w:pStyle w:val="Prrafodelista"/>
-        <w:numPr>
-          <w:ilvl w:val="0"/>
-          <w:numId w:val="4"/>
-        </w:numPr>
-      </w:pPr>
-      <w:r>
-        <w:t>Pista de voz.</w:t>
-      </w:r>
-    </w:p>
-    <w:p>
-      <w:pPr>
-        <w:pStyle w:val="Prrafodelista"/>
-        <w:numPr>
-          <w:ilvl w:val="0"/>
-          <w:numId w:val="4"/>
-        </w:numPr>
-      </w:pPr>
-      <w:r>
-        <w:t>Canción completa.</w:t>
-      </w:r>
-    </w:p>
-    <w:p/>
-    <w:p>
-      <w:r>
-        <w:rPr>
-          <w:b/>
-          <w:bCs/>
-        </w:rPr>
-        <w:t>Procedimiento</w:t>
-      </w:r>
-    </w:p>
-    <w:p>
-      <w:pPr>
-        <w:pStyle w:val="Prrafodelista"/>
-        <w:numPr>
-          <w:ilvl w:val="0"/>
-          <w:numId w:val="5"/>
-        </w:numPr>
-      </w:pPr>
-      <w:r>
-        <w:t xml:space="preserve">Acceder a la plataforma </w:t>
-      </w:r>
-      <w:r>
-        <w:rPr>
-          <w:b/>
-          <w:bCs/>
-        </w:rPr>
-        <w:t>Moises</w:t>
-      </w:r>
-      <w:r>
+        <w:t xml:space="preserve">Lo primero que se hace es crear una carpeta especial en la raíz de nuestro proyecto llamada </w:t>
+      </w:r>
+      <w:r>
+        <w:rPr>
+          <w:rStyle w:val="CdigoHTML"/>
+          <w:rFonts w:eastAsiaTheme="minorHAnsi"/>
+        </w:rPr>
         <w:t>.</w:t>
       </w:r>
-    </w:p>
-    <w:p>
-      <w:pPr>
-        <w:pStyle w:val="Prrafodelista"/>
-        <w:numPr>
-          <w:ilvl w:val="0"/>
-          <w:numId w:val="5"/>
-        </w:numPr>
-      </w:pPr>
-      <w:r>
-        <w:t>Iniciar sesión con la cuenta correspondiente.</w:t>
-      </w:r>
-    </w:p>
-    <w:p>
-      <w:pPr>
-        <w:pStyle w:val="Prrafodelista"/>
-        <w:numPr>
-          <w:ilvl w:val="0"/>
-          <w:numId w:val="5"/>
-        </w:numPr>
-      </w:pPr>
-      <w:r>
-        <w:t>Crear un nuevo proyecto o carga de audio.</w:t>
-      </w:r>
-    </w:p>
-    <w:p>
-      <w:pPr>
-        <w:pStyle w:val="Prrafodelista"/>
-        <w:numPr>
-          <w:ilvl w:val="0"/>
-          <w:numId w:val="5"/>
-        </w:numPr>
-      </w:pPr>
-      <w:r>
-        <w:t>Subir el archivo MP3 de la canción.</w:t>
-      </w:r>
-    </w:p>
-    <w:p>
-      <w:pPr>
-        <w:pStyle w:val="Prrafodelista"/>
-        <w:numPr>
-          <w:ilvl w:val="0"/>
-          <w:numId w:val="5"/>
-        </w:numPr>
-      </w:pPr>
-      <w:r>
-        <w:t xml:space="preserve">Esperar a que </w:t>
-      </w:r>
-      <w:r>
-        <w:rPr>
-          <w:b/>
-          <w:bCs/>
-        </w:rPr>
-        <w:t>Moises</w:t>
-      </w:r>
-      <w:r>
-        <w:t xml:space="preserve"> complete el análisis y la separación de pistas.</w:t>
-      </w:r>
-    </w:p>
-    <w:p/>
-    <w:p>
-      <w:pPr>
-        <w:rPr>
-          <w:b/>
-          <w:bCs/>
-        </w:rPr>
-      </w:pPr>
-      <w:r>
-        <w:rPr>
-          <w:b/>
-          <w:bCs/>
-        </w:rPr>
-        <w:t>Descarga de archivos</w:t>
-      </w:r>
-    </w:p>
-    <w:p>
-      <w:r>
-        <w:t xml:space="preserve">Una vez finalizado el procesamiento, </w:t>
-      </w:r>
-      <w:r>
-        <w:rPr>
-          <w:b/>
-          <w:bCs/>
-        </w:rPr>
-        <w:t>Moises</w:t>
-      </w:r>
-      <w:r>
-        <w:t xml:space="preserve"> generará varios archivos.</w:t>
-      </w:r>
-    </w:p>
-    <w:p>
-      <w:r>
-        <w:lastRenderedPageBreak/>
-        <w:t>Se deben descargar los archivos generados utilizando siempre el formato estándar configurado en la plataforma.</w:t>
-      </w:r>
-    </w:p>
-    <w:p>
-      <w:pPr>
-        <w:jc w:val="left"/>
-      </w:pPr>
-    </w:p>
-    <w:p>
-      <w:r>
-        <w:t>Los archivos que se utilizarán posteriormente son:</w:t>
-      </w:r>
-    </w:p>
-    <w:p>
-      <w:pPr>
-        <w:pStyle w:val="Prrafodelista"/>
-        <w:numPr>
-          <w:ilvl w:val="0"/>
-          <w:numId w:val="6"/>
-        </w:numPr>
-      </w:pPr>
-      <w:r>
-        <w:t>Archivo de voz.</w:t>
-      </w:r>
-    </w:p>
-    <w:p>
-      <w:pPr>
-        <w:pStyle w:val="Prrafodelista"/>
-        <w:numPr>
-          <w:ilvl w:val="0"/>
-          <w:numId w:val="6"/>
-        </w:numPr>
-      </w:pPr>
-      <w:r>
-        <w:t>Archivo instrumental.</w:t>
-      </w:r>
-    </w:p>
-    <w:p>
-      <w:pPr>
-        <w:pStyle w:val="Prrafodelista"/>
-        <w:numPr>
-          <w:ilvl w:val="0"/>
-          <w:numId w:val="6"/>
-        </w:numPr>
-      </w:pPr>
-      <w:r>
-        <w:t>Archivo de canción completa.</w:t>
-      </w:r>
-    </w:p>
-    <w:p/>
-    <w:p>
+      <w:r>
+        <w:t>github</w:t>
+      </w:r>
+      <w:r>
+        <w:t xml:space="preserve"> y, dentro de ella, otra llamada </w:t>
+      </w:r>
+      <w:r>
+        <w:t xml:space="preserve">workflows. </w:t>
+      </w:r>
+      <w:r>
+        <w:t xml:space="preserve">Ahí dentro es donde guardamos un archivo de texto con extensión </w:t>
+      </w:r>
+      <w:r>
+        <w:rPr>
+          <w:rStyle w:val="CdigoHTML"/>
+          <w:rFonts w:eastAsiaTheme="minorHAnsi"/>
+        </w:rPr>
+        <w:t>.</w:t>
+      </w:r>
+      <w:r>
+        <w:t xml:space="preserve">yml </w:t>
+      </w:r>
+      <w:r>
+        <w:t>(normalmente llamado</w:t>
+      </w:r>
+      <w:r>
+        <w:t xml:space="preserve"> main.yml</w:t>
+      </w:r>
+      <w:r>
+        <w:t>).</w:t>
+      </w:r>
+    </w:p>
+    <w:p>
+      <w:r>
+        <w:t xml:space="preserve">Este archivo no contiene código de la página web (no es PHP ni JavaScript), sino que es una </w:t>
+      </w:r>
+      <w:r>
+        <w:rPr>
+          <w:b/>
+          <w:bCs/>
+        </w:rPr>
+        <w:t>lista de tareas ordenadas</w:t>
+      </w:r>
+      <w:r>
+        <w:t xml:space="preserve"> escritas en un formato muy limpio que GitHub sabe leer. Es, literalmente, el manual de instrucciones que seguirá GitHub de forma automática.</w:t>
+      </w:r>
+    </w:p>
+    <w:p>
+      <w:pPr>
+        <w:jc w:val="center"/>
+      </w:pPr>
+    </w:p>
+    <w:p>
+      <w:pPr>
+        <w:jc w:val="center"/>
+      </w:pPr>
+    </w:p>
+    <w:p>
+      <w:pPr>
+        <w:jc w:val="center"/>
+      </w:pPr>
+    </w:p>
+    <w:p>
+      <w:pPr>
+        <w:jc w:val="center"/>
+      </w:pPr>
+    </w:p>
+    <w:p>
+      <w:pPr>
+        <w:jc w:val="center"/>
+      </w:pPr>
+    </w:p>
+    <w:p>
+      <w:pPr>
+        <w:jc w:val="center"/>
+      </w:pPr>
+    </w:p>
+    <w:p>
+      <w:pPr>
+        <w:jc w:val="center"/>
+      </w:pPr>
+    </w:p>
+    <w:p>
+      <w:pPr>
+        <w:jc w:val="center"/>
+      </w:pPr>
+    </w:p>
+    <w:p>
+      <w:pPr>
+        <w:jc w:val="center"/>
+      </w:pPr>
+    </w:p>
+    <w:p>
+      <w:pPr>
+        <w:jc w:val="center"/>
+      </w:pPr>
+    </w:p>
+    <w:p>
+      <w:pPr>
+        <w:jc w:val="center"/>
+      </w:pPr>
       <w:r>
         <w:drawing>
-          <wp:inline distT="0" distB="0" distL="0" distR="0" wp14:anchorId="7616793C" wp14:editId="20632559">
-            <wp:extent cx="5399985" cy="2830665"/>
-            <wp:effectExtent l="0" t="0" r="0" b="8255"/>
-            <wp:docPr id="6" name="Imagen 6"/>
+          <wp:inline distT="0" distB="0" distL="0" distR="0" wp14:anchorId="3A38C1B2" wp14:editId="6BFA00B1">
+            <wp:extent cx="2949337" cy="4058932"/>
+            <wp:effectExtent l="0" t="0" r="3810" b="0"/>
+            <wp:docPr id="18" name="Imagen 18"/>
             <wp:cNvGraphicFramePr>
               <a:graphicFrameLocks xmlns:a="http://schemas.openxmlformats.org/drawingml/2006/main" noChangeAspect="1"/>
             </wp:cNvGraphicFramePr>
@@ -7621,7 +7502,7 @@
                   <pic:spPr>
                     <a:xfrm>
                       <a:off x="0" y="0"/>
-                      <a:ext cx="5405822" cy="2833725"/>
+                      <a:ext cx="2949337" cy="4058932"/>
                     </a:xfrm>
                     <a:prstGeom prst="rect">
                       <a:avLst/>
@@ -7635,12 +7516,72 @@
       </w:r>
     </w:p>
     <w:p>
-      <w:r>
+      <w:pPr>
+        <w:jc w:val="center"/>
+      </w:pPr>
+    </w:p>
+    <w:p>
+      <w:pPr>
+        <w:jc w:val="center"/>
+      </w:pPr>
+    </w:p>
+    <w:p>
+      <w:pPr>
+        <w:jc w:val="center"/>
+      </w:pPr>
+    </w:p>
+    <w:p>
+      <w:pPr>
+        <w:pStyle w:val="Ttulo3"/>
+      </w:pPr>
+      <w:r>
+        <w:t xml:space="preserve">13.4.2 </w:t>
+      </w:r>
+      <w:r>
+        <w:t>Guardar las contraseñas en secreto (Repository Secrets)</w:t>
+      </w:r>
+    </w:p>
+    <w:p/>
+    <w:p>
+      <w:r>
+        <w:t xml:space="preserve">Como el servidor requiere una contraseña o una llave de seguridad para dejar entrar a alguien a modificar los archivos, no podemos escribir esa contraseña directamente en el archivo </w:t>
+      </w:r>
+      <w:r>
+        <w:t>main.yml</w:t>
+      </w:r>
+      <w:r>
+        <w:t xml:space="preserve"> (porque cualquiera que mirase nuestro código podría verla).</w:t>
+      </w:r>
+    </w:p>
+    <w:p>
+      <w:r>
+        <w:t xml:space="preserve">Para solucionar esto, hemos usado una opción de GitHub llamada </w:t>
+      </w:r>
+      <w:r>
+        <w:t>Secrets</w:t>
+      </w:r>
+      <w:r>
+        <w:t xml:space="preserve"> (Secretos). Hemos guardado de forma oculta los datos de conexión de nuestro servidor (como la dirección IP, el usuario y la contraseña o llave SSH). El archivo </w:t>
+      </w:r>
+      <w:r>
+        <w:t>main.yml</w:t>
+      </w:r>
+      <w:r>
+        <w:t xml:space="preserve"> sabe que tiene que usar esos datos secretos, pero nadie los puede leer desde fuera.</w:t>
+      </w:r>
+    </w:p>
+    <w:p/>
+    <w:p>
+      <w:pPr>
+        <w:jc w:val="center"/>
+      </w:pPr>
+      <w:r>
+        <w:lastRenderedPageBreak/>
         <w:drawing>
-          <wp:inline distT="0" distB="0" distL="0" distR="0" wp14:anchorId="35BB4041" wp14:editId="218A6CBC">
-            <wp:extent cx="5399484" cy="2194560"/>
+          <wp:inline distT="0" distB="0" distL="0" distR="0" wp14:anchorId="0A1A5ECA" wp14:editId="271DE013">
+            <wp:extent cx="5400040" cy="2441575"/>
             <wp:effectExtent l="0" t="0" r="0" b="0"/>
-            <wp:docPr id="21" name="Imagen 21"/>
+            <wp:docPr id="20" name="Imagen 20"/>
             <wp:cNvGraphicFramePr>
               <a:graphicFrameLocks xmlns:a="http://schemas.openxmlformats.org/drawingml/2006/main" noChangeAspect="1"/>
             </wp:cNvGraphicFramePr>
@@ -7660,7 +7601,7 @@
                   <pic:spPr>
                     <a:xfrm>
                       <a:off x="0" y="0"/>
-                      <a:ext cx="5400753" cy="2195076"/>
+                      <a:ext cx="5400040" cy="2441575"/>
                     </a:xfrm>
                     <a:prstGeom prst="rect">
                       <a:avLst/>
@@ -7675,21 +7616,173 @@
     </w:p>
     <w:p/>
     <w:p>
-      <w:r>
-        <w:t xml:space="preserve">         </w:t>
-      </w:r>
-    </w:p>
-    <w:p>
-      <w:r>
-        <w:lastRenderedPageBreak/>
-        <w:t xml:space="preserve"> </w:t>
-      </w:r>
+      <w:pPr>
+        <w:rPr>
+          <w:lang w:eastAsia="es-ES"/>
+        </w:rPr>
+      </w:pPr>
+      <w:r>
+        <w:rPr>
+          <w:lang w:eastAsia="es-ES"/>
+        </w:rPr>
+        <w:t xml:space="preserve">Como se puede observar en la captura de pantalla </w:t>
+      </w:r>
+      <w:r>
+        <w:rPr>
+          <w:lang w:eastAsia="es-ES"/>
+        </w:rPr>
+        <w:t>posterior</w:t>
+      </w:r>
+      <w:r>
+        <w:rPr>
+          <w:lang w:eastAsia="es-ES"/>
+        </w:rPr>
+        <w:t xml:space="preserve">, la pestaña </w:t>
+      </w:r>
+      <w:r>
+        <w:rPr>
+          <w:b/>
+          <w:bCs/>
+          <w:lang w:eastAsia="es-ES"/>
+        </w:rPr>
+        <w:t>"Actions"</w:t>
+      </w:r>
+      <w:r>
+        <w:rPr>
+          <w:lang w:eastAsia="es-ES"/>
+        </w:rPr>
+        <w:t xml:space="preserve"> de nuestro repositorio de GitHub actúa como un diario de abordo del mantenimiento del servidor. Cada fila representa un momento en el que hemos guardado y subido cambios de nuestro código.</w:t>
+      </w:r>
+    </w:p>
+    <w:p>
+      <w:pPr>
+        <w:rPr>
+          <w:lang w:eastAsia="es-ES"/>
+        </w:rPr>
+      </w:pPr>
+      <w:r>
+        <w:rPr>
+          <w:lang w:eastAsia="es-ES"/>
+        </w:rPr>
+        <w:t xml:space="preserve">El símbolo del </w:t>
+      </w:r>
+      <w:r>
+        <w:rPr>
+          <w:b/>
+          <w:bCs/>
+          <w:lang w:eastAsia="es-ES"/>
+        </w:rPr>
+        <w:t>círculo verde con el 'tick'</w:t>
+      </w:r>
+      <w:r>
+        <w:rPr>
+          <w:lang w:eastAsia="es-ES"/>
+        </w:rPr>
+        <w:t xml:space="preserve"> es la confirmación visual de que todo el proceso automático ha funcionado correctamente. Al ver ese indicador</w:t>
+      </w:r>
+      <w:r>
+        <w:rPr>
+          <w:lang w:eastAsia="es-ES"/>
+        </w:rPr>
+        <w:t>, podemos comprobar que:</w:t>
+      </w:r>
+    </w:p>
+    <w:p>
+      <w:pPr>
+        <w:pStyle w:val="Prrafodelista"/>
+        <w:numPr>
+          <w:ilvl w:val="0"/>
+          <w:numId w:val="29"/>
+        </w:numPr>
+        <w:rPr>
+          <w:lang w:eastAsia="es-ES"/>
+        </w:rPr>
+      </w:pPr>
+      <w:r>
+        <w:rPr>
+          <w:lang w:eastAsia="es-ES"/>
+        </w:rPr>
+        <w:t>GitHub detectó nuestro cambio en la rama principal (</w:t>
+      </w:r>
+      <w:r>
+        <w:t>main</w:t>
+      </w:r>
+      <w:r>
+        <w:rPr>
+          <w:lang w:eastAsia="es-ES"/>
+        </w:rPr>
+        <w:t>).</w:t>
+      </w:r>
+    </w:p>
+    <w:p>
+      <w:pPr>
+        <w:pStyle w:val="Prrafodelista"/>
+        <w:numPr>
+          <w:ilvl w:val="0"/>
+          <w:numId w:val="29"/>
+        </w:numPr>
+        <w:rPr>
+          <w:lang w:eastAsia="es-ES"/>
+        </w:rPr>
+      </w:pPr>
+      <w:r>
+        <w:rPr>
+          <w:lang w:eastAsia="es-ES"/>
+        </w:rPr>
+        <w:t>Se conectó de forma segura con el servidor de producción de</w:t>
+      </w:r>
+      <w:r>
+        <w:rPr>
+          <w:lang w:eastAsia="es-ES"/>
+        </w:rPr>
+        <w:t>l proyecto</w:t>
+      </w:r>
+      <w:r>
+        <w:rPr>
+          <w:lang w:eastAsia="es-ES"/>
+        </w:rPr>
+        <w:t>.</w:t>
+      </w:r>
+    </w:p>
+    <w:p>
+      <w:pPr>
+        <w:pStyle w:val="Prrafodelista"/>
+        <w:numPr>
+          <w:ilvl w:val="0"/>
+          <w:numId w:val="29"/>
+        </w:numPr>
+        <w:rPr>
+          <w:lang w:eastAsia="es-ES"/>
+        </w:rPr>
+      </w:pPr>
+      <w:r>
+        <w:rPr>
+          <w:lang w:eastAsia="es-ES"/>
+        </w:rPr>
+        <w:t>Se descargaron las actualizaciones con éxito en el servidor y la web se refrescó en milisegundos.</w:t>
+      </w:r>
+    </w:p>
+    <w:p>
+      <w:pPr>
+        <w:rPr>
+          <w:lang w:eastAsia="es-ES"/>
+        </w:rPr>
+      </w:pPr>
+      <w:r>
+        <w:rPr>
+          <w:lang w:eastAsia="es-ES"/>
+        </w:rPr>
+        <w:t>Si en algún momento hubiéramos cometido un error de sintaxis o de conexión, el círculo se volvería de color rojo, avisándonos de inmediato y deteniendo el proceso para proteger la página web y evitar que se rompa de cara al público.</w:t>
+      </w:r>
+    </w:p>
+    <w:p/>
+    <w:p>
       <w:r>
         <w:drawing>
-          <wp:inline distT="0" distB="0" distL="0" distR="0" wp14:anchorId="799A08F3" wp14:editId="6FC6ACEF">
-            <wp:extent cx="5398962" cy="2767054"/>
-            <wp:effectExtent l="0" t="0" r="0" b="0"/>
-            <wp:docPr id="11" name="Imagen 11"/>
+          <wp:inline distT="0" distB="0" distL="0" distR="0" wp14:anchorId="53BBC25C" wp14:editId="4180B144">
+            <wp:extent cx="5400040" cy="2683510"/>
+            <wp:effectExtent l="0" t="0" r="0" b="2540"/>
+            <wp:docPr id="27" name="Imagen 27"/>
             <wp:cNvGraphicFramePr>
               <a:graphicFrameLocks xmlns:a="http://schemas.openxmlformats.org/drawingml/2006/main" noChangeAspect="1"/>
             </wp:cNvGraphicFramePr>
@@ -7709,7 +7802,7 @@
                   <pic:spPr>
                     <a:xfrm>
                       <a:off x="0" y="0"/>
-                      <a:ext cx="5409260" cy="2772332"/>
+                      <a:ext cx="5400040" cy="2683510"/>
                     </a:xfrm>
                     <a:prstGeom prst="rect">
                       <a:avLst/>
@@ -7723,12 +7816,165 @@
       </w:r>
     </w:p>
     <w:p>
-      <w:r>
+      <w:pPr>
+        <w:pStyle w:val="Ttulo3"/>
+        <w:rPr>
+          <w:u w:val="single"/>
+        </w:rPr>
+      </w:pPr>
+      <w:r>
+        <w:lastRenderedPageBreak/>
+        <w:t>13.4.3</w:t>
+      </w:r>
+      <w:r>
+        <w:t xml:space="preserve"> </w:t>
+      </w:r>
+      <w:r>
+        <w:t>Funcionamiento y programación del archivo main</w:t>
+      </w:r>
+      <w:r>
+        <w:t>.yml</w:t>
+      </w:r>
+    </w:p>
+    <w:p/>
+    <w:p>
+      <w:r>
+        <w:t xml:space="preserve">Dentro de ese archivo </w:t>
+      </w:r>
+      <w:r>
+        <w:t>main.yml</w:t>
+      </w:r>
+      <w:r>
+        <w:t xml:space="preserve"> hemos programado las siguientes tres órdenes básicas en un lenguaje muy sencillo:</w:t>
+      </w:r>
+    </w:p>
+    <w:p>
+      <w:pPr>
+        <w:pStyle w:val="Prrafodelista"/>
+      </w:pPr>
+    </w:p>
+    <w:p>
+      <w:pPr>
+        <w:pStyle w:val="Prrafodelista"/>
+      </w:pPr>
+    </w:p>
+    <w:p>
+      <w:pPr>
+        <w:pStyle w:val="Prrafodelista"/>
+        <w:numPr>
+          <w:ilvl w:val="0"/>
+          <w:numId w:val="27"/>
+        </w:numPr>
+      </w:pPr>
+      <w:r>
+        <w:rPr>
+          <w:b/>
+          <w:bCs/>
+        </w:rPr>
+        <w:t>El disparador ("on: push"):</w:t>
+      </w:r>
+      <w:r>
+        <w:t xml:space="preserve"> Le decimos que se active </w:t>
+      </w:r>
+      <w:r>
+        <w:rPr>
+          <w:b/>
+          <w:bCs/>
+        </w:rPr>
+        <w:t>únicamente</w:t>
+      </w:r>
+      <w:r>
+        <w:t xml:space="preserve"> cuando hagamos un </w:t>
+      </w:r>
+      <w:r>
+        <w:rPr>
+          <w:i/>
+          <w:iCs/>
+        </w:rPr>
+        <w:t>push</w:t>
+      </w:r>
+      <w:r>
+        <w:t xml:space="preserve"> (es decir, cuando subamos cambios terminados) a la rama principal (</w:t>
+      </w:r>
+      <w:r>
+        <w:t>main</w:t>
+      </w:r>
+      <w:r>
+        <w:t>). Si trabajamos en otras ramas de prueba, el servidor no se actualiza para evitar fallos.</w:t>
+      </w:r>
+    </w:p>
+    <w:p>
+      <w:pPr>
+        <w:pStyle w:val="Prrafodelista"/>
+        <w:numPr>
+          <w:ilvl w:val="0"/>
+          <w:numId w:val="27"/>
+        </w:numPr>
+      </w:pPr>
+      <w:r>
+        <w:rPr>
+          <w:b/>
+          <w:bCs/>
+        </w:rPr>
+        <w:t>El entorno de trabajo:</w:t>
+      </w:r>
+      <w:r>
+        <w:t xml:space="preserve"> Le pedimos a GitHub que nos "preste" un ordenador virtual durante unos segundos para procesar el envío.</w:t>
+      </w:r>
+    </w:p>
+    <w:p>
+      <w:pPr>
+        <w:pStyle w:val="Prrafodelista"/>
+        <w:numPr>
+          <w:ilvl w:val="0"/>
+          <w:numId w:val="27"/>
+        </w:numPr>
+      </w:pPr>
+      <w:r>
+        <w:rPr>
+          <w:b/>
+          <w:bCs/>
+        </w:rPr>
+        <w:t>La conexión y copia:</w:t>
+      </w:r>
+      <w:r>
+        <w:t xml:space="preserve"> Le ordenamos a ese ordenador virtual que se conecte de forma segura a nuestro servidor real usando las contraseñas secretas del Paso 2, y que ejecute el comando </w:t>
+      </w:r>
+      <w:r>
+        <w:t>git</w:t>
+      </w:r>
+      <w:r>
+        <w:rPr>
+          <w:rStyle w:val="CdigoHTML"/>
+          <w:rFonts w:eastAsiaTheme="minorHAnsi"/>
+        </w:rPr>
+        <w:t xml:space="preserve"> </w:t>
+      </w:r>
+      <w:r>
+        <w:t>pull</w:t>
+      </w:r>
+      <w:r>
+        <w:t>. Este comando lo que hace es mirar qué archivos han cambiado en GitHub y descargarlos en el servidor a la velocidad de la luz.</w:t>
+      </w:r>
+    </w:p>
+    <w:p/>
+    <w:p/>
+    <w:p/>
+    <w:p/>
+    <w:p/>
+    <w:p/>
+    <w:p/>
+    <w:p/>
+    <w:p/>
+    <w:p/>
+    <w:p>
+      <w:r>
+        <w:lastRenderedPageBreak/>
         <w:drawing>
-          <wp:inline distT="0" distB="0" distL="0" distR="0" wp14:anchorId="185BD099" wp14:editId="79BC2A3D">
-            <wp:extent cx="5398770" cy="3614207"/>
-            <wp:effectExtent l="0" t="0" r="0" b="5715"/>
-            <wp:docPr id="19" name="Imagen 19"/>
+          <wp:inline distT="0" distB="0" distL="0" distR="0" wp14:anchorId="3DD0F430" wp14:editId="443E71C6">
+            <wp:extent cx="5400040" cy="3711575"/>
+            <wp:effectExtent l="0" t="0" r="0" b="3175"/>
+            <wp:docPr id="24" name="Imagen 24"/>
             <wp:cNvGraphicFramePr>
               <a:graphicFrameLocks xmlns:a="http://schemas.openxmlformats.org/drawingml/2006/main" noChangeAspect="1"/>
             </wp:cNvGraphicFramePr>
@@ -7748,7 +7994,7 @@
                   <pic:spPr>
                     <a:xfrm>
                       <a:off x="0" y="0"/>
-                      <a:ext cx="5476084" cy="3665965"/>
+                      <a:ext cx="5400040" cy="3711575"/>
                     </a:xfrm>
                     <a:prstGeom prst="rect">
                       <a:avLst/>
@@ -7762,65 +8008,57 @@
       </w:r>
     </w:p>
     <w:p/>
+    <w:p/>
+    <w:p>
+      <w:pPr>
+        <w:pStyle w:val="Ttulo1"/>
+      </w:pPr>
+      <w:bookmarkStart w:id="33" w:name="_Toc231392589"/>
+      <w:r>
+        <w:t>14. Manual de incorporación de canciones al sistema de karaoke</w:t>
+      </w:r>
+      <w:bookmarkEnd w:id="33"/>
+    </w:p>
+    <w:p/>
+    <w:p>
+      <w:r>
+        <w:t>Este documento describe el procedimiento completo para añadir una nueva canción al catálogo del sistema de karaoke. El proceso incluye la obtención de la canción original, la generación de las pistas de audio necesarias, la sincronización de la letra y la carga final de todos los archivos en el panel de administración.</w:t>
+      </w:r>
+    </w:p>
+    <w:p>
+      <w:r>
+        <w:t>Es importante seguir cada uno de los pasos descritos para garantizar que la canción se reproduzca correctamente y que la letra aparezca sincronizada durante la interpretación.</w:t>
+      </w:r>
+    </w:p>
     <w:p>
       <w:pPr>
         <w:pStyle w:val="Ttulo2"/>
       </w:pPr>
-      <w:bookmarkStart w:id="36" w:name="_Toc231392592"/>
-      <w:r>
-        <w:t>14.3. Paso 3. Generación y sincronización de la letra</w:t>
-      </w:r>
-      <w:bookmarkEnd w:id="36"/>
+      <w:bookmarkStart w:id="34" w:name="_Toc231392590"/>
+      <w:r>
+        <w:t>14.1. Obtención de la canción</w:t>
+      </w:r>
+      <w:bookmarkEnd w:id="34"/>
     </w:p>
     <w:p/>
     <w:p>
       <w:r>
-        <w:t>Una vez obtenida la canción completa, es necesario crear el archivo de sincronización de letra que utilizará el reproductor de karaoke.</w:t>
-      </w:r>
-    </w:p>
-    <w:p>
-      <w:r>
-        <w:t xml:space="preserve">Para ello se utiliza la herramienta web </w:t>
-      </w:r>
-      <w:r>
-        <w:rPr>
-          <w:b/>
-          <w:bCs/>
-        </w:rPr>
-        <w:t>QuickLRC</w:t>
-      </w:r>
-      <w:r>
-        <w:t>.</w:t>
-      </w:r>
-    </w:p>
-    <w:p/>
-    <w:p>
-      <w:pPr>
-        <w:rPr>
-          <w:b/>
-          <w:bCs/>
-        </w:rPr>
-      </w:pPr>
-    </w:p>
-    <w:p>
-      <w:pPr>
-        <w:rPr>
-          <w:b/>
-          <w:bCs/>
-        </w:rPr>
-      </w:pPr>
-      <w:r>
-        <w:rPr>
-          <w:b/>
-          <w:bCs/>
-        </w:rPr>
-        <w:lastRenderedPageBreak/>
-        <w:t>Material necesario</w:t>
-      </w:r>
-    </w:p>
-    <w:p>
-      <w:r>
-        <w:t>Antes de comenzar, deben estar disponibles:</w:t>
+        <w:t>El primer paso consiste en obtener la canción que se desea incorporar al sistema.</w:t>
+      </w:r>
+    </w:p>
+    <w:p>
+      <w:pPr>
+        <w:rPr>
+          <w:b/>
+          <w:bCs/>
+        </w:rPr>
+      </w:pPr>
+      <w:r>
+        <w:rPr>
+          <w:b/>
+          <w:bCs/>
+        </w:rPr>
+        <w:t>Requisitos del archivo</w:t>
       </w:r>
     </w:p>
     <w:p>
@@ -7828,21 +8066,11 @@
         <w:pStyle w:val="Prrafodelista"/>
         <w:numPr>
           <w:ilvl w:val="0"/>
-          <w:numId w:val="7"/>
+          <w:numId w:val="2"/>
         </w:numPr>
       </w:pPr>
       <w:r>
-        <w:t xml:space="preserve">El archivo de canción completa generado por </w:t>
-      </w:r>
-      <w:r>
-        <w:rPr>
-          <w:b/>
-          <w:bCs/>
-        </w:rPr>
-        <w:t>Moises</w:t>
-      </w:r>
-      <w:r>
-        <w:t>.</w:t>
+        <w:t>La canción debe estar disponible en formato MP3.</w:t>
       </w:r>
     </w:p>
     <w:p>
@@ -7850,20 +8078,11 @@
         <w:pStyle w:val="Prrafodelista"/>
         <w:numPr>
           <w:ilvl w:val="0"/>
-          <w:numId w:val="7"/>
+          <w:numId w:val="2"/>
         </w:numPr>
       </w:pPr>
       <w:r>
-        <w:t>La letra completa de la canción.</w:t>
-      </w:r>
-    </w:p>
-    <w:p>
-      <w:r>
-        <w:rPr>
-          <w:b/>
-          <w:bCs/>
-        </w:rPr>
-        <w:t>Procedimiento</w:t>
+        <w:t>Debe tratarse de una versión completa y de buena calidad.</w:t>
       </w:r>
     </w:p>
     <w:p>
@@ -7871,21 +8090,32 @@
         <w:pStyle w:val="Prrafodelista"/>
         <w:numPr>
           <w:ilvl w:val="0"/>
-          <w:numId w:val="8"/>
+          <w:numId w:val="2"/>
         </w:numPr>
       </w:pPr>
       <w:r>
-        <w:t xml:space="preserve">Acceder a la herramienta </w:t>
-      </w:r>
-      <w:r>
-        <w:rPr>
-          <w:b/>
-          <w:bCs/>
-        </w:rPr>
-        <w:t>QuickLRC</w:t>
-      </w:r>
-      <w:r>
-        <w:t>.</w:t>
+        <w:t>Se recomienda utilizar un archivo con una tasa de bits adecuada para garantizar una correcta reproducción.</w:t>
+      </w:r>
+    </w:p>
+    <w:p/>
+    <w:p>
+      <w:pPr>
+        <w:rPr>
+          <w:b/>
+          <w:bCs/>
+        </w:rPr>
+      </w:pPr>
+      <w:r>
+        <w:rPr>
+          <w:b/>
+          <w:bCs/>
+        </w:rPr>
+        <w:t>Verificaciones previas</w:t>
+      </w:r>
+    </w:p>
+    <w:p>
+      <w:r>
+        <w:t>Antes de continuar con el proceso:</w:t>
       </w:r>
     </w:p>
     <w:p>
@@ -7893,11 +8123,12 @@
         <w:pStyle w:val="Prrafodelista"/>
         <w:numPr>
           <w:ilvl w:val="0"/>
-          <w:numId w:val="8"/>
+          <w:numId w:val="3"/>
         </w:numPr>
       </w:pPr>
       <w:r>
-        <w:t>Cargar el archivo de audio correspondiente a la canción completa.</w:t>
+        <w:lastRenderedPageBreak/>
+        <w:t>Comprobar que el archivo se reproduce correctamente.</w:t>
       </w:r>
     </w:p>
     <w:p>
@@ -7905,11 +8136,11 @@
         <w:pStyle w:val="Prrafodelista"/>
         <w:numPr>
           <w:ilvl w:val="0"/>
-          <w:numId w:val="8"/>
+          <w:numId w:val="3"/>
         </w:numPr>
       </w:pPr>
       <w:r>
-        <w:t>Copiar y pegar la letra completa de la canción.</w:t>
+        <w:t>Verificar que la canción corresponde exactamente a la versión que se desea publicar.</w:t>
       </w:r>
     </w:p>
     <w:p>
@@ -7917,63 +8148,62 @@
         <w:pStyle w:val="Prrafodelista"/>
         <w:numPr>
           <w:ilvl w:val="0"/>
-          <w:numId w:val="8"/>
+          <w:numId w:val="3"/>
         </w:numPr>
       </w:pPr>
       <w:r>
-        <w:t>Iniciar el proceso de sincronización.</w:t>
-      </w:r>
-    </w:p>
-    <w:p>
-      <w:pPr>
-        <w:rPr>
-          <w:b/>
-          <w:bCs/>
-        </w:rPr>
-      </w:pPr>
-      <w:r>
-        <w:rPr>
-          <w:b/>
-          <w:bCs/>
-        </w:rPr>
-        <w:t>Sincronización manual</w:t>
-      </w:r>
-    </w:p>
-    <w:p>
-      <w:r>
-        <w:t>La sincronización se realiza manualmente.</w:t>
-      </w:r>
-    </w:p>
-    <w:p>
-      <w:r>
-        <w:t xml:space="preserve">Durante la reproducción de la canción, se debe marcar el momento exacto en el que aparece cada </w:t>
-      </w:r>
-      <w:r>
-        <w:t>palabra</w:t>
-      </w:r>
-      <w:r>
-        <w:t xml:space="preserve"> de la letra</w:t>
-      </w:r>
-      <w:r>
-        <w:t xml:space="preserve"> utilizando la letra “t” del teclado o haciendo clic en el botón “Time Next Word”</w:t>
-      </w:r>
-      <w:r>
-        <w:t>.</w:t>
-      </w:r>
-    </w:p>
-    <w:p>
-      <w:r>
-        <w:t>El objetivo es conseguir que el texto aparezca en pantalla de forma perfectamente sincronizada con la música.</w:t>
-      </w:r>
+        <w:t>Confirmar que el título y el artista son correctos.</w:t>
+      </w:r>
+    </w:p>
+    <w:p>
+      <w:r>
+        <w:t>Una vez validado el archivo MP3, se puede proceder al procesamiento de audio.</w:t>
+      </w:r>
+    </w:p>
+    <w:p>
+      <w:pPr>
+        <w:pStyle w:val="Ttulo2"/>
+      </w:pPr>
+      <w:bookmarkStart w:id="35" w:name="_Toc231392591"/>
+      <w:r>
+        <w:t>14.2. Procesamiento de audio con Moises</w:t>
+      </w:r>
+      <w:bookmarkEnd w:id="35"/>
     </w:p>
     <w:p/>
     <w:p>
       <w:r>
-        <w:rPr>
-          <w:b/>
-          <w:bCs/>
-        </w:rPr>
-        <w:t>Recomendaciones</w:t>
+        <w:t xml:space="preserve">Una vez obtenida la canción original, se utiliza la plataforma </w:t>
+      </w:r>
+      <w:r>
+        <w:rPr>
+          <w:b/>
+          <w:bCs/>
+        </w:rPr>
+        <w:t>Moises</w:t>
+      </w:r>
+      <w:r>
+        <w:t xml:space="preserve"> para separar las distintas pistas de audio necesarias para el funcionamiento del karaoke.</w:t>
+      </w:r>
+    </w:p>
+    <w:p>
+      <w:pPr>
+        <w:rPr>
+          <w:b/>
+          <w:bCs/>
+        </w:rPr>
+      </w:pPr>
+      <w:r>
+        <w:rPr>
+          <w:b/>
+          <w:bCs/>
+        </w:rPr>
+        <w:t>Objetivo</w:t>
+      </w:r>
+    </w:p>
+    <w:p>
+      <w:r>
+        <w:t>El objetivo de este paso es generar las pistas que utilizará posteriormente el sistema:</w:t>
       </w:r>
     </w:p>
     <w:p>
@@ -7981,11 +8211,11 @@
         <w:pStyle w:val="Prrafodelista"/>
         <w:numPr>
           <w:ilvl w:val="0"/>
-          <w:numId w:val="9"/>
+          <w:numId w:val="4"/>
         </w:numPr>
       </w:pPr>
       <w:r>
-        <w:t>Escuchar atentamente el inicio de cada frase.</w:t>
+        <w:t>Pista instrumental.</w:t>
       </w:r>
     </w:p>
     <w:p>
@@ -7993,11 +8223,11 @@
         <w:pStyle w:val="Prrafodelista"/>
         <w:numPr>
           <w:ilvl w:val="0"/>
-          <w:numId w:val="9"/>
+          <w:numId w:val="4"/>
         </w:numPr>
       </w:pPr>
       <w:r>
-        <w:t>Corregir posibles desfases durante la revisión.</w:t>
+        <w:t>Pista de voz.</w:t>
       </w:r>
     </w:p>
     <w:p>
@@ -8005,11 +8235,21 @@
         <w:pStyle w:val="Prrafodelista"/>
         <w:numPr>
           <w:ilvl w:val="0"/>
-          <w:numId w:val="9"/>
+          <w:numId w:val="4"/>
         </w:numPr>
       </w:pPr>
       <w:r>
-        <w:t>Verificar especialmente las transiciones rápidas entre versos.</w:t>
+        <w:t>Canción completa.</w:t>
+      </w:r>
+    </w:p>
+    <w:p/>
+    <w:p>
+      <w:r>
+        <w:rPr>
+          <w:b/>
+          <w:bCs/>
+        </w:rPr>
+        <w:t>Procedimiento</w:t>
       </w:r>
     </w:p>
     <w:p>
@@ -8017,25 +8257,21 @@
         <w:pStyle w:val="Prrafodelista"/>
         <w:numPr>
           <w:ilvl w:val="0"/>
-          <w:numId w:val="9"/>
+          <w:numId w:val="5"/>
         </w:numPr>
       </w:pPr>
       <w:r>
-        <w:t>Revisar el resultado completo antes de exportar el archivo.</w:t>
-      </w:r>
-    </w:p>
-    <w:p>
-      <w:r>
-        <w:rPr>
-          <w:b/>
-          <w:bCs/>
-        </w:rPr>
-        <w:t>Exportación</w:t>
-      </w:r>
-    </w:p>
-    <w:p>
-      <w:r>
-        <w:t>Una vez finalizada la sincronización:</w:t>
+        <w:t xml:space="preserve">Acceder a la plataforma </w:t>
+      </w:r>
+      <w:r>
+        <w:rPr>
+          <w:b/>
+          <w:bCs/>
+        </w:rPr>
+        <w:t>Moises</w:t>
+      </w:r>
+      <w:r>
+        <w:t>.</w:t>
       </w:r>
     </w:p>
     <w:p>
@@ -8043,11 +8279,11 @@
         <w:pStyle w:val="Prrafodelista"/>
         <w:numPr>
           <w:ilvl w:val="0"/>
-          <w:numId w:val="10"/>
+          <w:numId w:val="5"/>
         </w:numPr>
       </w:pPr>
       <w:r>
-        <w:t>Guardar el proyecto.</w:t>
+        <w:t>Iniciar sesión con la cuenta correspondiente.</w:t>
       </w:r>
     </w:p>
     <w:p>
@@ -8055,46 +8291,11 @@
         <w:pStyle w:val="Prrafodelista"/>
         <w:numPr>
           <w:ilvl w:val="0"/>
-          <w:numId w:val="10"/>
+          <w:numId w:val="5"/>
         </w:numPr>
       </w:pPr>
       <w:r>
-        <w:t xml:space="preserve">Exportar el resultado en formato </w:t>
-      </w:r>
-      <w:r>
-        <w:rPr>
-          <w:b/>
-          <w:bCs/>
-        </w:rPr>
-        <w:t>.LRC</w:t>
-      </w:r>
-      <w:r>
-        <w:t>.</w:t>
-      </w:r>
-    </w:p>
-    <w:p>
-      <w:r>
-        <w:t>Este archivo contendrá todas las marcas de tiempo necesarias para mostrar la letra sincronizada durante la reproducción de la canción.</w:t>
-      </w:r>
-    </w:p>
-    <w:p>
-      <w:pPr>
-        <w:rPr>
-          <w:b/>
-          <w:bCs/>
-        </w:rPr>
-      </w:pPr>
-      <w:r>
-        <w:rPr>
-          <w:b/>
-          <w:bCs/>
-        </w:rPr>
-        <w:t>Resultado esperado</w:t>
-      </w:r>
-    </w:p>
-    <w:p>
-      <w:r>
-        <w:t>Al finalizar este paso se dispondrá de:</w:t>
+        <w:t>Crear un nuevo proyecto o carga de audio.</w:t>
       </w:r>
     </w:p>
     <w:p>
@@ -8102,11 +8303,11 @@
         <w:pStyle w:val="Prrafodelista"/>
         <w:numPr>
           <w:ilvl w:val="0"/>
-          <w:numId w:val="11"/>
+          <w:numId w:val="5"/>
         </w:numPr>
       </w:pPr>
       <w:r>
-        <w:t>Archivo de voz.</w:t>
+        <w:t>Subir el archivo MP3 de la canción.</w:t>
       </w:r>
     </w:p>
     <w:p>
@@ -8114,11 +8315,67 @@
         <w:pStyle w:val="Prrafodelista"/>
         <w:numPr>
           <w:ilvl w:val="0"/>
-          <w:numId w:val="11"/>
+          <w:numId w:val="5"/>
         </w:numPr>
       </w:pPr>
       <w:r>
-        <w:t>Archivo instrumental.</w:t>
+        <w:t xml:space="preserve">Esperar a que </w:t>
+      </w:r>
+      <w:r>
+        <w:rPr>
+          <w:b/>
+          <w:bCs/>
+        </w:rPr>
+        <w:t>Moises</w:t>
+      </w:r>
+      <w:r>
+        <w:t xml:space="preserve"> complete el análisis y la separación de pistas.</w:t>
+      </w:r>
+    </w:p>
+    <w:p/>
+    <w:p>
+      <w:pPr>
+        <w:rPr>
+          <w:b/>
+          <w:bCs/>
+        </w:rPr>
+      </w:pPr>
+      <w:r>
+        <w:rPr>
+          <w:b/>
+          <w:bCs/>
+        </w:rPr>
+        <w:t>Descarga de archivos</w:t>
+      </w:r>
+    </w:p>
+    <w:p>
+      <w:r>
+        <w:t xml:space="preserve">Una vez finalizado el procesamiento, </w:t>
+      </w:r>
+      <w:r>
+        <w:rPr>
+          <w:b/>
+          <w:bCs/>
+        </w:rPr>
+        <w:t>Moises</w:t>
+      </w:r>
+      <w:r>
+        <w:t xml:space="preserve"> generará varios archivos.</w:t>
+      </w:r>
+    </w:p>
+    <w:p>
+      <w:r>
+        <w:t>Se deben descargar los archivos generados utilizando siempre el formato estándar configurado en la plataforma.</w:t>
+      </w:r>
+    </w:p>
+    <w:p>
+      <w:pPr>
+        <w:jc w:val="left"/>
+      </w:pPr>
+    </w:p>
+    <w:p>
+      <w:r>
+        <w:t>Los archivos que se utilizarán posteriormente son:</w:t>
       </w:r>
     </w:p>
     <w:p>
@@ -8126,11 +8383,11 @@
         <w:pStyle w:val="Prrafodelista"/>
         <w:numPr>
           <w:ilvl w:val="0"/>
-          <w:numId w:val="11"/>
+          <w:numId w:val="6"/>
         </w:numPr>
       </w:pPr>
       <w:r>
-        <w:t>Archivo de canción completa.</w:t>
+        <w:t>Archivo de voz.</w:t>
       </w:r>
     </w:p>
     <w:p>
@@ -8138,22 +8395,37 @@
         <w:pStyle w:val="Prrafodelista"/>
         <w:numPr>
           <w:ilvl w:val="0"/>
-          <w:numId w:val="11"/>
+          <w:numId w:val="6"/>
         </w:numPr>
       </w:pPr>
       <w:r>
-        <w:t>Archivo de letra sincronizada (.LRC).</w:t>
+        <w:t>Archivo instrumental.</w:t>
+      </w:r>
+    </w:p>
+    <w:p>
+      <w:pPr>
+        <w:pStyle w:val="Prrafodelista"/>
+        <w:numPr>
+          <w:ilvl w:val="0"/>
+          <w:numId w:val="6"/>
+        </w:numPr>
+      </w:pPr>
+      <w:r>
+        <w:t>Archivo de canción completa.</w:t>
       </w:r>
     </w:p>
     <w:p/>
     <w:p>
       <w:r>
+        <w:rPr>
+          <w:noProof/>
+        </w:rPr>
         <w:lastRenderedPageBreak/>
         <w:drawing>
-          <wp:inline distT="0" distB="0" distL="0" distR="0" wp14:anchorId="5E5A1753" wp14:editId="0B68846E">
-            <wp:extent cx="5399925" cy="2647784"/>
-            <wp:effectExtent l="0" t="0" r="0" b="635"/>
-            <wp:docPr id="22" name="Imagen 22"/>
+          <wp:inline distT="0" distB="0" distL="0" distR="0" wp14:anchorId="7616793C" wp14:editId="20632559">
+            <wp:extent cx="5399985" cy="2830665"/>
+            <wp:effectExtent l="0" t="0" r="0" b="8255"/>
+            <wp:docPr id="6" name="Imagen 6"/>
             <wp:cNvGraphicFramePr>
               <a:graphicFrameLocks xmlns:a="http://schemas.openxmlformats.org/drawingml/2006/main" noChangeAspect="1"/>
             </wp:cNvGraphicFramePr>
@@ -8173,7 +8445,7 @@
                   <pic:spPr>
                     <a:xfrm>
                       <a:off x="0" y="0"/>
-                      <a:ext cx="5412588" cy="2653993"/>
+                      <a:ext cx="5405822" cy="2833725"/>
                     </a:xfrm>
                     <a:prstGeom prst="rect">
                       <a:avLst/>
@@ -8188,11 +8460,14 @@
     </w:p>
     <w:p>
       <w:r>
+        <w:rPr>
+          <w:noProof/>
+        </w:rPr>
         <w:drawing>
-          <wp:inline distT="0" distB="0" distL="0" distR="0" wp14:anchorId="60A8D35C" wp14:editId="05A7D30A">
-            <wp:extent cx="5400040" cy="1804946"/>
-            <wp:effectExtent l="0" t="0" r="0" b="5080"/>
-            <wp:docPr id="26" name="Imagen 26"/>
+          <wp:inline distT="0" distB="0" distL="0" distR="0" wp14:anchorId="35BB4041" wp14:editId="218A6CBC">
+            <wp:extent cx="5399484" cy="2194560"/>
+            <wp:effectExtent l="0" t="0" r="0" b="0"/>
+            <wp:docPr id="21" name="Imagen 21"/>
             <wp:cNvGraphicFramePr>
               <a:graphicFrameLocks xmlns:a="http://schemas.openxmlformats.org/drawingml/2006/main" noChangeAspect="1"/>
             </wp:cNvGraphicFramePr>
@@ -8212,7 +8487,7 @@
                   <pic:spPr>
                     <a:xfrm>
                       <a:off x="0" y="0"/>
-                      <a:ext cx="5400866" cy="1805222"/>
+                      <a:ext cx="5400753" cy="2195076"/>
                     </a:xfrm>
                     <a:prstGeom prst="rect">
                       <a:avLst/>
@@ -8225,13 +8500,25 @@
         </w:drawing>
       </w:r>
     </w:p>
-    <w:p>
-      <w:r>
+    <w:p/>
+    <w:p>
+      <w:r>
+        <w:t xml:space="preserve">         </w:t>
+      </w:r>
+    </w:p>
+    <w:p>
+      <w:r>
+        <w:t xml:space="preserve"> </w:t>
+      </w:r>
+      <w:r>
+        <w:rPr>
+          <w:noProof/>
+        </w:rPr>
         <w:drawing>
-          <wp:inline distT="0" distB="0" distL="0" distR="0" wp14:anchorId="71FE1FF5" wp14:editId="587613F2">
-            <wp:extent cx="5400040" cy="2705735"/>
+          <wp:inline distT="0" distB="0" distL="0" distR="0" wp14:anchorId="799A08F3" wp14:editId="6FC6ACEF">
+            <wp:extent cx="5398962" cy="2767054"/>
             <wp:effectExtent l="0" t="0" r="0" b="0"/>
-            <wp:docPr id="29" name="Imagen 29"/>
+            <wp:docPr id="11" name="Imagen 11"/>
             <wp:cNvGraphicFramePr>
               <a:graphicFrameLocks xmlns:a="http://schemas.openxmlformats.org/drawingml/2006/main" noChangeAspect="1"/>
             </wp:cNvGraphicFramePr>
@@ -8251,7 +8538,7 @@
                   <pic:spPr>
                     <a:xfrm>
                       <a:off x="0" y="0"/>
-                      <a:ext cx="5400040" cy="2705735"/>
+                      <a:ext cx="5409260" cy="2772332"/>
                     </a:xfrm>
                     <a:prstGeom prst="rect">
                       <a:avLst/>
@@ -8266,12 +8553,15 @@
     </w:p>
     <w:p>
       <w:r>
+        <w:rPr>
+          <w:noProof/>
+        </w:rPr>
         <w:lastRenderedPageBreak/>
         <w:drawing>
-          <wp:inline distT="0" distB="0" distL="0" distR="0" wp14:anchorId="2A770340" wp14:editId="585EB91E">
-            <wp:extent cx="5400040" cy="2830195"/>
-            <wp:effectExtent l="0" t="0" r="0" b="8255"/>
-            <wp:docPr id="28" name="Imagen 28"/>
+          <wp:inline distT="0" distB="0" distL="0" distR="0" wp14:anchorId="185BD099" wp14:editId="79BC2A3D">
+            <wp:extent cx="5398770" cy="3614207"/>
+            <wp:effectExtent l="0" t="0" r="0" b="5715"/>
+            <wp:docPr id="19" name="Imagen 19"/>
             <wp:cNvGraphicFramePr>
               <a:graphicFrameLocks xmlns:a="http://schemas.openxmlformats.org/drawingml/2006/main" noChangeAspect="1"/>
             </wp:cNvGraphicFramePr>
@@ -8291,7 +8581,7 @@
                   <pic:spPr>
                     <a:xfrm>
                       <a:off x="0" y="0"/>
-                      <a:ext cx="5400040" cy="2830195"/>
+                      <a:ext cx="5476084" cy="3665965"/>
                     </a:xfrm>
                     <a:prstGeom prst="rect">
                       <a:avLst/>
@@ -8304,13 +8594,401 @@
         </w:drawing>
       </w:r>
     </w:p>
-    <w:p>
-      <w:r>
+    <w:p/>
+    <w:p>
+      <w:pPr>
+        <w:pStyle w:val="Ttulo2"/>
+      </w:pPr>
+      <w:bookmarkStart w:id="36" w:name="_Toc231392592"/>
+      <w:r>
+        <w:t>14.3. Generación y sincronización de la letra</w:t>
+      </w:r>
+      <w:bookmarkEnd w:id="36"/>
+    </w:p>
+    <w:p/>
+    <w:p>
+      <w:r>
+        <w:t>Una vez obtenida la canción completa, es necesario crear el archivo de sincronización de letra que utilizará el reproductor de karaoke.</w:t>
+      </w:r>
+    </w:p>
+    <w:p>
+      <w:r>
+        <w:t xml:space="preserve">Para ello se utiliza la herramienta web </w:t>
+      </w:r>
+      <w:r>
+        <w:rPr>
+          <w:b/>
+          <w:bCs/>
+        </w:rPr>
+        <w:t>QuickLRC</w:t>
+      </w:r>
+      <w:r>
+        <w:t>.</w:t>
+      </w:r>
+    </w:p>
+    <w:p/>
+    <w:p>
+      <w:pPr>
+        <w:rPr>
+          <w:b/>
+          <w:bCs/>
+        </w:rPr>
+      </w:pPr>
+    </w:p>
+    <w:p>
+      <w:pPr>
+        <w:rPr>
+          <w:b/>
+          <w:bCs/>
+        </w:rPr>
+      </w:pPr>
+      <w:r>
+        <w:rPr>
+          <w:b/>
+          <w:bCs/>
+        </w:rPr>
+        <w:t>Material necesario</w:t>
+      </w:r>
+    </w:p>
+    <w:p>
+      <w:r>
+        <w:t>Antes de comenzar, deben estar disponibles:</w:t>
+      </w:r>
+    </w:p>
+    <w:p>
+      <w:pPr>
+        <w:pStyle w:val="Prrafodelista"/>
+        <w:numPr>
+          <w:ilvl w:val="0"/>
+          <w:numId w:val="7"/>
+        </w:numPr>
+      </w:pPr>
+      <w:r>
+        <w:t xml:space="preserve">El archivo de canción completa generado por </w:t>
+      </w:r>
+      <w:r>
+        <w:rPr>
+          <w:b/>
+          <w:bCs/>
+        </w:rPr>
+        <w:t>Moises</w:t>
+      </w:r>
+      <w:r>
+        <w:t>.</w:t>
+      </w:r>
+    </w:p>
+    <w:p>
+      <w:pPr>
+        <w:pStyle w:val="Prrafodelista"/>
+        <w:numPr>
+          <w:ilvl w:val="0"/>
+          <w:numId w:val="7"/>
+        </w:numPr>
+      </w:pPr>
+      <w:r>
+        <w:t>La letra completa de la canción.</w:t>
+      </w:r>
+    </w:p>
+    <w:p>
+      <w:r>
+        <w:rPr>
+          <w:b/>
+          <w:bCs/>
+        </w:rPr>
+        <w:t>Procedimiento</w:t>
+      </w:r>
+    </w:p>
+    <w:p>
+      <w:pPr>
+        <w:pStyle w:val="Prrafodelista"/>
+        <w:numPr>
+          <w:ilvl w:val="0"/>
+          <w:numId w:val="8"/>
+        </w:numPr>
+      </w:pPr>
+      <w:r>
+        <w:t xml:space="preserve">Acceder a la herramienta </w:t>
+      </w:r>
+      <w:r>
+        <w:rPr>
+          <w:b/>
+          <w:bCs/>
+        </w:rPr>
+        <w:t>QuickLRC</w:t>
+      </w:r>
+      <w:r>
+        <w:t>.</w:t>
+      </w:r>
+    </w:p>
+    <w:p>
+      <w:pPr>
+        <w:pStyle w:val="Prrafodelista"/>
+        <w:numPr>
+          <w:ilvl w:val="0"/>
+          <w:numId w:val="8"/>
+        </w:numPr>
+      </w:pPr>
+      <w:r>
+        <w:t>Cargar el archivo de audio correspondiente a la canción completa.</w:t>
+      </w:r>
+    </w:p>
+    <w:p>
+      <w:pPr>
+        <w:pStyle w:val="Prrafodelista"/>
+        <w:numPr>
+          <w:ilvl w:val="0"/>
+          <w:numId w:val="8"/>
+        </w:numPr>
+      </w:pPr>
+      <w:r>
+        <w:t>Copiar y pegar la letra completa de la canción.</w:t>
+      </w:r>
+    </w:p>
+    <w:p>
+      <w:pPr>
+        <w:pStyle w:val="Prrafodelista"/>
+        <w:numPr>
+          <w:ilvl w:val="0"/>
+          <w:numId w:val="8"/>
+        </w:numPr>
+      </w:pPr>
+      <w:r>
+        <w:t>Iniciar el proceso de sincronización.</w:t>
+      </w:r>
+    </w:p>
+    <w:p>
+      <w:pPr>
+        <w:rPr>
+          <w:b/>
+          <w:bCs/>
+        </w:rPr>
+      </w:pPr>
+      <w:r>
+        <w:rPr>
+          <w:b/>
+          <w:bCs/>
+        </w:rPr>
+        <w:t>Sincronización manual</w:t>
+      </w:r>
+    </w:p>
+    <w:p>
+      <w:r>
+        <w:t>La sincronización se realiza manualmente.</w:t>
+      </w:r>
+    </w:p>
+    <w:p>
+      <w:r>
+        <w:lastRenderedPageBreak/>
+        <w:t xml:space="preserve">Durante la reproducción de la canción, se debe marcar el momento exacto en el que aparece cada </w:t>
+      </w:r>
+      <w:r>
+        <w:t>palabra</w:t>
+      </w:r>
+      <w:r>
+        <w:t xml:space="preserve"> de la letra</w:t>
+      </w:r>
+      <w:r>
+        <w:t xml:space="preserve"> utilizando la letra “t” del teclado o haciendo clic en el botón “Time Next Word”</w:t>
+      </w:r>
+      <w:r>
+        <w:t>.</w:t>
+      </w:r>
+    </w:p>
+    <w:p>
+      <w:r>
+        <w:t>El objetivo es conseguir que el texto aparezca en pantalla de forma perfectamente sincronizada con la música.</w:t>
+      </w:r>
+    </w:p>
+    <w:p/>
+    <w:p>
+      <w:r>
+        <w:rPr>
+          <w:b/>
+          <w:bCs/>
+        </w:rPr>
+        <w:t>Recomendaciones</w:t>
+      </w:r>
+    </w:p>
+    <w:p>
+      <w:pPr>
+        <w:pStyle w:val="Prrafodelista"/>
+        <w:numPr>
+          <w:ilvl w:val="0"/>
+          <w:numId w:val="9"/>
+        </w:numPr>
+      </w:pPr>
+      <w:r>
+        <w:t>Escuchar atentamente el inicio de cada frase.</w:t>
+      </w:r>
+    </w:p>
+    <w:p>
+      <w:pPr>
+        <w:pStyle w:val="Prrafodelista"/>
+        <w:numPr>
+          <w:ilvl w:val="0"/>
+          <w:numId w:val="9"/>
+        </w:numPr>
+      </w:pPr>
+      <w:r>
+        <w:t>Corregir posibles desfases durante la revisión.</w:t>
+      </w:r>
+    </w:p>
+    <w:p>
+      <w:pPr>
+        <w:pStyle w:val="Prrafodelista"/>
+        <w:numPr>
+          <w:ilvl w:val="0"/>
+          <w:numId w:val="9"/>
+        </w:numPr>
+      </w:pPr>
+      <w:r>
+        <w:t>Verificar especialmente las transiciones rápidas entre versos.</w:t>
+      </w:r>
+    </w:p>
+    <w:p>
+      <w:pPr>
+        <w:pStyle w:val="Prrafodelista"/>
+        <w:numPr>
+          <w:ilvl w:val="0"/>
+          <w:numId w:val="9"/>
+        </w:numPr>
+      </w:pPr>
+      <w:r>
+        <w:t>Revisar el resultado completo antes de exportar el archivo.</w:t>
+      </w:r>
+    </w:p>
+    <w:p>
+      <w:r>
+        <w:rPr>
+          <w:b/>
+          <w:bCs/>
+        </w:rPr>
+        <w:t>Exportación</w:t>
+      </w:r>
+    </w:p>
+    <w:p>
+      <w:r>
+        <w:t>Una vez finalizada la sincronización:</w:t>
+      </w:r>
+    </w:p>
+    <w:p>
+      <w:pPr>
+        <w:pStyle w:val="Prrafodelista"/>
+        <w:numPr>
+          <w:ilvl w:val="0"/>
+          <w:numId w:val="10"/>
+        </w:numPr>
+      </w:pPr>
+      <w:r>
+        <w:t>Guardar el proyecto.</w:t>
+      </w:r>
+    </w:p>
+    <w:p>
+      <w:pPr>
+        <w:pStyle w:val="Prrafodelista"/>
+        <w:numPr>
+          <w:ilvl w:val="0"/>
+          <w:numId w:val="10"/>
+        </w:numPr>
+      </w:pPr>
+      <w:r>
+        <w:t xml:space="preserve">Exportar el resultado en formato </w:t>
+      </w:r>
+      <w:r>
+        <w:rPr>
+          <w:b/>
+          <w:bCs/>
+        </w:rPr>
+        <w:t>.LRC</w:t>
+      </w:r>
+      <w:r>
+        <w:t>.</w:t>
+      </w:r>
+    </w:p>
+    <w:p>
+      <w:r>
+        <w:t>Este archivo contendrá todas las marcas de tiempo necesarias para mostrar la letra sincronizada durante la reproducción de la canción.</w:t>
+      </w:r>
+    </w:p>
+    <w:p>
+      <w:pPr>
+        <w:rPr>
+          <w:b/>
+          <w:bCs/>
+        </w:rPr>
+      </w:pPr>
+      <w:r>
+        <w:rPr>
+          <w:b/>
+          <w:bCs/>
+        </w:rPr>
+        <w:t>Resultado esperado</w:t>
+      </w:r>
+    </w:p>
+    <w:p>
+      <w:r>
+        <w:t>Al finalizar este paso se dispondrá de:</w:t>
+      </w:r>
+    </w:p>
+    <w:p>
+      <w:pPr>
+        <w:pStyle w:val="Prrafodelista"/>
+        <w:numPr>
+          <w:ilvl w:val="0"/>
+          <w:numId w:val="11"/>
+        </w:numPr>
+      </w:pPr>
+      <w:r>
+        <w:t>Archivo de voz.</w:t>
+      </w:r>
+    </w:p>
+    <w:p>
+      <w:pPr>
+        <w:pStyle w:val="Prrafodelista"/>
+        <w:numPr>
+          <w:ilvl w:val="0"/>
+          <w:numId w:val="11"/>
+        </w:numPr>
+      </w:pPr>
+      <w:r>
+        <w:t>Archivo instrumental.</w:t>
+      </w:r>
+    </w:p>
+    <w:p>
+      <w:pPr>
+        <w:pStyle w:val="Prrafodelista"/>
+        <w:numPr>
+          <w:ilvl w:val="0"/>
+          <w:numId w:val="11"/>
+        </w:numPr>
+      </w:pPr>
+      <w:r>
+        <w:t>Archivo de canción completa.</w:t>
+      </w:r>
+    </w:p>
+    <w:p>
+      <w:pPr>
+        <w:pStyle w:val="Prrafodelista"/>
+        <w:numPr>
+          <w:ilvl w:val="0"/>
+          <w:numId w:val="11"/>
+        </w:numPr>
+      </w:pPr>
+      <w:r>
+        <w:t>Archivo de letra sincronizada (.LRC).</w:t>
+      </w:r>
+    </w:p>
+    <w:p/>
+    <w:p>
+      <w:r>
+        <w:rPr>
+          <w:noProof/>
+        </w:rPr>
         <w:drawing>
-          <wp:inline distT="0" distB="0" distL="0" distR="0" wp14:anchorId="2FDAF0F8" wp14:editId="01CE1F33">
-            <wp:extent cx="5400040" cy="2663190"/>
-            <wp:effectExtent l="0" t="0" r="0" b="3810"/>
-            <wp:docPr id="31" name="Imagen 31"/>
+          <wp:inline distT="0" distB="0" distL="0" distR="0" wp14:anchorId="5E5A1753" wp14:editId="0B68846E">
+            <wp:extent cx="5399925" cy="2647784"/>
+            <wp:effectExtent l="0" t="0" r="0" b="635"/>
+            <wp:docPr id="22" name="Imagen 22"/>
             <wp:cNvGraphicFramePr>
               <a:graphicFrameLocks xmlns:a="http://schemas.openxmlformats.org/drawingml/2006/main" noChangeAspect="1"/>
             </wp:cNvGraphicFramePr>
@@ -8330,7 +9008,7 @@
                   <pic:spPr>
                     <a:xfrm>
                       <a:off x="0" y="0"/>
-                      <a:ext cx="5400040" cy="2663190"/>
+                      <a:ext cx="5412588" cy="2653993"/>
                     </a:xfrm>
                     <a:prstGeom prst="rect">
                       <a:avLst/>
@@ -8343,14 +9021,17 @@
         </w:drawing>
       </w:r>
     </w:p>
-    <w:p/>
-    <w:p>
-      <w:r>
+    <w:p>
+      <w:r>
+        <w:rPr>
+          <w:noProof/>
+        </w:rPr>
+        <w:lastRenderedPageBreak/>
         <w:drawing>
-          <wp:inline distT="0" distB="0" distL="0" distR="0" wp14:anchorId="6D127BA2" wp14:editId="5EFCEF8C">
-            <wp:extent cx="5400040" cy="2582545"/>
-            <wp:effectExtent l="0" t="0" r="0" b="8255"/>
-            <wp:docPr id="34" name="Imagen 34"/>
+          <wp:inline distT="0" distB="0" distL="0" distR="0" wp14:anchorId="60A8D35C" wp14:editId="05A7D30A">
+            <wp:extent cx="5400040" cy="1804946"/>
+            <wp:effectExtent l="0" t="0" r="0" b="5080"/>
+            <wp:docPr id="26" name="Imagen 26"/>
             <wp:cNvGraphicFramePr>
               <a:graphicFrameLocks xmlns:a="http://schemas.openxmlformats.org/drawingml/2006/main" noChangeAspect="1"/>
             </wp:cNvGraphicFramePr>
@@ -8370,7 +9051,7 @@
                   <pic:spPr>
                     <a:xfrm>
                       <a:off x="0" y="0"/>
-                      <a:ext cx="5400040" cy="2582545"/>
+                      <a:ext cx="5400866" cy="1805222"/>
                     </a:xfrm>
                     <a:prstGeom prst="rect">
                       <a:avLst/>
@@ -8383,458 +9064,16 @@
         </w:drawing>
       </w:r>
     </w:p>
-    <w:p/>
-    <w:p>
-      <w:pPr>
-        <w:pStyle w:val="Ttulo2"/>
-      </w:pPr>
-      <w:bookmarkStart w:id="37" w:name="_Toc231392593"/>
-      <w:r>
-        <w:t>14.4. Paso 4. Alta de la canción en el sistema de administración</w:t>
-      </w:r>
-      <w:bookmarkEnd w:id="37"/>
-    </w:p>
-    <w:p/>
-    <w:p>
-      <w:r>
-        <w:t>Con todos los archivos preparados, se procede a dar de alta la canción en la plataforma de gestión del karaoke.</w:t>
-      </w:r>
-    </w:p>
-    <w:p>
-      <w:r>
-        <w:rPr>
-          <w:b/>
-          <w:bCs/>
-        </w:rPr>
-        <w:t>Acceso</w:t>
-      </w:r>
-    </w:p>
-    <w:p>
-      <w:pPr>
-        <w:pStyle w:val="Prrafodelista"/>
-        <w:numPr>
-          <w:ilvl w:val="0"/>
-          <w:numId w:val="12"/>
-        </w:numPr>
-      </w:pPr>
-      <w:r>
-        <w:t>Acceder al panel de administración.</w:t>
-      </w:r>
-    </w:p>
-    <w:p>
-      <w:pPr>
-        <w:pStyle w:val="Prrafodelista"/>
-        <w:numPr>
-          <w:ilvl w:val="0"/>
-          <w:numId w:val="12"/>
-        </w:numPr>
-      </w:pPr>
-      <w:r>
-        <w:t>Iniciar sesión con un usuario autorizado.</w:t>
-      </w:r>
-    </w:p>
-    <w:p>
-      <w:pPr>
-        <w:pStyle w:val="Prrafodelista"/>
-        <w:numPr>
-          <w:ilvl w:val="0"/>
-          <w:numId w:val="12"/>
-        </w:numPr>
-      </w:pPr>
-      <w:r>
-        <w:t>Entrar en la sección de gestión de canciones.</w:t>
-      </w:r>
-    </w:p>
-    <w:p>
-      <w:pPr>
-        <w:rPr>
-          <w:b/>
-          <w:bCs/>
-        </w:rPr>
-      </w:pPr>
-      <w:r>
-        <w:rPr>
-          <w:b/>
-          <w:bCs/>
-        </w:rPr>
-        <w:t>Creación de una nueva canción</w:t>
-      </w:r>
-    </w:p>
-    <w:p>
-      <w:r>
-        <w:t>Seleccionar la opción correspondiente para añadir una nueva canción al catálogo.</w:t>
-      </w:r>
-    </w:p>
-    <w:p>
-      <w:pPr>
-        <w:rPr>
-          <w:b/>
-          <w:bCs/>
-        </w:rPr>
-      </w:pPr>
-      <w:r>
-        <w:rPr>
-          <w:b/>
-          <w:bCs/>
-        </w:rPr>
-        <w:t>Información obligatoria</w:t>
-      </w:r>
-    </w:p>
-    <w:p>
-      <w:r>
-        <w:t>Introducir los siguientes datos:</w:t>
-      </w:r>
-    </w:p>
-    <w:p>
-      <w:pPr>
-        <w:rPr>
-          <w:b/>
-          <w:bCs/>
-        </w:rPr>
-      </w:pPr>
-      <w:r>
-        <w:rPr>
-          <w:b/>
-          <w:bCs/>
-        </w:rPr>
-        <w:t>Artista</w:t>
-      </w:r>
-    </w:p>
-    <w:p>
-      <w:r>
-        <w:t>Nombre del artista o grupo musical.</w:t>
-      </w:r>
-    </w:p>
-    <w:p>
-      <w:r>
-        <w:t>Ejemplos:</w:t>
-      </w:r>
-    </w:p>
-    <w:p>
-      <w:pPr>
-        <w:pStyle w:val="Prrafodelista"/>
-        <w:numPr>
-          <w:ilvl w:val="0"/>
-          <w:numId w:val="13"/>
-        </w:numPr>
-      </w:pPr>
-      <w:r>
-        <w:t>Queen</w:t>
-      </w:r>
-    </w:p>
-    <w:p>
-      <w:pPr>
-        <w:pStyle w:val="Prrafodelista"/>
-        <w:numPr>
-          <w:ilvl w:val="0"/>
-          <w:numId w:val="13"/>
-        </w:numPr>
-      </w:pPr>
-      <w:r>
-        <w:t>Alejandro Sanz</w:t>
-      </w:r>
-    </w:p>
-    <w:p>
-      <w:pPr>
-        <w:pStyle w:val="Prrafodelista"/>
-        <w:numPr>
-          <w:ilvl w:val="0"/>
-          <w:numId w:val="13"/>
-        </w:numPr>
-      </w:pPr>
-      <w:r>
-        <w:t>Mecano</w:t>
-      </w:r>
-    </w:p>
-    <w:p>
-      <w:r>
-        <w:t>Título</w:t>
-      </w:r>
-    </w:p>
-    <w:p>
-      <w:r>
-        <w:t>Nombre completo de la canción.</w:t>
-      </w:r>
-    </w:p>
-    <w:p>
-      <w:r>
-        <w:t>Ejemplos:</w:t>
-      </w:r>
-    </w:p>
-    <w:p>
-      <w:pPr>
-        <w:pStyle w:val="Prrafodelista"/>
-        <w:numPr>
-          <w:ilvl w:val="0"/>
-          <w:numId w:val="14"/>
-        </w:numPr>
-      </w:pPr>
-      <w:r>
-        <w:t>Bohemian Rhapsody</w:t>
-      </w:r>
-    </w:p>
-    <w:p>
-      <w:pPr>
-        <w:pStyle w:val="Prrafodelista"/>
-        <w:numPr>
-          <w:ilvl w:val="0"/>
-          <w:numId w:val="14"/>
-        </w:numPr>
-      </w:pPr>
-      <w:r>
-        <w:t>Corazón Partío</w:t>
-      </w:r>
-    </w:p>
-    <w:p>
-      <w:pPr>
-        <w:pStyle w:val="Prrafodelista"/>
-        <w:numPr>
-          <w:ilvl w:val="0"/>
-          <w:numId w:val="14"/>
-        </w:numPr>
-      </w:pPr>
-      <w:r>
-        <w:t>Hijo de la Luna</w:t>
-      </w:r>
-    </w:p>
-    <w:p>
-      <w:pPr>
-        <w:rPr>
-          <w:b/>
-          <w:bCs/>
-        </w:rPr>
-      </w:pPr>
-      <w:r>
-        <w:rPr>
-          <w:b/>
-          <w:bCs/>
-        </w:rPr>
-        <w:t>Carga de archivos</w:t>
-      </w:r>
-    </w:p>
-    <w:p>
-      <w:r>
-        <w:t>Adjuntar los archivos generados durante los pasos anteriores:</w:t>
-      </w:r>
-    </w:p>
-    <w:p>
-      <w:pPr>
-        <w:rPr>
-          <w:b/>
-          <w:bCs/>
-        </w:rPr>
-      </w:pPr>
-      <w:r>
-        <w:rPr>
-          <w:b/>
-          <w:bCs/>
-        </w:rPr>
-        <w:t>Archivo de voz</w:t>
-      </w:r>
-    </w:p>
-    <w:p>
-      <w:r>
-        <w:t xml:space="preserve">Archivo obtenido desde </w:t>
-      </w:r>
-      <w:r>
-        <w:rPr>
-          <w:b/>
-          <w:bCs/>
-        </w:rPr>
-        <w:t>Moises</w:t>
-      </w:r>
-      <w:r>
-        <w:t xml:space="preserve"> que contiene únicamente la voz de la canción.</w:t>
-      </w:r>
-    </w:p>
-    <w:p>
-      <w:pPr>
-        <w:rPr>
-          <w:b/>
-          <w:bCs/>
-        </w:rPr>
-      </w:pPr>
-      <w:r>
-        <w:rPr>
-          <w:b/>
-          <w:bCs/>
-        </w:rPr>
-        <w:t>Archivo instrumental</w:t>
-      </w:r>
-    </w:p>
-    <w:p>
-      <w:r>
-        <w:t xml:space="preserve">Archivo instrumental generado por </w:t>
-      </w:r>
-      <w:r>
-        <w:rPr>
-          <w:b/>
-          <w:bCs/>
-        </w:rPr>
-        <w:t>Moises</w:t>
-      </w:r>
-      <w:r>
-        <w:t xml:space="preserve"> que será utilizado como base musical para el karaoke.</w:t>
-      </w:r>
-    </w:p>
-    <w:p>
-      <w:pPr>
-        <w:rPr>
-          <w:b/>
-          <w:bCs/>
-        </w:rPr>
-      </w:pPr>
-      <w:r>
-        <w:rPr>
-          <w:b/>
-          <w:bCs/>
-        </w:rPr>
-        <w:t>Archivo LRC</w:t>
-      </w:r>
-    </w:p>
-    <w:p>
-      <w:r>
-        <w:t xml:space="preserve">Archivo de letra sincronizada generado mediante </w:t>
-      </w:r>
-      <w:r>
-        <w:rPr>
-          <w:b/>
-          <w:bCs/>
-        </w:rPr>
-        <w:t>QuickLRC</w:t>
-      </w:r>
-      <w:r>
-        <w:t>.</w:t>
-      </w:r>
-    </w:p>
-    <w:p/>
-    <w:p>
-      <w:pPr>
-        <w:rPr>
-          <w:b/>
-          <w:bCs/>
-        </w:rPr>
-      </w:pPr>
-      <w:r>
-        <w:rPr>
-          <w:b/>
-          <w:bCs/>
-        </w:rPr>
-        <w:lastRenderedPageBreak/>
-        <w:t>Verificación</w:t>
-      </w:r>
-    </w:p>
-    <w:p>
-      <w:r>
-        <w:t>Antes de guardar la canción:</w:t>
-      </w:r>
-    </w:p>
-    <w:p>
-      <w:pPr>
-        <w:pStyle w:val="Prrafodelista"/>
-        <w:numPr>
-          <w:ilvl w:val="0"/>
-          <w:numId w:val="15"/>
-        </w:numPr>
-      </w:pPr>
-      <w:r>
-        <w:t>Comprobar que los archivos correctos han sido seleccionados.</w:t>
-      </w:r>
-    </w:p>
-    <w:p>
-      <w:pPr>
-        <w:pStyle w:val="Prrafodelista"/>
-        <w:numPr>
-          <w:ilvl w:val="0"/>
-          <w:numId w:val="15"/>
-        </w:numPr>
-      </w:pPr>
-      <w:r>
-        <w:t>Revisar el nombre del artista.</w:t>
-      </w:r>
-    </w:p>
-    <w:p>
-      <w:pPr>
-        <w:pStyle w:val="Prrafodelista"/>
-        <w:numPr>
-          <w:ilvl w:val="0"/>
-          <w:numId w:val="15"/>
-        </w:numPr>
-      </w:pPr>
-      <w:r>
-        <w:t>Revisar el título de la canción.</w:t>
-      </w:r>
-    </w:p>
-    <w:p>
-      <w:pPr>
-        <w:pStyle w:val="Prrafodelista"/>
-        <w:numPr>
-          <w:ilvl w:val="0"/>
-          <w:numId w:val="15"/>
-        </w:numPr>
-      </w:pPr>
-      <w:r>
-        <w:t>Verificar que el archivo LRC corresponde a la misma versión de la canción.</w:t>
-      </w:r>
-    </w:p>
-    <w:p>
-      <w:r>
-        <w:rPr>
-          <w:b/>
-          <w:bCs/>
-        </w:rPr>
-        <w:t>Guardado</w:t>
-      </w:r>
-    </w:p>
-    <w:p>
-      <w:r>
-        <w:t>Una vez comprobados todos los datos:</w:t>
-      </w:r>
-    </w:p>
-    <w:p>
-      <w:pPr>
-        <w:pStyle w:val="Prrafodelista"/>
-        <w:numPr>
-          <w:ilvl w:val="0"/>
-          <w:numId w:val="16"/>
-        </w:numPr>
-      </w:pPr>
-      <w:r>
-        <w:t>Pulsar el botón de guardar canción.</w:t>
-      </w:r>
-    </w:p>
-    <w:p>
-      <w:pPr>
-        <w:pStyle w:val="Prrafodelista"/>
-        <w:numPr>
-          <w:ilvl w:val="0"/>
-          <w:numId w:val="16"/>
-        </w:numPr>
-      </w:pPr>
-      <w:r>
-        <w:t>Esperar a que finalice la carga de archivos.</w:t>
-      </w:r>
-    </w:p>
-    <w:p>
-      <w:pPr>
-        <w:pStyle w:val="Prrafodelista"/>
-        <w:numPr>
-          <w:ilvl w:val="0"/>
-          <w:numId w:val="16"/>
-        </w:numPr>
-      </w:pPr>
-      <w:r>
-        <w:t>Confirmar que la canción aparece en el listado de canciones disponibles.</w:t>
-      </w:r>
-    </w:p>
-    <w:p/>
-    <w:p>
-      <w:r>
+    <w:p>
+      <w:r>
+        <w:rPr>
+          <w:noProof/>
+        </w:rPr>
         <w:drawing>
-          <wp:inline distT="0" distB="0" distL="0" distR="0" wp14:anchorId="1D815C63" wp14:editId="71601EFD">
-            <wp:extent cx="5400040" cy="2522855"/>
+          <wp:inline distT="0" distB="0" distL="0" distR="0" wp14:anchorId="71FE1FF5" wp14:editId="587613F2">
+            <wp:extent cx="5400040" cy="2705735"/>
             <wp:effectExtent l="0" t="0" r="0" b="0"/>
-            <wp:docPr id="33" name="Imagen 33"/>
+            <wp:docPr id="29" name="Imagen 29"/>
             <wp:cNvGraphicFramePr>
               <a:graphicFrameLocks xmlns:a="http://schemas.openxmlformats.org/drawingml/2006/main" noChangeAspect="1"/>
             </wp:cNvGraphicFramePr>
@@ -8854,6 +9093,632 @@
                   <pic:spPr>
                     <a:xfrm>
                       <a:off x="0" y="0"/>
+                      <a:ext cx="5400040" cy="2705735"/>
+                    </a:xfrm>
+                    <a:prstGeom prst="rect">
+                      <a:avLst/>
+                    </a:prstGeom>
+                  </pic:spPr>
+                </pic:pic>
+              </a:graphicData>
+            </a:graphic>
+          </wp:inline>
+        </w:drawing>
+      </w:r>
+    </w:p>
+    <w:p>
+      <w:r>
+        <w:rPr>
+          <w:noProof/>
+        </w:rPr>
+        <w:drawing>
+          <wp:inline distT="0" distB="0" distL="0" distR="0" wp14:anchorId="2A770340" wp14:editId="585EB91E">
+            <wp:extent cx="5400040" cy="2830195"/>
+            <wp:effectExtent l="0" t="0" r="0" b="8255"/>
+            <wp:docPr id="28" name="Imagen 28"/>
+            <wp:cNvGraphicFramePr>
+              <a:graphicFrameLocks xmlns:a="http://schemas.openxmlformats.org/drawingml/2006/main" noChangeAspect="1"/>
+            </wp:cNvGraphicFramePr>
+            <a:graphic xmlns:a="http://schemas.openxmlformats.org/drawingml/2006/main">
+              <a:graphicData uri="http://schemas.openxmlformats.org/drawingml/2006/picture">
+                <pic:pic xmlns:pic="http://schemas.openxmlformats.org/drawingml/2006/picture">
+                  <pic:nvPicPr>
+                    <pic:cNvPr id="1" name=""/>
+                    <pic:cNvPicPr/>
+                  </pic:nvPicPr>
+                  <pic:blipFill>
+                    <a:blip r:embed="rId30"/>
+                    <a:stretch>
+                      <a:fillRect/>
+                    </a:stretch>
+                  </pic:blipFill>
+                  <pic:spPr>
+                    <a:xfrm>
+                      <a:off x="0" y="0"/>
+                      <a:ext cx="5400040" cy="2830195"/>
+                    </a:xfrm>
+                    <a:prstGeom prst="rect">
+                      <a:avLst/>
+                    </a:prstGeom>
+                  </pic:spPr>
+                </pic:pic>
+              </a:graphicData>
+            </a:graphic>
+          </wp:inline>
+        </w:drawing>
+      </w:r>
+    </w:p>
+    <w:p>
+      <w:r>
+        <w:rPr>
+          <w:noProof/>
+        </w:rPr>
+        <w:lastRenderedPageBreak/>
+        <w:drawing>
+          <wp:inline distT="0" distB="0" distL="0" distR="0" wp14:anchorId="2FDAF0F8" wp14:editId="01CE1F33">
+            <wp:extent cx="5400040" cy="2663190"/>
+            <wp:effectExtent l="0" t="0" r="0" b="3810"/>
+            <wp:docPr id="31" name="Imagen 31"/>
+            <wp:cNvGraphicFramePr>
+              <a:graphicFrameLocks xmlns:a="http://schemas.openxmlformats.org/drawingml/2006/main" noChangeAspect="1"/>
+            </wp:cNvGraphicFramePr>
+            <a:graphic xmlns:a="http://schemas.openxmlformats.org/drawingml/2006/main">
+              <a:graphicData uri="http://schemas.openxmlformats.org/drawingml/2006/picture">
+                <pic:pic xmlns:pic="http://schemas.openxmlformats.org/drawingml/2006/picture">
+                  <pic:nvPicPr>
+                    <pic:cNvPr id="1" name=""/>
+                    <pic:cNvPicPr/>
+                  </pic:nvPicPr>
+                  <pic:blipFill>
+                    <a:blip r:embed="rId31"/>
+                    <a:stretch>
+                      <a:fillRect/>
+                    </a:stretch>
+                  </pic:blipFill>
+                  <pic:spPr>
+                    <a:xfrm>
+                      <a:off x="0" y="0"/>
+                      <a:ext cx="5400040" cy="2663190"/>
+                    </a:xfrm>
+                    <a:prstGeom prst="rect">
+                      <a:avLst/>
+                    </a:prstGeom>
+                  </pic:spPr>
+                </pic:pic>
+              </a:graphicData>
+            </a:graphic>
+          </wp:inline>
+        </w:drawing>
+      </w:r>
+    </w:p>
+    <w:p/>
+    <w:p>
+      <w:r>
+        <w:rPr>
+          <w:noProof/>
+        </w:rPr>
+        <w:drawing>
+          <wp:inline distT="0" distB="0" distL="0" distR="0" wp14:anchorId="6D127BA2" wp14:editId="5EFCEF8C">
+            <wp:extent cx="5400040" cy="2582545"/>
+            <wp:effectExtent l="0" t="0" r="0" b="8255"/>
+            <wp:docPr id="34" name="Imagen 34"/>
+            <wp:cNvGraphicFramePr>
+              <a:graphicFrameLocks xmlns:a="http://schemas.openxmlformats.org/drawingml/2006/main" noChangeAspect="1"/>
+            </wp:cNvGraphicFramePr>
+            <a:graphic xmlns:a="http://schemas.openxmlformats.org/drawingml/2006/main">
+              <a:graphicData uri="http://schemas.openxmlformats.org/drawingml/2006/picture">
+                <pic:pic xmlns:pic="http://schemas.openxmlformats.org/drawingml/2006/picture">
+                  <pic:nvPicPr>
+                    <pic:cNvPr id="1" name=""/>
+                    <pic:cNvPicPr/>
+                  </pic:nvPicPr>
+                  <pic:blipFill>
+                    <a:blip r:embed="rId32"/>
+                    <a:stretch>
+                      <a:fillRect/>
+                    </a:stretch>
+                  </pic:blipFill>
+                  <pic:spPr>
+                    <a:xfrm>
+                      <a:off x="0" y="0"/>
+                      <a:ext cx="5400040" cy="2582545"/>
+                    </a:xfrm>
+                    <a:prstGeom prst="rect">
+                      <a:avLst/>
+                    </a:prstGeom>
+                  </pic:spPr>
+                </pic:pic>
+              </a:graphicData>
+            </a:graphic>
+          </wp:inline>
+        </w:drawing>
+      </w:r>
+    </w:p>
+    <w:p/>
+    <w:p>
+      <w:pPr>
+        <w:pStyle w:val="Ttulo2"/>
+      </w:pPr>
+      <w:bookmarkStart w:id="37" w:name="_Toc231392593"/>
+      <w:r>
+        <w:t>14.4. Alta de la canción en el sistema de administración</w:t>
+      </w:r>
+      <w:bookmarkEnd w:id="37"/>
+    </w:p>
+    <w:p/>
+    <w:p>
+      <w:r>
+        <w:t>Con todos los archivos preparados, se procede a dar de alta la canción en la plataforma de gestión del karaoke.</w:t>
+      </w:r>
+    </w:p>
+    <w:p>
+      <w:r>
+        <w:rPr>
+          <w:b/>
+          <w:bCs/>
+        </w:rPr>
+        <w:t>Acceso</w:t>
+      </w:r>
+    </w:p>
+    <w:p>
+      <w:pPr>
+        <w:pStyle w:val="Prrafodelista"/>
+        <w:numPr>
+          <w:ilvl w:val="0"/>
+          <w:numId w:val="12"/>
+        </w:numPr>
+      </w:pPr>
+      <w:r>
+        <w:t>Acceder al panel de administración.</w:t>
+      </w:r>
+    </w:p>
+    <w:p>
+      <w:pPr>
+        <w:pStyle w:val="Prrafodelista"/>
+        <w:numPr>
+          <w:ilvl w:val="0"/>
+          <w:numId w:val="12"/>
+        </w:numPr>
+      </w:pPr>
+      <w:r>
+        <w:t>Iniciar sesión con un usuario autorizado.</w:t>
+      </w:r>
+    </w:p>
+    <w:p>
+      <w:pPr>
+        <w:pStyle w:val="Prrafodelista"/>
+        <w:numPr>
+          <w:ilvl w:val="0"/>
+          <w:numId w:val="12"/>
+        </w:numPr>
+      </w:pPr>
+      <w:r>
+        <w:t>Entrar en la sección de gestión de canciones.</w:t>
+      </w:r>
+    </w:p>
+    <w:p>
+      <w:pPr>
+        <w:rPr>
+          <w:b/>
+          <w:bCs/>
+        </w:rPr>
+      </w:pPr>
+      <w:r>
+        <w:rPr>
+          <w:b/>
+          <w:bCs/>
+        </w:rPr>
+        <w:t>Creación de una nueva canción</w:t>
+      </w:r>
+    </w:p>
+    <w:p>
+      <w:r>
+        <w:t>Seleccionar la opción correspondiente para añadir una nueva canción al catálogo.</w:t>
+      </w:r>
+    </w:p>
+    <w:p>
+      <w:pPr>
+        <w:rPr>
+          <w:b/>
+          <w:bCs/>
+        </w:rPr>
+      </w:pPr>
+      <w:r>
+        <w:rPr>
+          <w:b/>
+          <w:bCs/>
+        </w:rPr>
+        <w:t>Información obligatoria</w:t>
+      </w:r>
+    </w:p>
+    <w:p>
+      <w:r>
+        <w:lastRenderedPageBreak/>
+        <w:t>Introducir los siguientes datos:</w:t>
+      </w:r>
+    </w:p>
+    <w:p>
+      <w:pPr>
+        <w:rPr>
+          <w:b/>
+          <w:bCs/>
+        </w:rPr>
+      </w:pPr>
+      <w:r>
+        <w:rPr>
+          <w:b/>
+          <w:bCs/>
+        </w:rPr>
+        <w:t>Artista</w:t>
+      </w:r>
+    </w:p>
+    <w:p>
+      <w:r>
+        <w:t>Nombre del artista o grupo musical.</w:t>
+      </w:r>
+    </w:p>
+    <w:p>
+      <w:r>
+        <w:t>Ejemplos:</w:t>
+      </w:r>
+    </w:p>
+    <w:p>
+      <w:pPr>
+        <w:pStyle w:val="Prrafodelista"/>
+        <w:numPr>
+          <w:ilvl w:val="0"/>
+          <w:numId w:val="13"/>
+        </w:numPr>
+      </w:pPr>
+      <w:r>
+        <w:t>Queen</w:t>
+      </w:r>
+    </w:p>
+    <w:p>
+      <w:pPr>
+        <w:pStyle w:val="Prrafodelista"/>
+        <w:numPr>
+          <w:ilvl w:val="0"/>
+          <w:numId w:val="13"/>
+        </w:numPr>
+      </w:pPr>
+      <w:r>
+        <w:t>Alejandro Sanz</w:t>
+      </w:r>
+    </w:p>
+    <w:p>
+      <w:pPr>
+        <w:pStyle w:val="Prrafodelista"/>
+        <w:numPr>
+          <w:ilvl w:val="0"/>
+          <w:numId w:val="13"/>
+        </w:numPr>
+      </w:pPr>
+      <w:r>
+        <w:t>Mecano</w:t>
+      </w:r>
+    </w:p>
+    <w:p>
+      <w:pPr>
+        <w:rPr>
+          <w:b/>
+          <w:bCs/>
+        </w:rPr>
+      </w:pPr>
+      <w:r>
+        <w:rPr>
+          <w:b/>
+          <w:bCs/>
+        </w:rPr>
+        <w:t>Título</w:t>
+      </w:r>
+    </w:p>
+    <w:p>
+      <w:r>
+        <w:t>Nombre completo de la canción.</w:t>
+      </w:r>
+    </w:p>
+    <w:p>
+      <w:r>
+        <w:t>Ejemplos:</w:t>
+      </w:r>
+    </w:p>
+    <w:p>
+      <w:pPr>
+        <w:pStyle w:val="Prrafodelista"/>
+        <w:numPr>
+          <w:ilvl w:val="0"/>
+          <w:numId w:val="14"/>
+        </w:numPr>
+      </w:pPr>
+      <w:r>
+        <w:t>Bohemian Rhapsody</w:t>
+      </w:r>
+    </w:p>
+    <w:p>
+      <w:pPr>
+        <w:pStyle w:val="Prrafodelista"/>
+        <w:numPr>
+          <w:ilvl w:val="0"/>
+          <w:numId w:val="14"/>
+        </w:numPr>
+      </w:pPr>
+      <w:r>
+        <w:t>Corazón Partío</w:t>
+      </w:r>
+    </w:p>
+    <w:p>
+      <w:pPr>
+        <w:pStyle w:val="Prrafodelista"/>
+        <w:numPr>
+          <w:ilvl w:val="0"/>
+          <w:numId w:val="14"/>
+        </w:numPr>
+      </w:pPr>
+      <w:r>
+        <w:t>Hijo de la Luna</w:t>
+      </w:r>
+    </w:p>
+    <w:p>
+      <w:pPr>
+        <w:rPr>
+          <w:b/>
+          <w:bCs/>
+        </w:rPr>
+      </w:pPr>
+      <w:r>
+        <w:rPr>
+          <w:b/>
+          <w:bCs/>
+        </w:rPr>
+        <w:t>Carga de archivos</w:t>
+      </w:r>
+    </w:p>
+    <w:p>
+      <w:r>
+        <w:t>Adjuntar los archivos generados durante los pasos anteriores:</w:t>
+      </w:r>
+    </w:p>
+    <w:p>
+      <w:pPr>
+        <w:rPr>
+          <w:b/>
+          <w:bCs/>
+        </w:rPr>
+      </w:pPr>
+      <w:r>
+        <w:rPr>
+          <w:b/>
+          <w:bCs/>
+        </w:rPr>
+        <w:t>Archivo de voz</w:t>
+      </w:r>
+    </w:p>
+    <w:p>
+      <w:r>
+        <w:t xml:space="preserve">Archivo obtenido desde </w:t>
+      </w:r>
+      <w:r>
+        <w:rPr>
+          <w:b/>
+          <w:bCs/>
+        </w:rPr>
+        <w:t>Moises</w:t>
+      </w:r>
+      <w:r>
+        <w:t xml:space="preserve"> que contiene únicamente la voz de la canción.</w:t>
+      </w:r>
+    </w:p>
+    <w:p>
+      <w:pPr>
+        <w:rPr>
+          <w:b/>
+          <w:bCs/>
+        </w:rPr>
+      </w:pPr>
+      <w:r>
+        <w:rPr>
+          <w:b/>
+          <w:bCs/>
+        </w:rPr>
+        <w:t>Archivo instrumental</w:t>
+      </w:r>
+    </w:p>
+    <w:p>
+      <w:r>
+        <w:t xml:space="preserve">Archivo instrumental generado por </w:t>
+      </w:r>
+      <w:r>
+        <w:rPr>
+          <w:b/>
+          <w:bCs/>
+        </w:rPr>
+        <w:t>Moises</w:t>
+      </w:r>
+      <w:r>
+        <w:t xml:space="preserve"> que será utilizado como base musical para el karaoke.</w:t>
+      </w:r>
+    </w:p>
+    <w:p>
+      <w:pPr>
+        <w:rPr>
+          <w:b/>
+          <w:bCs/>
+        </w:rPr>
+      </w:pPr>
+      <w:r>
+        <w:rPr>
+          <w:b/>
+          <w:bCs/>
+        </w:rPr>
+        <w:t>Archivo LRC</w:t>
+      </w:r>
+    </w:p>
+    <w:p>
+      <w:r>
+        <w:t xml:space="preserve">Archivo de letra sincronizada generado mediante </w:t>
+      </w:r>
+      <w:r>
+        <w:rPr>
+          <w:b/>
+          <w:bCs/>
+        </w:rPr>
+        <w:t>QuickLRC</w:t>
+      </w:r>
+      <w:r>
+        <w:t>.</w:t>
+      </w:r>
+    </w:p>
+    <w:p/>
+    <w:p>
+      <w:pPr>
+        <w:rPr>
+          <w:b/>
+          <w:bCs/>
+        </w:rPr>
+      </w:pPr>
+      <w:r>
+        <w:rPr>
+          <w:b/>
+          <w:bCs/>
+        </w:rPr>
+        <w:t>Verificación</w:t>
+      </w:r>
+    </w:p>
+    <w:p>
+      <w:r>
+        <w:t>Antes de guardar la canción:</w:t>
+      </w:r>
+    </w:p>
+    <w:p>
+      <w:pPr>
+        <w:pStyle w:val="Prrafodelista"/>
+        <w:numPr>
+          <w:ilvl w:val="0"/>
+          <w:numId w:val="15"/>
+        </w:numPr>
+      </w:pPr>
+      <w:r>
+        <w:t>Comprobar que los archivos correctos han sido seleccionados.</w:t>
+      </w:r>
+    </w:p>
+    <w:p>
+      <w:pPr>
+        <w:pStyle w:val="Prrafodelista"/>
+        <w:numPr>
+          <w:ilvl w:val="0"/>
+          <w:numId w:val="15"/>
+        </w:numPr>
+      </w:pPr>
+      <w:r>
+        <w:t>Revisar el nombre del artista.</w:t>
+      </w:r>
+    </w:p>
+    <w:p>
+      <w:pPr>
+        <w:pStyle w:val="Prrafodelista"/>
+        <w:numPr>
+          <w:ilvl w:val="0"/>
+          <w:numId w:val="15"/>
+        </w:numPr>
+      </w:pPr>
+      <w:r>
+        <w:t>Revisar el título de la canción.</w:t>
+      </w:r>
+    </w:p>
+    <w:p>
+      <w:pPr>
+        <w:pStyle w:val="Prrafodelista"/>
+        <w:numPr>
+          <w:ilvl w:val="0"/>
+          <w:numId w:val="15"/>
+        </w:numPr>
+      </w:pPr>
+      <w:r>
+        <w:t>Verificar que el archivo LRC corresponde a la misma versión de la canción.</w:t>
+      </w:r>
+    </w:p>
+    <w:p>
+      <w:r>
+        <w:rPr>
+          <w:b/>
+          <w:bCs/>
+        </w:rPr>
+        <w:t>Guardado</w:t>
+      </w:r>
+    </w:p>
+    <w:p>
+      <w:r>
+        <w:t>Una vez comprobados todos los datos:</w:t>
+      </w:r>
+    </w:p>
+    <w:p>
+      <w:pPr>
+        <w:pStyle w:val="Prrafodelista"/>
+        <w:numPr>
+          <w:ilvl w:val="0"/>
+          <w:numId w:val="16"/>
+        </w:numPr>
+      </w:pPr>
+      <w:r>
+        <w:t>Pulsar el botón de guardar canción.</w:t>
+      </w:r>
+    </w:p>
+    <w:p>
+      <w:pPr>
+        <w:pStyle w:val="Prrafodelista"/>
+        <w:numPr>
+          <w:ilvl w:val="0"/>
+          <w:numId w:val="16"/>
+        </w:numPr>
+      </w:pPr>
+      <w:r>
+        <w:t>Esperar a que finalice la carga de archivos.</w:t>
+      </w:r>
+    </w:p>
+    <w:p>
+      <w:pPr>
+        <w:pStyle w:val="Prrafodelista"/>
+        <w:numPr>
+          <w:ilvl w:val="0"/>
+          <w:numId w:val="16"/>
+        </w:numPr>
+      </w:pPr>
+      <w:r>
+        <w:t>Confirmar que la canción aparece en el listado de canciones disponibles.</w:t>
+      </w:r>
+    </w:p>
+    <w:p/>
+    <w:p>
+      <w:r>
+        <w:rPr>
+          <w:noProof/>
+        </w:rPr>
+        <w:lastRenderedPageBreak/>
+        <w:drawing>
+          <wp:inline distT="0" distB="0" distL="0" distR="0" wp14:anchorId="1D815C63" wp14:editId="71601EFD">
+            <wp:extent cx="5400040" cy="2522855"/>
+            <wp:effectExtent l="0" t="0" r="0" b="0"/>
+            <wp:docPr id="33" name="Imagen 33"/>
+            <wp:cNvGraphicFramePr>
+              <a:graphicFrameLocks xmlns:a="http://schemas.openxmlformats.org/drawingml/2006/main" noChangeAspect="1"/>
+            </wp:cNvGraphicFramePr>
+            <a:graphic xmlns:a="http://schemas.openxmlformats.org/drawingml/2006/main">
+              <a:graphicData uri="http://schemas.openxmlformats.org/drawingml/2006/picture">
+                <pic:pic xmlns:pic="http://schemas.openxmlformats.org/drawingml/2006/picture">
+                  <pic:nvPicPr>
+                    <pic:cNvPr id="1" name=""/>
+                    <pic:cNvPicPr/>
+                  </pic:nvPicPr>
+                  <pic:blipFill>
+                    <a:blip r:embed="rId33"/>
+                    <a:stretch>
+                      <a:fillRect/>
+                    </a:stretch>
+                  </pic:blipFill>
+                  <pic:spPr>
+                    <a:xfrm>
+                      <a:off x="0" y="0"/>
                       <a:ext cx="5400040" cy="2522855"/>
                     </a:xfrm>
                     <a:prstGeom prst="rect">
@@ -8878,7 +9743,7 @@
       </w:pPr>
       <w:bookmarkStart w:id="38" w:name="_Toc231392594"/>
       <w:r>
-        <w:t>14.5. Paso 5. Comprobación final</w:t>
+        <w:t>14.5. Comprobación final</w:t>
       </w:r>
       <w:bookmarkEnd w:id="38"/>
     </w:p>
@@ -8978,72 +9843,72 @@
       </w:pPr>
       <w:bookmarkStart w:id="39" w:name="_Toc231392595"/>
       <w:r>
+        <w:t>15. Alternativa de pago para generación automática de karaoke: Youka</w:t>
+      </w:r>
+      <w:bookmarkEnd w:id="39"/>
+    </w:p>
+    <w:p/>
+    <w:p>
+      <w:r>
+        <w:rPr>
+          <w:b/>
+          <w:bCs/>
+        </w:rPr>
+        <w:t>Youka</w:t>
+      </w:r>
+      <w:r>
+        <w:t xml:space="preserve"> es una herramienta web diseñada para crear vídeos de karaoke de forma casi automática a partir de un archivo de audio MP3. Su objetivo es simplificar todo el flujo de trabajo habitual (separación de pistas, obtención de letra, sincronización y creación de vídeo final) en un único proceso.</w:t>
+      </w:r>
+    </w:p>
+    <w:p>
+      <w:pPr>
+        <w:rPr>
+          <w:b/>
+          <w:bCs/>
+        </w:rPr>
+      </w:pPr>
+      <w:r>
+        <w:rPr>
+          <w:b/>
+          <w:bCs/>
+        </w:rPr>
+        <w:t>¿Cómo funciona?</w:t>
+      </w:r>
+    </w:p>
+    <w:p>
+      <w:r>
+        <w:t xml:space="preserve">El funcionamiento de </w:t>
+      </w:r>
+      <w:r>
+        <w:rPr>
+          <w:b/>
+          <w:bCs/>
+        </w:rPr>
+        <w:t>Youka</w:t>
+      </w:r>
+      <w:r>
+        <w:t xml:space="preserve"> se basa en un sistema automatizado de análisis de audio y sincronización de texto mediante inteligencia artificial.</w:t>
+      </w:r>
+    </w:p>
+    <w:p/>
+    <w:p>
+      <w:pPr>
+        <w:rPr>
+          <w:b/>
+          <w:bCs/>
+        </w:rPr>
+      </w:pPr>
+      <w:r>
+        <w:rPr>
+          <w:b/>
+          <w:bCs/>
+        </w:rPr>
+        <w:t>1. Carga del archivo de audio</w:t>
+      </w:r>
+    </w:p>
+    <w:p>
+      <w:r>
         <w:lastRenderedPageBreak/>
-        <w:t>15. Alternativa de pago para generación automática de karaoke: Youka</w:t>
-      </w:r>
-      <w:bookmarkEnd w:id="39"/>
-    </w:p>
-    <w:p/>
-    <w:p>
-      <w:r>
-        <w:rPr>
-          <w:b/>
-          <w:bCs/>
-        </w:rPr>
-        <w:t>Youka</w:t>
-      </w:r>
-      <w:r>
-        <w:t xml:space="preserve"> es una herramienta web diseñada para crear vídeos de karaoke de forma casi automática a partir de un archivo de audio MP3. Su objetivo es simplificar todo el flujo de trabajo habitual (separación de pistas, obtención de letra, sincronización y creación de vídeo final) en un único proceso.</w:t>
-      </w:r>
-    </w:p>
-    <w:p>
-      <w:pPr>
-        <w:rPr>
-          <w:b/>
-          <w:bCs/>
-        </w:rPr>
-      </w:pPr>
-      <w:r>
-        <w:rPr>
-          <w:b/>
-          <w:bCs/>
-        </w:rPr>
-        <w:t>¿Cómo funciona?</w:t>
-      </w:r>
-    </w:p>
-    <w:p>
-      <w:r>
-        <w:t xml:space="preserve">El funcionamiento de </w:t>
-      </w:r>
-      <w:r>
-        <w:rPr>
-          <w:b/>
-          <w:bCs/>
-        </w:rPr>
-        <w:t>Youka</w:t>
-      </w:r>
-      <w:r>
-        <w:t xml:space="preserve"> se basa en un sistema automatizado de análisis de audio y sincronización de texto mediante inteligencia artificial.</w:t>
-      </w:r>
-    </w:p>
-    <w:p/>
-    <w:p>
-      <w:pPr>
-        <w:rPr>
-          <w:b/>
-          <w:bCs/>
-        </w:rPr>
-      </w:pPr>
-      <w:r>
-        <w:rPr>
-          <w:b/>
-          <w:bCs/>
-        </w:rPr>
-        <w:t>1. Carga del archivo de audio</w:t>
-      </w:r>
-    </w:p>
-    <w:p>
-      <w:r>
         <w:t>El usuario sube un archivo en formato MP3 que contiene la canción original completa.</w:t>
       </w:r>
     </w:p>
@@ -9375,6 +10240,7 @@
     </w:p>
     <w:p>
       <w:r>
+        <w:lastRenderedPageBreak/>
         <w:t>El usuario puede exportar el resultado final en distintos formatos, normalmente:</w:t>
       </w:r>
     </w:p>
@@ -9500,7 +10366,10 @@
         <w:pStyle w:val="Ttulo1"/>
       </w:pPr>
       <w:r>
-        <w:t>17. Conclusión</w:t>
+        <w:t>16</w:t>
+      </w:r>
+      <w:r>
+        <w:t>. Conclusión</w:t>
       </w:r>
     </w:p>
     <w:p/>
@@ -9517,43 +10386,37 @@
         <w:ind w:left="360"/>
       </w:pPr>
       <w:r>
-        <w:t xml:space="preserve">Durante el desarrollo hemos conseguido prácticamente todos los objetivos que nos propusimos al inicio. La aplicación funciona de forma estable y permite reproducir canciones con la letra sincronizada en vídeo, que era una de las partes más importantes del proyecto. Aunque nos habría gustado ir un paso más allá e </w:t>
-      </w:r>
+        <w:t>Durante el desarrollo hemos conseguido prácticamente todos los objetivos que nos propusimos al inicio. La aplicación funciona de forma estable y permite reproducir canciones con la letra sincronizada en vídeo, que era una de las partes más importantes del proyecto. Aunque nos habría gustado ir un paso más allá e implementar la posibilidad de añadir cualquier canción de forma directa, esta funcionalidad no ha sido posible por la complejidad técnica que conlleva.</w:t>
+      </w:r>
+    </w:p>
+    <w:p>
+      <w:pPr>
+        <w:ind w:left="360"/>
+      </w:pPr>
+      <w:r>
+        <w:t>Uno de los mayores retos ha sido la gestión de las canciones y todo el proceso necesario para prepararlas (instrumental, voz, etc.), ya que requiere bastante trabajo previo y no es algo sencillo de automatizar. También ha sido complicado conseguir una buena integración de las letras con el vídeo, ya que es una parte delicada del sistema y ha requerido bastante prueba y error.</w:t>
+      </w:r>
+    </w:p>
+    <w:p>
+      <w:pPr>
+        <w:ind w:left="360"/>
+      </w:pPr>
+      <w:r>
+        <w:t xml:space="preserve">Además, el desarrollo del proyecto se ha ido realizando a lo largo del curso, lo que ha hecho que no siempre se pudiera avanzar de forma totalmente continua. La alternancia con otros proyectos, exámenes y posteriormente las prácticas ha provocado que en algunos momentos fuera necesario retomar el trabajo tras periodos sin dedicarle </w:t>
+      </w:r>
+      <w:r>
+        <w:t>tiempo, y esta falta de continuidad ha afectado en ciertos momentos, ya que a veces costaba retomar el proyecto después de varios días sin trabajarlo</w:t>
+      </w:r>
+      <w:r>
+        <w:t>.</w:t>
+      </w:r>
+    </w:p>
+    <w:p>
+      <w:pPr>
+        <w:ind w:left="360"/>
+      </w:pPr>
       <w:r>
         <w:lastRenderedPageBreak/>
-        <w:t>implementar la posibilidad de añadir cualquier canción de forma directa, esta funcionalidad no ha sido posible por la complejidad técnica que conlleva.</w:t>
-      </w:r>
-    </w:p>
-    <w:p>
-      <w:pPr>
-        <w:ind w:left="360"/>
-      </w:pPr>
-      <w:r>
-        <w:t>Uno de los mayores retos ha sido la gestión de las canciones y todo el proceso necesario para prepararlas (instrumental, voz, etc.), ya que requiere bastante trabajo previo y no es algo sencillo de automatizar. También ha sido complicado conseguir una buena integración de las letras con el vídeo, ya que es una parte delicada del sistema y ha requerido bastante prueba y error.</w:t>
-      </w:r>
-    </w:p>
-    <w:p>
-      <w:pPr>
-        <w:ind w:left="360"/>
-      </w:pPr>
-      <w:r>
-        <w:t xml:space="preserve">Además, el desarrollo del proyecto se ha ido realizando a lo largo del curso, lo que ha hecho que no siempre se pudiera avanzar de forma totalmente continua. La alternancia con otros proyectos, exámenes y posteriormente las prácticas ha provocado que en algunos momentos fuera necesario retomar el trabajo tras periodos sin dedicarle </w:t>
-      </w:r>
-      <w:r>
-        <w:t>tiempo, y e</w:t>
-      </w:r>
-      <w:r>
-        <w:t>sta falta de continuidad ha afectado en ciertos momentos, ya que a veces costaba retomar el proyecto después de varios días sin trabajarlo</w:t>
-      </w:r>
-      <w:r>
-        <w:t>.</w:t>
-      </w:r>
-    </w:p>
-    <w:p>
-      <w:pPr>
-        <w:ind w:left="360"/>
-      </w:pPr>
-      <w:r>
         <w:t>Aun así, estamos bastante satisfechos con el resultado final. El proyecto funciona correctamente y cumple su objetivo principal, aunque evidentemente siempre hay cosas que se podrían seguir mejorando.</w:t>
       </w:r>
     </w:p>
@@ -9575,12 +10438,12 @@
     <w:p/>
     <w:p/>
     <w:sectPr>
-      <w:headerReference w:type="even" r:id="rId30"/>
-      <w:headerReference w:type="default" r:id="rId31"/>
-      <w:footerReference w:type="even" r:id="rId32"/>
-      <w:footerReference w:type="default" r:id="rId33"/>
-      <w:headerReference w:type="first" r:id="rId34"/>
-      <w:footerReference w:type="first" r:id="rId35"/>
+      <w:headerReference w:type="even" r:id="rId34"/>
+      <w:headerReference w:type="default" r:id="rId35"/>
+      <w:footerReference w:type="even" r:id="rId36"/>
+      <w:footerReference w:type="default" r:id="rId37"/>
+      <w:headerReference w:type="first" r:id="rId38"/>
+      <w:footerReference w:type="first" r:id="rId39"/>
       <w:pgSz w:w="11906" w:h="16838"/>
       <w:pgMar w:top="1417" w:right="1701" w:bottom="1417" w:left="1701" w:header="708" w:footer="708" w:gutter="0"/>
       <w:cols w:space="708"/>
@@ -10718,6 +11581,119 @@
     </w:lvl>
   </w:abstractNum>
   <w:abstractNum w:abstractNumId="5" w15:restartNumberingAfterBreak="0">
+    <w:nsid w:val="24DA0A09"/>
+    <w:multiLevelType w:val="multilevel"/>
+    <w:tmpl w:val="3F5E4B3E"/>
+    <w:lvl w:ilvl="0">
+      <w:start w:val="1"/>
+      <w:numFmt w:val="decimal"/>
+      <w:lvlText w:val="%1."/>
+      <w:lvlJc w:val="left"/>
+      <w:pPr>
+        <w:tabs>
+          <w:tab w:val="num" w:pos="720"/>
+        </w:tabs>
+        <w:ind w:left="720" w:hanging="360"/>
+      </w:pPr>
+    </w:lvl>
+    <w:lvl w:ilvl="1" w:tentative="1">
+      <w:start w:val="1"/>
+      <w:numFmt w:val="decimal"/>
+      <w:lvlText w:val="%2."/>
+      <w:lvlJc w:val="left"/>
+      <w:pPr>
+        <w:tabs>
+          <w:tab w:val="num" w:pos="1440"/>
+        </w:tabs>
+        <w:ind w:left="1440" w:hanging="360"/>
+      </w:pPr>
+    </w:lvl>
+    <w:lvl w:ilvl="2" w:tentative="1">
+      <w:start w:val="1"/>
+      <w:numFmt w:val="decimal"/>
+      <w:lvlText w:val="%3."/>
+      <w:lvlJc w:val="left"/>
+      <w:pPr>
+        <w:tabs>
+          <w:tab w:val="num" w:pos="2160"/>
+        </w:tabs>
+        <w:ind w:left="2160" w:hanging="360"/>
+      </w:pPr>
+    </w:lvl>
+    <w:lvl w:ilvl="3" w:tentative="1">
+      <w:start w:val="1"/>
+      <w:numFmt w:val="decimal"/>
+      <w:lvlText w:val="%4."/>
+      <w:lvlJc w:val="left"/>
+      <w:pPr>
+        <w:tabs>
+          <w:tab w:val="num" w:pos="2880"/>
+        </w:tabs>
+        <w:ind w:left="2880" w:hanging="360"/>
+      </w:pPr>
+    </w:lvl>
+    <w:lvl w:ilvl="4" w:tentative="1">
+      <w:start w:val="1"/>
+      <w:numFmt w:val="decimal"/>
+      <w:lvlText w:val="%5."/>
+      <w:lvlJc w:val="left"/>
+      <w:pPr>
+        <w:tabs>
+          <w:tab w:val="num" w:pos="3600"/>
+        </w:tabs>
+        <w:ind w:left="3600" w:hanging="360"/>
+      </w:pPr>
+    </w:lvl>
+    <w:lvl w:ilvl="5" w:tentative="1">
+      <w:start w:val="1"/>
+      <w:numFmt w:val="decimal"/>
+      <w:lvlText w:val="%6."/>
+      <w:lvlJc w:val="left"/>
+      <w:pPr>
+        <w:tabs>
+          <w:tab w:val="num" w:pos="4320"/>
+        </w:tabs>
+        <w:ind w:left="4320" w:hanging="360"/>
+      </w:pPr>
+    </w:lvl>
+    <w:lvl w:ilvl="6" w:tentative="1">
+      <w:start w:val="1"/>
+      <w:numFmt w:val="decimal"/>
+      <w:lvlText w:val="%7."/>
+      <w:lvlJc w:val="left"/>
+      <w:pPr>
+        <w:tabs>
+          <w:tab w:val="num" w:pos="5040"/>
+        </w:tabs>
+        <w:ind w:left="5040" w:hanging="360"/>
+      </w:pPr>
+    </w:lvl>
+    <w:lvl w:ilvl="7" w:tentative="1">
+      <w:start w:val="1"/>
+      <w:numFmt w:val="decimal"/>
+      <w:lvlText w:val="%8."/>
+      <w:lvlJc w:val="left"/>
+      <w:pPr>
+        <w:tabs>
+          <w:tab w:val="num" w:pos="5760"/>
+        </w:tabs>
+        <w:ind w:left="5760" w:hanging="360"/>
+      </w:pPr>
+    </w:lvl>
+    <w:lvl w:ilvl="8" w:tentative="1">
+      <w:start w:val="1"/>
+      <w:numFmt w:val="decimal"/>
+      <w:lvlText w:val="%9."/>
+      <w:lvlJc w:val="left"/>
+      <w:pPr>
+        <w:tabs>
+          <w:tab w:val="num" w:pos="6480"/>
+        </w:tabs>
+        <w:ind w:left="6480" w:hanging="360"/>
+      </w:pPr>
+    </w:lvl>
+  </w:abstractNum>
+  <w:abstractNum w:abstractNumId="6" w15:restartNumberingAfterBreak="0">
     <w:nsid w:val="2869109A"/>
     <w:multiLevelType w:val="hybridMultilevel"/>
     <w:tmpl w:val="1914964A"/>
@@ -10803,7 +11779,7 @@
       </w:pPr>
     </w:lvl>
   </w:abstractNum>
-  <w:abstractNum w:abstractNumId="6" w15:restartNumberingAfterBreak="0">
+  <w:abstractNum w:abstractNumId="7" w15:restartNumberingAfterBreak="0">
     <w:nsid w:val="288E164D"/>
     <w:multiLevelType w:val="hybridMultilevel"/>
     <w:tmpl w:val="9A5894BE"/>
@@ -10916,7 +11892,7 @@
       </w:rPr>
     </w:lvl>
   </w:abstractNum>
-  <w:abstractNum w:abstractNumId="7" w15:restartNumberingAfterBreak="0">
+  <w:abstractNum w:abstractNumId="8" w15:restartNumberingAfterBreak="0">
     <w:nsid w:val="2F422D7A"/>
     <w:multiLevelType w:val="hybridMultilevel"/>
     <w:tmpl w:val="BCC8B54C"/>
@@ -11002,7 +11978,7 @@
       </w:pPr>
     </w:lvl>
   </w:abstractNum>
-  <w:abstractNum w:abstractNumId="8" w15:restartNumberingAfterBreak="0">
+  <w:abstractNum w:abstractNumId="9" w15:restartNumberingAfterBreak="0">
     <w:nsid w:val="321A5B17"/>
     <w:multiLevelType w:val="hybridMultilevel"/>
     <w:tmpl w:val="99CEF0D4"/>
@@ -11115,7 +12091,7 @@
       </w:rPr>
     </w:lvl>
   </w:abstractNum>
-  <w:abstractNum w:abstractNumId="9" w15:restartNumberingAfterBreak="0">
+  <w:abstractNum w:abstractNumId="10" w15:restartNumberingAfterBreak="0">
     <w:nsid w:val="32FC1C84"/>
     <w:multiLevelType w:val="hybridMultilevel"/>
     <w:tmpl w:val="400EE53E"/>
@@ -11228,7 +12204,7 @@
       </w:rPr>
     </w:lvl>
   </w:abstractNum>
-  <w:abstractNum w:abstractNumId="10" w15:restartNumberingAfterBreak="0">
+  <w:abstractNum w:abstractNumId="11" w15:restartNumberingAfterBreak="0">
     <w:nsid w:val="437348AB"/>
     <w:multiLevelType w:val="hybridMultilevel"/>
     <w:tmpl w:val="F856A834"/>
@@ -11341,7 +12317,7 @@
       </w:rPr>
     </w:lvl>
   </w:abstractNum>
-  <w:abstractNum w:abstractNumId="11" w15:restartNumberingAfterBreak="0">
+  <w:abstractNum w:abstractNumId="12" w15:restartNumberingAfterBreak="0">
     <w:nsid w:val="46027AE1"/>
     <w:multiLevelType w:val="hybridMultilevel"/>
     <w:tmpl w:val="CE201B0E"/>
@@ -11427,7 +12403,7 @@
       </w:pPr>
     </w:lvl>
   </w:abstractNum>
-  <w:abstractNum w:abstractNumId="12" w15:restartNumberingAfterBreak="0">
+  <w:abstractNum w:abstractNumId="13" w15:restartNumberingAfterBreak="0">
     <w:nsid w:val="476B132C"/>
     <w:multiLevelType w:val="hybridMultilevel"/>
     <w:tmpl w:val="80500C3E"/>
@@ -11513,7 +12489,7 @@
       </w:pPr>
     </w:lvl>
   </w:abstractNum>
-  <w:abstractNum w:abstractNumId="13" w15:restartNumberingAfterBreak="0">
+  <w:abstractNum w:abstractNumId="14" w15:restartNumberingAfterBreak="0">
     <w:nsid w:val="49B619C0"/>
     <w:multiLevelType w:val="hybridMultilevel"/>
     <w:tmpl w:val="3EAA80BE"/>
@@ -11626,7 +12602,7 @@
       </w:rPr>
     </w:lvl>
   </w:abstractNum>
-  <w:abstractNum w:abstractNumId="14" w15:restartNumberingAfterBreak="0">
+  <w:abstractNum w:abstractNumId="15" w15:restartNumberingAfterBreak="0">
     <w:nsid w:val="4C8C5DF6"/>
     <w:multiLevelType w:val="hybridMultilevel"/>
     <w:tmpl w:val="E1DA154C"/>
@@ -11739,7 +12715,233 @@
       </w:rPr>
     </w:lvl>
   </w:abstractNum>
-  <w:abstractNum w:abstractNumId="15" w15:restartNumberingAfterBreak="0">
+  <w:abstractNum w:abstractNumId="16" w15:restartNumberingAfterBreak="0">
+    <w:nsid w:val="4E740F86"/>
+    <w:multiLevelType w:val="hybridMultilevel"/>
+    <w:tmpl w:val="78306706"/>
+    <w:lvl w:ilvl="0" w:tplc="0C0A000D">
+      <w:start w:val="1"/>
+      <w:numFmt w:val="bullet"/>
+      <w:lvlText w:val=""/>
+      <w:lvlJc w:val="left"/>
+      <w:pPr>
+        <w:ind w:left="720" w:hanging="360"/>
+      </w:pPr>
+      <w:rPr>
+        <w:rFonts w:ascii="Wingdings" w:hAnsi="Wingdings" w:hint="default"/>
+      </w:rPr>
+    </w:lvl>
+    <w:lvl w:ilvl="1" w:tplc="0C0A0003" w:tentative="1">
+      <w:start w:val="1"/>
+      <w:numFmt w:val="bullet"/>
+      <w:lvlText w:val="o"/>
+      <w:lvlJc w:val="left"/>
+      <w:pPr>
+        <w:ind w:left="1440" w:hanging="360"/>
+      </w:pPr>
+      <w:rPr>
+        <w:rFonts w:ascii="Courier New" w:hAnsi="Courier New" w:cs="Courier New" w:hint="default"/>
+      </w:rPr>
+    </w:lvl>
+    <w:lvl w:ilvl="2" w:tplc="0C0A0005" w:tentative="1">
+      <w:start w:val="1"/>
+      <w:numFmt w:val="bullet"/>
+      <w:lvlText w:val=""/>
+      <w:lvlJc w:val="left"/>
+      <w:pPr>
+        <w:ind w:left="2160" w:hanging="360"/>
+      </w:pPr>
+      <w:rPr>
+        <w:rFonts w:ascii="Wingdings" w:hAnsi="Wingdings" w:hint="default"/>
+      </w:rPr>
+    </w:lvl>
+    <w:lvl w:ilvl="3" w:tplc="0C0A0001" w:tentative="1">
+      <w:start w:val="1"/>
+      <w:numFmt w:val="bullet"/>
+      <w:lvlText w:val=""/>
+      <w:lvlJc w:val="left"/>
+      <w:pPr>
+        <w:ind w:left="2880" w:hanging="360"/>
+      </w:pPr>
+      <w:rPr>
+        <w:rFonts w:ascii="Symbol" w:hAnsi="Symbol" w:hint="default"/>
+      </w:rPr>
+    </w:lvl>
+    <w:lvl w:ilvl="4" w:tplc="0C0A0003" w:tentative="1">
+      <w:start w:val="1"/>
+      <w:numFmt w:val="bullet"/>
+      <w:lvlText w:val="o"/>
+      <w:lvlJc w:val="left"/>
+      <w:pPr>
+        <w:ind w:left="3600" w:hanging="360"/>
+      </w:pPr>
+      <w:rPr>
+        <w:rFonts w:ascii="Courier New" w:hAnsi="Courier New" w:cs="Courier New" w:hint="default"/>
+      </w:rPr>
+    </w:lvl>
+    <w:lvl w:ilvl="5" w:tplc="0C0A0005" w:tentative="1">
+      <w:start w:val="1"/>
+      <w:numFmt w:val="bullet"/>
+      <w:lvlText w:val=""/>
+      <w:lvlJc w:val="left"/>
+      <w:pPr>
+        <w:ind w:left="4320" w:hanging="360"/>
+      </w:pPr>
+      <w:rPr>
+        <w:rFonts w:ascii="Wingdings" w:hAnsi="Wingdings" w:hint="default"/>
+      </w:rPr>
+    </w:lvl>
+    <w:lvl w:ilvl="6" w:tplc="0C0A0001" w:tentative="1">
+      <w:start w:val="1"/>
+      <w:numFmt w:val="bullet"/>
+      <w:lvlText w:val=""/>
+      <w:lvlJc w:val="left"/>
+      <w:pPr>
+        <w:ind w:left="5040" w:hanging="360"/>
+      </w:pPr>
+      <w:rPr>
+        <w:rFonts w:ascii="Symbol" w:hAnsi="Symbol" w:hint="default"/>
+      </w:rPr>
+    </w:lvl>
+    <w:lvl w:ilvl="7" w:tplc="0C0A0003" w:tentative="1">
+      <w:start w:val="1"/>
+      <w:numFmt w:val="bullet"/>
+      <w:lvlText w:val="o"/>
+      <w:lvlJc w:val="left"/>
+      <w:pPr>
+        <w:ind w:left="5760" w:hanging="360"/>
+      </w:pPr>
+      <w:rPr>
+        <w:rFonts w:ascii="Courier New" w:hAnsi="Courier New" w:cs="Courier New" w:hint="default"/>
+      </w:rPr>
+    </w:lvl>
+    <w:lvl w:ilvl="8" w:tplc="0C0A0005" w:tentative="1">
+      <w:start w:val="1"/>
+      <w:numFmt w:val="bullet"/>
+      <w:lvlText w:val=""/>
+      <w:lvlJc w:val="left"/>
+      <w:pPr>
+        <w:ind w:left="6480" w:hanging="360"/>
+      </w:pPr>
+      <w:rPr>
+        <w:rFonts w:ascii="Wingdings" w:hAnsi="Wingdings" w:hint="default"/>
+      </w:rPr>
+    </w:lvl>
+  </w:abstractNum>
+  <w:abstractNum w:abstractNumId="17" w15:restartNumberingAfterBreak="0">
+    <w:nsid w:val="4FA07024"/>
+    <w:multiLevelType w:val="multilevel"/>
+    <w:tmpl w:val="DEE48BBA"/>
+    <w:lvl w:ilvl="0">
+      <w:start w:val="1"/>
+      <w:numFmt w:val="decimal"/>
+      <w:lvlText w:val="%1."/>
+      <w:lvlJc w:val="left"/>
+      <w:pPr>
+        <w:tabs>
+          <w:tab w:val="num" w:pos="720"/>
+        </w:tabs>
+        <w:ind w:left="720" w:hanging="360"/>
+      </w:pPr>
+    </w:lvl>
+    <w:lvl w:ilvl="1" w:tentative="1">
+      <w:start w:val="1"/>
+      <w:numFmt w:val="decimal"/>
+      <w:lvlText w:val="%2."/>
+      <w:lvlJc w:val="left"/>
+      <w:pPr>
+        <w:tabs>
+          <w:tab w:val="num" w:pos="1440"/>
+        </w:tabs>
+        <w:ind w:left="1440" w:hanging="360"/>
+      </w:pPr>
+    </w:lvl>
+    <w:lvl w:ilvl="2" w:tentative="1">
+      <w:start w:val="1"/>
+      <w:numFmt w:val="decimal"/>
+      <w:lvlText w:val="%3."/>
+      <w:lvlJc w:val="left"/>
+      <w:pPr>
+        <w:tabs>
+          <w:tab w:val="num" w:pos="2160"/>
+        </w:tabs>
+        <w:ind w:left="2160" w:hanging="360"/>
+      </w:pPr>
+    </w:lvl>
+    <w:lvl w:ilvl="3" w:tentative="1">
+      <w:start w:val="1"/>
+      <w:numFmt w:val="decimal"/>
+      <w:lvlText w:val="%4."/>
+      <w:lvlJc w:val="left"/>
+      <w:pPr>
+        <w:tabs>
+          <w:tab w:val="num" w:pos="2880"/>
+        </w:tabs>
+        <w:ind w:left="2880" w:hanging="360"/>
+      </w:pPr>
+    </w:lvl>
+    <w:lvl w:ilvl="4" w:tentative="1">
+      <w:start w:val="1"/>
+      <w:numFmt w:val="decimal"/>
+      <w:lvlText w:val="%5."/>
+      <w:lvlJc w:val="left"/>
+      <w:pPr>
+        <w:tabs>
+          <w:tab w:val="num" w:pos="3600"/>
+        </w:tabs>
+        <w:ind w:left="3600" w:hanging="360"/>
+      </w:pPr>
+    </w:lvl>
+    <w:lvl w:ilvl="5" w:tentative="1">
+      <w:start w:val="1"/>
+      <w:numFmt w:val="decimal"/>
+      <w:lvlText w:val="%6."/>
+      <w:lvlJc w:val="left"/>
+      <w:pPr>
+        <w:tabs>
+          <w:tab w:val="num" w:pos="4320"/>
+        </w:tabs>
+        <w:ind w:left="4320" w:hanging="360"/>
+      </w:pPr>
+    </w:lvl>
+    <w:lvl w:ilvl="6" w:tentative="1">
+      <w:start w:val="1"/>
+      <w:numFmt w:val="decimal"/>
+      <w:lvlText w:val="%7."/>
+      <w:lvlJc w:val="left"/>
+      <w:pPr>
+        <w:tabs>
+          <w:tab w:val="num" w:pos="5040"/>
+        </w:tabs>
+        <w:ind w:left="5040" w:hanging="360"/>
+      </w:pPr>
+    </w:lvl>
+    <w:lvl w:ilvl="7" w:tentative="1">
+      <w:start w:val="1"/>
+      <w:numFmt w:val="decimal"/>
+      <w:lvlText w:val="%8."/>
+      <w:lvlJc w:val="left"/>
+      <w:pPr>
+        <w:tabs>
+          <w:tab w:val="num" w:pos="5760"/>
+        </w:tabs>
+        <w:ind w:left="5760" w:hanging="360"/>
+      </w:pPr>
+    </w:lvl>
+    <w:lvl w:ilvl="8" w:tentative="1">
+      <w:start w:val="1"/>
+      <w:numFmt w:val="decimal"/>
+      <w:lvlText w:val="%9."/>
+      <w:lvlJc w:val="left"/>
+      <w:pPr>
+        <w:tabs>
+          <w:tab w:val="num" w:pos="6480"/>
+        </w:tabs>
+        <w:ind w:left="6480" w:hanging="360"/>
+      </w:pPr>
+    </w:lvl>
+  </w:abstractNum>
+  <w:abstractNum w:abstractNumId="18" w15:restartNumberingAfterBreak="0">
     <w:nsid w:val="57575F3A"/>
     <w:multiLevelType w:val="hybridMultilevel"/>
     <w:tmpl w:val="DEECA648"/>
@@ -11852,7 +13054,120 @@
       </w:rPr>
     </w:lvl>
   </w:abstractNum>
-  <w:abstractNum w:abstractNumId="16" w15:restartNumberingAfterBreak="0">
+  <w:abstractNum w:abstractNumId="19" w15:restartNumberingAfterBreak="0">
+    <w:nsid w:val="575F19DA"/>
+    <w:multiLevelType w:val="multilevel"/>
+    <w:tmpl w:val="003EC51E"/>
+    <w:lvl w:ilvl="0">
+      <w:start w:val="1"/>
+      <w:numFmt w:val="decimal"/>
+      <w:lvlText w:val="%1."/>
+      <w:lvlJc w:val="left"/>
+      <w:pPr>
+        <w:tabs>
+          <w:tab w:val="num" w:pos="720"/>
+        </w:tabs>
+        <w:ind w:left="720" w:hanging="360"/>
+      </w:pPr>
+    </w:lvl>
+    <w:lvl w:ilvl="1" w:tentative="1">
+      <w:start w:val="1"/>
+      <w:numFmt w:val="decimal"/>
+      <w:lvlText w:val="%2."/>
+      <w:lvlJc w:val="left"/>
+      <w:pPr>
+        <w:tabs>
+          <w:tab w:val="num" w:pos="1440"/>
+        </w:tabs>
+        <w:ind w:left="1440" w:hanging="360"/>
+      </w:pPr>
+    </w:lvl>
+    <w:lvl w:ilvl="2" w:tentative="1">
+      <w:start w:val="1"/>
+      <w:numFmt w:val="decimal"/>
+      <w:lvlText w:val="%3."/>
+      <w:lvlJc w:val="left"/>
+      <w:pPr>
+        <w:tabs>
+          <w:tab w:val="num" w:pos="2160"/>
+        </w:tabs>
+        <w:ind w:left="2160" w:hanging="360"/>
+      </w:pPr>
+    </w:lvl>
+    <w:lvl w:ilvl="3" w:tentative="1">
+      <w:start w:val="1"/>
+      <w:numFmt w:val="decimal"/>
+      <w:lvlText w:val="%4."/>
+      <w:lvlJc w:val="left"/>
+      <w:pPr>
+        <w:tabs>
+          <w:tab w:val="num" w:pos="2880"/>
+        </w:tabs>
+        <w:ind w:left="2880" w:hanging="360"/>
+      </w:pPr>
+    </w:lvl>
+    <w:lvl w:ilvl="4" w:tentative="1">
+      <w:start w:val="1"/>
+      <w:numFmt w:val="decimal"/>
+      <w:lvlText w:val="%5."/>
+      <w:lvlJc w:val="left"/>
+      <w:pPr>
+        <w:tabs>
+          <w:tab w:val="num" w:pos="3600"/>
+        </w:tabs>
+        <w:ind w:left="3600" w:hanging="360"/>
+      </w:pPr>
+    </w:lvl>
+    <w:lvl w:ilvl="5" w:tentative="1">
+      <w:start w:val="1"/>
+      <w:numFmt w:val="decimal"/>
+      <w:lvlText w:val="%6."/>
+      <w:lvlJc w:val="left"/>
+      <w:pPr>
+        <w:tabs>
+          <w:tab w:val="num" w:pos="4320"/>
+        </w:tabs>
+        <w:ind w:left="4320" w:hanging="360"/>
+      </w:pPr>
+    </w:lvl>
+    <w:lvl w:ilvl="6" w:tentative="1">
+      <w:start w:val="1"/>
+      <w:numFmt w:val="decimal"/>
+      <w:lvlText w:val="%7."/>
+      <w:lvlJc w:val="left"/>
+      <w:pPr>
+        <w:tabs>
+          <w:tab w:val="num" w:pos="5040"/>
+        </w:tabs>
+        <w:ind w:left="5040" w:hanging="360"/>
+      </w:pPr>
+    </w:lvl>
+    <w:lvl w:ilvl="7" w:tentative="1">
+      <w:start w:val="1"/>
+      <w:numFmt w:val="decimal"/>
+      <w:lvlText w:val="%8."/>
+      <w:lvlJc w:val="left"/>
+      <w:pPr>
+        <w:tabs>
+          <w:tab w:val="num" w:pos="5760"/>
+        </w:tabs>
+        <w:ind w:left="5760" w:hanging="360"/>
+      </w:pPr>
+    </w:lvl>
+    <w:lvl w:ilvl="8" w:tentative="1">
+      <w:start w:val="1"/>
+      <w:numFmt w:val="decimal"/>
+      <w:lvlText w:val="%9."/>
+      <w:lvlJc w:val="left"/>
+      <w:pPr>
+        <w:tabs>
+          <w:tab w:val="num" w:pos="6480"/>
+        </w:tabs>
+        <w:ind w:left="6480" w:hanging="360"/>
+      </w:pPr>
+    </w:lvl>
+  </w:abstractNum>
+  <w:abstractNum w:abstractNumId="20" w15:restartNumberingAfterBreak="0">
     <w:nsid w:val="5A0D6277"/>
     <w:multiLevelType w:val="hybridMultilevel"/>
     <w:tmpl w:val="99BEBB38"/>
@@ -11938,7 +13253,7 @@
       </w:pPr>
     </w:lvl>
   </w:abstractNum>
-  <w:abstractNum w:abstractNumId="17" w15:restartNumberingAfterBreak="0">
+  <w:abstractNum w:abstractNumId="21" w15:restartNumberingAfterBreak="0">
     <w:nsid w:val="5E482BD9"/>
     <w:multiLevelType w:val="hybridMultilevel"/>
     <w:tmpl w:val="B2B699AA"/>
@@ -12051,7 +13366,7 @@
       </w:rPr>
     </w:lvl>
   </w:abstractNum>
-  <w:abstractNum w:abstractNumId="18" w15:restartNumberingAfterBreak="0">
+  <w:abstractNum w:abstractNumId="22" w15:restartNumberingAfterBreak="0">
     <w:nsid w:val="666C7E07"/>
     <w:multiLevelType w:val="hybridMultilevel"/>
     <w:tmpl w:val="5BF40790"/>
@@ -12137,7 +13452,120 @@
       </w:pPr>
     </w:lvl>
   </w:abstractNum>
-  <w:abstractNum w:abstractNumId="19" w15:restartNumberingAfterBreak="0">
+  <w:abstractNum w:abstractNumId="23" w15:restartNumberingAfterBreak="0">
+    <w:nsid w:val="69E54B23"/>
+    <w:multiLevelType w:val="hybridMultilevel"/>
+    <w:tmpl w:val="71D6B9B2"/>
+    <w:lvl w:ilvl="0" w:tplc="0C0A000D">
+      <w:start w:val="1"/>
+      <w:numFmt w:val="bullet"/>
+      <w:lvlText w:val=""/>
+      <w:lvlJc w:val="left"/>
+      <w:pPr>
+        <w:ind w:left="720" w:hanging="360"/>
+      </w:pPr>
+      <w:rPr>
+        <w:rFonts w:ascii="Wingdings" w:hAnsi="Wingdings" w:hint="default"/>
+      </w:rPr>
+    </w:lvl>
+    <w:lvl w:ilvl="1" w:tplc="0C0A0003" w:tentative="1">
+      <w:start w:val="1"/>
+      <w:numFmt w:val="bullet"/>
+      <w:lvlText w:val="o"/>
+      <w:lvlJc w:val="left"/>
+      <w:pPr>
+        <w:ind w:left="1440" w:hanging="360"/>
+      </w:pPr>
+      <w:rPr>
+        <w:rFonts w:ascii="Courier New" w:hAnsi="Courier New" w:cs="Courier New" w:hint="default"/>
+      </w:rPr>
+    </w:lvl>
+    <w:lvl w:ilvl="2" w:tplc="0C0A0005" w:tentative="1">
+      <w:start w:val="1"/>
+      <w:numFmt w:val="bullet"/>
+      <w:lvlText w:val=""/>
+      <w:lvlJc w:val="left"/>
+      <w:pPr>
+        <w:ind w:left="2160" w:hanging="360"/>
+      </w:pPr>
+      <w:rPr>
+        <w:rFonts w:ascii="Wingdings" w:hAnsi="Wingdings" w:hint="default"/>
+      </w:rPr>
+    </w:lvl>
+    <w:lvl w:ilvl="3" w:tplc="0C0A0001" w:tentative="1">
+      <w:start w:val="1"/>
+      <w:numFmt w:val="bullet"/>
+      <w:lvlText w:val=""/>
+      <w:lvlJc w:val="left"/>
+      <w:pPr>
+        <w:ind w:left="2880" w:hanging="360"/>
+      </w:pPr>
+      <w:rPr>
+        <w:rFonts w:ascii="Symbol" w:hAnsi="Symbol" w:hint="default"/>
+      </w:rPr>
+    </w:lvl>
+    <w:lvl w:ilvl="4" w:tplc="0C0A0003" w:tentative="1">
+      <w:start w:val="1"/>
+      <w:numFmt w:val="bullet"/>
+      <w:lvlText w:val="o"/>
+      <w:lvlJc w:val="left"/>
+      <w:pPr>
+        <w:ind w:left="3600" w:hanging="360"/>
+      </w:pPr>
+      <w:rPr>
+        <w:rFonts w:ascii="Courier New" w:hAnsi="Courier New" w:cs="Courier New" w:hint="default"/>
+      </w:rPr>
+    </w:lvl>
+    <w:lvl w:ilvl="5" w:tplc="0C0A0005" w:tentative="1">
+      <w:start w:val="1"/>
+      <w:numFmt w:val="bullet"/>
+      <w:lvlText w:val=""/>
+      <w:lvlJc w:val="left"/>
+      <w:pPr>
+        <w:ind w:left="4320" w:hanging="360"/>
+      </w:pPr>
+      <w:rPr>
+        <w:rFonts w:ascii="Wingdings" w:hAnsi="Wingdings" w:hint="default"/>
+      </w:rPr>
+    </w:lvl>
+    <w:lvl w:ilvl="6" w:tplc="0C0A0001" w:tentative="1">
+      <w:start w:val="1"/>
+      <w:numFmt w:val="bullet"/>
+      <w:lvlText w:val=""/>
+      <w:lvlJc w:val="left"/>
+      <w:pPr>
+        <w:ind w:left="5040" w:hanging="360"/>
+      </w:pPr>
+      <w:rPr>
+        <w:rFonts w:ascii="Symbol" w:hAnsi="Symbol" w:hint="default"/>
+      </w:rPr>
+    </w:lvl>
+    <w:lvl w:ilvl="7" w:tplc="0C0A0003" w:tentative="1">
+      <w:start w:val="1"/>
+      <w:numFmt w:val="bullet"/>
+      <w:lvlText w:val="o"/>
+      <w:lvlJc w:val="left"/>
+      <w:pPr>
+        <w:ind w:left="5760" w:hanging="360"/>
+      </w:pPr>
+      <w:rPr>
+        <w:rFonts w:ascii="Courier New" w:hAnsi="Courier New" w:cs="Courier New" w:hint="default"/>
+      </w:rPr>
+    </w:lvl>
+    <w:lvl w:ilvl="8" w:tplc="0C0A0005" w:tentative="1">
+      <w:start w:val="1"/>
+      <w:numFmt w:val="bullet"/>
+      <w:lvlText w:val=""/>
+      <w:lvlJc w:val="left"/>
+      <w:pPr>
+        <w:ind w:left="6480" w:hanging="360"/>
+      </w:pPr>
+      <w:rPr>
+        <w:rFonts w:ascii="Wingdings" w:hAnsi="Wingdings" w:hint="default"/>
+      </w:rPr>
+    </w:lvl>
+  </w:abstractNum>
+  <w:abstractNum w:abstractNumId="24" w15:restartNumberingAfterBreak="0">
     <w:nsid w:val="6AA51BC4"/>
     <w:multiLevelType w:val="hybridMultilevel"/>
     <w:tmpl w:val="ADD42A66"/>
@@ -12250,7 +13678,7 @@
       </w:rPr>
     </w:lvl>
   </w:abstractNum>
-  <w:abstractNum w:abstractNumId="20" w15:restartNumberingAfterBreak="0">
+  <w:abstractNum w:abstractNumId="25" w15:restartNumberingAfterBreak="0">
     <w:nsid w:val="6FFB48AB"/>
     <w:multiLevelType w:val="hybridMultilevel"/>
     <w:tmpl w:val="25048416"/>
@@ -12363,7 +13791,7 @@
       </w:rPr>
     </w:lvl>
   </w:abstractNum>
-  <w:abstractNum w:abstractNumId="21" w15:restartNumberingAfterBreak="0">
+  <w:abstractNum w:abstractNumId="26" w15:restartNumberingAfterBreak="0">
     <w:nsid w:val="71691456"/>
     <w:multiLevelType w:val="hybridMultilevel"/>
     <w:tmpl w:val="D5E8A2BC"/>
@@ -12449,7 +13877,7 @@
       </w:pPr>
     </w:lvl>
   </w:abstractNum>
-  <w:abstractNum w:abstractNumId="22" w15:restartNumberingAfterBreak="0">
+  <w:abstractNum w:abstractNumId="27" w15:restartNumberingAfterBreak="0">
     <w:nsid w:val="7B176A34"/>
     <w:multiLevelType w:val="hybridMultilevel"/>
     <w:tmpl w:val="30105910"/>
@@ -12562,7 +13990,7 @@
       </w:rPr>
     </w:lvl>
   </w:abstractNum>
-  <w:abstractNum w:abstractNumId="23" w15:restartNumberingAfterBreak="0">
+  <w:abstractNum w:abstractNumId="28" w15:restartNumberingAfterBreak="0">
     <w:nsid w:val="7D5C76C7"/>
     <w:multiLevelType w:val="hybridMultilevel"/>
     <w:tmpl w:val="EA1848AC"/>
@@ -12676,19 +14104,19 @@
     </w:lvl>
   </w:abstractNum>
   <w:num w:numId="1">
-    <w:abstractNumId w:val="17"/>
+    <w:abstractNumId w:val="21"/>
   </w:num>
   <w:num w:numId="2">
-    <w:abstractNumId w:val="19"/>
+    <w:abstractNumId w:val="24"/>
   </w:num>
   <w:num w:numId="3">
-    <w:abstractNumId w:val="18"/>
+    <w:abstractNumId w:val="22"/>
   </w:num>
   <w:num w:numId="4">
     <w:abstractNumId w:val="0"/>
   </w:num>
   <w:num w:numId="5">
-    <w:abstractNumId w:val="11"/>
+    <w:abstractNumId w:val="12"/>
   </w:num>
   <w:num w:numId="6">
     <w:abstractNumId w:val="4"/>
@@ -12697,55 +14125,70 @@
     <w:abstractNumId w:val="3"/>
   </w:num>
   <w:num w:numId="8">
-    <w:abstractNumId w:val="12"/>
+    <w:abstractNumId w:val="13"/>
   </w:num>
   <w:num w:numId="9">
-    <w:abstractNumId w:val="10"/>
+    <w:abstractNumId w:val="11"/>
   </w:num>
   <w:num w:numId="10">
-    <w:abstractNumId w:val="5"/>
+    <w:abstractNumId w:val="6"/>
   </w:num>
   <w:num w:numId="11">
+    <w:abstractNumId w:val="25"/>
+  </w:num>
+  <w:num w:numId="12">
+    <w:abstractNumId w:val="8"/>
+  </w:num>
+  <w:num w:numId="13">
+    <w:abstractNumId w:val="9"/>
+  </w:num>
+  <w:num w:numId="14">
+    <w:abstractNumId w:val="18"/>
+  </w:num>
+  <w:num w:numId="15">
     <w:abstractNumId w:val="20"/>
   </w:num>
-  <w:num w:numId="12">
-    <w:abstractNumId w:val="7"/>
+  <w:num w:numId="16">
+    <w:abstractNumId w:val="26"/>
   </w:num>
-  <w:num w:numId="13">
-    <w:abstractNumId w:val="8"/>
+  <w:num w:numId="17">
+    <w:abstractNumId w:val="14"/>
   </w:num>
-  <w:num w:numId="14">
+  <w:num w:numId="18">
     <w:abstractNumId w:val="15"/>
   </w:num>
-  <w:num w:numId="15">
-    <w:abstractNumId w:val="16"/>
-  </w:num>
-  <w:num w:numId="16">
-    <w:abstractNumId w:val="21"/>
-  </w:num>
-  <w:num w:numId="17">
-    <w:abstractNumId w:val="13"/>
-  </w:num>
-  <w:num w:numId="18">
-    <w:abstractNumId w:val="14"/>
-  </w:num>
   <w:num w:numId="19">
-    <w:abstractNumId w:val="6"/>
+    <w:abstractNumId w:val="7"/>
   </w:num>
   <w:num w:numId="20">
     <w:abstractNumId w:val="2"/>
   </w:num>
   <w:num w:numId="21">
-    <w:abstractNumId w:val="23"/>
+    <w:abstractNumId w:val="28"/>
   </w:num>
   <w:num w:numId="22">
-    <w:abstractNumId w:val="9"/>
+    <w:abstractNumId w:val="10"/>
   </w:num>
   <w:num w:numId="23">
     <w:abstractNumId w:val="1"/>
   </w:num>
   <w:num w:numId="24">
-    <w:abstractNumId w:val="22"/>
+    <w:abstractNumId w:val="27"/>
+  </w:num>
+  <w:num w:numId="25">
+    <w:abstractNumId w:val="5"/>
+  </w:num>
+  <w:num w:numId="26">
+    <w:abstractNumId w:val="19"/>
+  </w:num>
+  <w:num w:numId="27">
+    <w:abstractNumId w:val="23"/>
+  </w:num>
+  <w:num w:numId="28">
+    <w:abstractNumId w:val="17"/>
+  </w:num>
+  <w:num w:numId="29">
+    <w:abstractNumId w:val="16"/>
   </w:num>
   <w:numIdMacAtCleanup w:val="24"/>
 </w:numbering>
@@ -13207,7 +14650,6 @@
     <w:next w:val="Normal"/>
     <w:link w:val="Ttulo3Car"/>
     <w:uiPriority w:val="9"/>
-    <w:semiHidden/>
     <w:unhideWhenUsed/>
     <w:qFormat/>
     <w:rsid w:val="005A7781"/>
@@ -13433,7 +14875,6 @@
     <w:basedOn w:val="Fuentedeprrafopredeter"/>
     <w:link w:val="Ttulo3"/>
     <w:uiPriority w:val="9"/>
-    <w:semiHidden/>
     <w:rsid w:val="005A7781"/>
     <w:rPr>
       <w:rFonts w:asciiTheme="majorHAnsi" w:eastAsiaTheme="majorEastAsia" w:hAnsiTheme="majorHAnsi" w:cstheme="majorBidi"/>

</xml_diff>

<commit_message>
Añado comentarios al código
</commit_message>
<xml_diff>
--- a/Adrian_Eduardo.docx
+++ b/Adrian_Eduardo.docx
@@ -1211,7 +1211,7 @@
           <w:r>
             <w:fldChar w:fldCharType="separate"/>
           </w:r>
-          <w:hyperlink w:anchor="_Toc231472127" w:history="1">
+          <w:hyperlink w:anchor="_Toc231484960" w:history="1">
             <w:r>
               <w:rPr>
                 <w:rStyle w:val="Hipervnculo"/>
@@ -1238,7 +1238,7 @@
                 <w:noProof/>
                 <w:webHidden/>
               </w:rPr>
-              <w:instrText xml:space="preserve"> PAGEREF _Toc231472127 \h </w:instrText>
+              <w:instrText xml:space="preserve"> PAGEREF _Toc231484960 \h </w:instrText>
             </w:r>
             <w:r>
               <w:rPr>
@@ -1281,7 +1281,7 @@
               <w:lang w:eastAsia="es-ES"/>
             </w:rPr>
           </w:pPr>
-          <w:hyperlink w:anchor="_Toc231472128" w:history="1">
+          <w:hyperlink w:anchor="_Toc231484961" w:history="1">
             <w:r>
               <w:rPr>
                 <w:rStyle w:val="Hipervnculo"/>
@@ -1308,7 +1308,7 @@
                 <w:noProof/>
                 <w:webHidden/>
               </w:rPr>
-              <w:instrText xml:space="preserve"> PAGEREF _Toc231472128 \h </w:instrText>
+              <w:instrText xml:space="preserve"> PAGEREF _Toc231484961 \h </w:instrText>
             </w:r>
             <w:r>
               <w:rPr>
@@ -1351,7 +1351,7 @@
               <w:lang w:eastAsia="es-ES"/>
             </w:rPr>
           </w:pPr>
-          <w:hyperlink w:anchor="_Toc231472129" w:history="1">
+          <w:hyperlink w:anchor="_Toc231484962" w:history="1">
             <w:r>
               <w:rPr>
                 <w:rStyle w:val="Hipervnculo"/>
@@ -1378,7 +1378,7 @@
                 <w:noProof/>
                 <w:webHidden/>
               </w:rPr>
-              <w:instrText xml:space="preserve"> PAGEREF _Toc231472129 \h </w:instrText>
+              <w:instrText xml:space="preserve"> PAGEREF _Toc231484962 \h </w:instrText>
             </w:r>
             <w:r>
               <w:rPr>
@@ -1421,7 +1421,7 @@
               <w:lang w:eastAsia="es-ES"/>
             </w:rPr>
           </w:pPr>
-          <w:hyperlink w:anchor="_Toc231472130" w:history="1">
+          <w:hyperlink w:anchor="_Toc231484963" w:history="1">
             <w:r>
               <w:rPr>
                 <w:rStyle w:val="Hipervnculo"/>
@@ -1448,7 +1448,7 @@
                 <w:noProof/>
                 <w:webHidden/>
               </w:rPr>
-              <w:instrText xml:space="preserve"> PAGEREF _Toc231472130 \h </w:instrText>
+              <w:instrText xml:space="preserve"> PAGEREF _Toc231484963 \h </w:instrText>
             </w:r>
             <w:r>
               <w:rPr>
@@ -1491,7 +1491,7 @@
               <w:lang w:eastAsia="es-ES"/>
             </w:rPr>
           </w:pPr>
-          <w:hyperlink w:anchor="_Toc231472131" w:history="1">
+          <w:hyperlink w:anchor="_Toc231484964" w:history="1">
             <w:r>
               <w:rPr>
                 <w:rStyle w:val="Hipervnculo"/>
@@ -1518,7 +1518,7 @@
                 <w:noProof/>
                 <w:webHidden/>
               </w:rPr>
-              <w:instrText xml:space="preserve"> PAGEREF _Toc231472131 \h </w:instrText>
+              <w:instrText xml:space="preserve"> PAGEREF _Toc231484964 \h </w:instrText>
             </w:r>
             <w:r>
               <w:rPr>
@@ -1561,7 +1561,7 @@
               <w:lang w:eastAsia="es-ES"/>
             </w:rPr>
           </w:pPr>
-          <w:hyperlink w:anchor="_Toc231472132" w:history="1">
+          <w:hyperlink w:anchor="_Toc231484965" w:history="1">
             <w:r>
               <w:rPr>
                 <w:rStyle w:val="Hipervnculo"/>
@@ -1588,7 +1588,7 @@
                 <w:noProof/>
                 <w:webHidden/>
               </w:rPr>
-              <w:instrText xml:space="preserve"> PAGEREF _Toc231472132 \h </w:instrText>
+              <w:instrText xml:space="preserve"> PAGEREF _Toc231484965 \h </w:instrText>
             </w:r>
             <w:r>
               <w:rPr>
@@ -1631,7 +1631,7 @@
               <w:lang w:eastAsia="es-ES"/>
             </w:rPr>
           </w:pPr>
-          <w:hyperlink w:anchor="_Toc231472133" w:history="1">
+          <w:hyperlink w:anchor="_Toc231484966" w:history="1">
             <w:r>
               <w:rPr>
                 <w:rStyle w:val="Hipervnculo"/>
@@ -1658,7 +1658,7 @@
                 <w:noProof/>
                 <w:webHidden/>
               </w:rPr>
-              <w:instrText xml:space="preserve"> PAGEREF _Toc231472133 \h </w:instrText>
+              <w:instrText xml:space="preserve"> PAGEREF _Toc231484966 \h </w:instrText>
             </w:r>
             <w:r>
               <w:rPr>
@@ -1701,7 +1701,7 @@
               <w:lang w:eastAsia="es-ES"/>
             </w:rPr>
           </w:pPr>
-          <w:hyperlink w:anchor="_Toc231472134" w:history="1">
+          <w:hyperlink w:anchor="_Toc231484967" w:history="1">
             <w:r>
               <w:rPr>
                 <w:rStyle w:val="Hipervnculo"/>
@@ -1728,7 +1728,7 @@
                 <w:noProof/>
                 <w:webHidden/>
               </w:rPr>
-              <w:instrText xml:space="preserve"> PAGEREF _Toc231472134 \h </w:instrText>
+              <w:instrText xml:space="preserve"> PAGEREF _Toc231484967 \h </w:instrText>
             </w:r>
             <w:r>
               <w:rPr>
@@ -1771,7 +1771,7 @@
               <w:lang w:eastAsia="es-ES"/>
             </w:rPr>
           </w:pPr>
-          <w:hyperlink w:anchor="_Toc231472135" w:history="1">
+          <w:hyperlink w:anchor="_Toc231484968" w:history="1">
             <w:r>
               <w:rPr>
                 <w:rStyle w:val="Hipervnculo"/>
@@ -1798,7 +1798,7 @@
                 <w:noProof/>
                 <w:webHidden/>
               </w:rPr>
-              <w:instrText xml:space="preserve"> PAGEREF _Toc231472135 \h </w:instrText>
+              <w:instrText xml:space="preserve"> PAGEREF _Toc231484968 \h </w:instrText>
             </w:r>
             <w:r>
               <w:rPr>
@@ -1841,7 +1841,7 @@
               <w:lang w:eastAsia="es-ES"/>
             </w:rPr>
           </w:pPr>
-          <w:hyperlink w:anchor="_Toc231472136" w:history="1">
+          <w:hyperlink w:anchor="_Toc231484969" w:history="1">
             <w:r>
               <w:rPr>
                 <w:rStyle w:val="Hipervnculo"/>
@@ -1868,7 +1868,7 @@
                 <w:noProof/>
                 <w:webHidden/>
               </w:rPr>
-              <w:instrText xml:space="preserve"> PAGEREF _Toc231472136 \h </w:instrText>
+              <w:instrText xml:space="preserve"> PAGEREF _Toc231484969 \h </w:instrText>
             </w:r>
             <w:r>
               <w:rPr>
@@ -1911,7 +1911,7 @@
               <w:lang w:eastAsia="es-ES"/>
             </w:rPr>
           </w:pPr>
-          <w:hyperlink w:anchor="_Toc231472137" w:history="1">
+          <w:hyperlink w:anchor="_Toc231484970" w:history="1">
             <w:r>
               <w:rPr>
                 <w:rStyle w:val="Hipervnculo"/>
@@ -1938,7 +1938,7 @@
                 <w:noProof/>
                 <w:webHidden/>
               </w:rPr>
-              <w:instrText xml:space="preserve"> PAGEREF _Toc231472137 \h </w:instrText>
+              <w:instrText xml:space="preserve"> PAGEREF _Toc231484970 \h </w:instrText>
             </w:r>
             <w:r>
               <w:rPr>
@@ -1981,7 +1981,7 @@
               <w:lang w:eastAsia="es-ES"/>
             </w:rPr>
           </w:pPr>
-          <w:hyperlink w:anchor="_Toc231472138" w:history="1">
+          <w:hyperlink w:anchor="_Toc231484971" w:history="1">
             <w:r>
               <w:rPr>
                 <w:rStyle w:val="Hipervnculo"/>
@@ -2008,7 +2008,7 @@
                 <w:noProof/>
                 <w:webHidden/>
               </w:rPr>
-              <w:instrText xml:space="preserve"> PAGEREF _Toc231472138 \h </w:instrText>
+              <w:instrText xml:space="preserve"> PAGEREF _Toc231484971 \h </w:instrText>
             </w:r>
             <w:r>
               <w:rPr>
@@ -2051,7 +2051,7 @@
               <w:lang w:eastAsia="es-ES"/>
             </w:rPr>
           </w:pPr>
-          <w:hyperlink w:anchor="_Toc231472139" w:history="1">
+          <w:hyperlink w:anchor="_Toc231484972" w:history="1">
             <w:r>
               <w:rPr>
                 <w:rStyle w:val="Hipervnculo"/>
@@ -2078,7 +2078,7 @@
                 <w:noProof/>
                 <w:webHidden/>
               </w:rPr>
-              <w:instrText xml:space="preserve"> PAGEREF _Toc231472139 \h </w:instrText>
+              <w:instrText xml:space="preserve"> PAGEREF _Toc231484972 \h </w:instrText>
             </w:r>
             <w:r>
               <w:rPr>
@@ -2121,7 +2121,7 @@
               <w:lang w:eastAsia="es-ES"/>
             </w:rPr>
           </w:pPr>
-          <w:hyperlink w:anchor="_Toc231472140" w:history="1">
+          <w:hyperlink w:anchor="_Toc231484973" w:history="1">
             <w:r>
               <w:rPr>
                 <w:rStyle w:val="Hipervnculo"/>
@@ -2148,7 +2148,7 @@
                 <w:noProof/>
                 <w:webHidden/>
               </w:rPr>
-              <w:instrText xml:space="preserve"> PAGEREF _Toc231472140 \h </w:instrText>
+              <w:instrText xml:space="preserve"> PAGEREF _Toc231484973 \h </w:instrText>
             </w:r>
             <w:r>
               <w:rPr>
@@ -2191,7 +2191,7 @@
               <w:lang w:eastAsia="es-ES"/>
             </w:rPr>
           </w:pPr>
-          <w:hyperlink w:anchor="_Toc231472141" w:history="1">
+          <w:hyperlink w:anchor="_Toc231484974" w:history="1">
             <w:r>
               <w:rPr>
                 <w:rStyle w:val="Hipervnculo"/>
@@ -2219,7 +2219,7 @@
                 <w:noProof/>
                 <w:webHidden/>
               </w:rPr>
-              <w:instrText xml:space="preserve"> PAGEREF _Toc231472141 \h </w:instrText>
+              <w:instrText xml:space="preserve"> PAGEREF _Toc231484974 \h </w:instrText>
             </w:r>
             <w:r>
               <w:rPr>
@@ -2262,7 +2262,7 @@
               <w:lang w:eastAsia="es-ES"/>
             </w:rPr>
           </w:pPr>
-          <w:hyperlink w:anchor="_Toc231472142" w:history="1">
+          <w:hyperlink w:anchor="_Toc231484975" w:history="1">
             <w:r>
               <w:rPr>
                 <w:rStyle w:val="Hipervnculo"/>
@@ -2289,7 +2289,7 @@
                 <w:noProof/>
                 <w:webHidden/>
               </w:rPr>
-              <w:instrText xml:space="preserve"> PAGEREF _Toc231472142 \h </w:instrText>
+              <w:instrText xml:space="preserve"> PAGEREF _Toc231484975 \h </w:instrText>
             </w:r>
             <w:r>
               <w:rPr>
@@ -2332,7 +2332,7 @@
               <w:lang w:eastAsia="es-ES"/>
             </w:rPr>
           </w:pPr>
-          <w:hyperlink w:anchor="_Toc231472143" w:history="1">
+          <w:hyperlink w:anchor="_Toc231484976" w:history="1">
             <w:r>
               <w:rPr>
                 <w:rStyle w:val="Hipervnculo"/>
@@ -2359,7 +2359,7 @@
                 <w:noProof/>
                 <w:webHidden/>
               </w:rPr>
-              <w:instrText xml:space="preserve"> PAGEREF _Toc231472143 \h </w:instrText>
+              <w:instrText xml:space="preserve"> PAGEREF _Toc231484976 \h </w:instrText>
             </w:r>
             <w:r>
               <w:rPr>
@@ -2402,7 +2402,7 @@
               <w:lang w:eastAsia="es-ES"/>
             </w:rPr>
           </w:pPr>
-          <w:hyperlink w:anchor="_Toc231472144" w:history="1">
+          <w:hyperlink w:anchor="_Toc231484977" w:history="1">
             <w:r>
               <w:rPr>
                 <w:rStyle w:val="Hipervnculo"/>
@@ -2429,7 +2429,7 @@
                 <w:noProof/>
                 <w:webHidden/>
               </w:rPr>
-              <w:instrText xml:space="preserve"> PAGEREF _Toc231472144 \h </w:instrText>
+              <w:instrText xml:space="preserve"> PAGEREF _Toc231484977 \h </w:instrText>
             </w:r>
             <w:r>
               <w:rPr>
@@ -2472,7 +2472,7 @@
               <w:lang w:eastAsia="es-ES"/>
             </w:rPr>
           </w:pPr>
-          <w:hyperlink w:anchor="_Toc231472145" w:history="1">
+          <w:hyperlink w:anchor="_Toc231484978" w:history="1">
             <w:r>
               <w:rPr>
                 <w:rStyle w:val="Hipervnculo"/>
@@ -2499,7 +2499,7 @@
                 <w:noProof/>
                 <w:webHidden/>
               </w:rPr>
-              <w:instrText xml:space="preserve"> PAGEREF _Toc231472145 \h </w:instrText>
+              <w:instrText xml:space="preserve"> PAGEREF _Toc231484978 \h </w:instrText>
             </w:r>
             <w:r>
               <w:rPr>
@@ -2542,7 +2542,7 @@
               <w:lang w:eastAsia="es-ES"/>
             </w:rPr>
           </w:pPr>
-          <w:hyperlink w:anchor="_Toc231472146" w:history="1">
+          <w:hyperlink w:anchor="_Toc231484979" w:history="1">
             <w:r>
               <w:rPr>
                 <w:rStyle w:val="Hipervnculo"/>
@@ -2569,7 +2569,7 @@
                 <w:noProof/>
                 <w:webHidden/>
               </w:rPr>
-              <w:instrText xml:space="preserve"> PAGEREF _Toc231472146 \h </w:instrText>
+              <w:instrText xml:space="preserve"> PAGEREF _Toc231484979 \h </w:instrText>
             </w:r>
             <w:r>
               <w:rPr>
@@ -2612,7 +2612,7 @@
               <w:lang w:eastAsia="es-ES"/>
             </w:rPr>
           </w:pPr>
-          <w:hyperlink w:anchor="_Toc231472147" w:history="1">
+          <w:hyperlink w:anchor="_Toc231484980" w:history="1">
             <w:r>
               <w:rPr>
                 <w:rStyle w:val="Hipervnculo"/>
@@ -2639,7 +2639,7 @@
                 <w:noProof/>
                 <w:webHidden/>
               </w:rPr>
-              <w:instrText xml:space="preserve"> PAGEREF _Toc231472147 \h </w:instrText>
+              <w:instrText xml:space="preserve"> PAGEREF _Toc231484980 \h </w:instrText>
             </w:r>
             <w:r>
               <w:rPr>
@@ -2682,7 +2682,7 @@
               <w:lang w:eastAsia="es-ES"/>
             </w:rPr>
           </w:pPr>
-          <w:hyperlink w:anchor="_Toc231472148" w:history="1">
+          <w:hyperlink w:anchor="_Toc231484981" w:history="1">
             <w:r>
               <w:rPr>
                 <w:rStyle w:val="Hipervnculo"/>
@@ -2709,7 +2709,7 @@
                 <w:noProof/>
                 <w:webHidden/>
               </w:rPr>
-              <w:instrText xml:space="preserve"> PAGEREF _Toc231472148 \h </w:instrText>
+              <w:instrText xml:space="preserve"> PAGEREF _Toc231484981 \h </w:instrText>
             </w:r>
             <w:r>
               <w:rPr>
@@ -2752,7 +2752,7 @@
               <w:lang w:eastAsia="es-ES"/>
             </w:rPr>
           </w:pPr>
-          <w:hyperlink w:anchor="_Toc231472149" w:history="1">
+          <w:hyperlink w:anchor="_Toc231484982" w:history="1">
             <w:r>
               <w:rPr>
                 <w:rStyle w:val="Hipervnculo"/>
@@ -2779,7 +2779,7 @@
                 <w:noProof/>
                 <w:webHidden/>
               </w:rPr>
-              <w:instrText xml:space="preserve"> PAGEREF _Toc231472149 \h </w:instrText>
+              <w:instrText xml:space="preserve"> PAGEREF _Toc231484982 \h </w:instrText>
             </w:r>
             <w:r>
               <w:rPr>
@@ -2822,7 +2822,7 @@
               <w:lang w:eastAsia="es-ES"/>
             </w:rPr>
           </w:pPr>
-          <w:hyperlink w:anchor="_Toc231472150" w:history="1">
+          <w:hyperlink w:anchor="_Toc231484983" w:history="1">
             <w:r>
               <w:rPr>
                 <w:rStyle w:val="Hipervnculo"/>
@@ -2849,7 +2849,7 @@
                 <w:noProof/>
                 <w:webHidden/>
               </w:rPr>
-              <w:instrText xml:space="preserve"> PAGEREF _Toc231472150 \h </w:instrText>
+              <w:instrText xml:space="preserve"> PAGEREF _Toc231484983 \h </w:instrText>
             </w:r>
             <w:r>
               <w:rPr>
@@ -2892,7 +2892,7 @@
               <w:lang w:eastAsia="es-ES"/>
             </w:rPr>
           </w:pPr>
-          <w:hyperlink w:anchor="_Toc231472151" w:history="1">
+          <w:hyperlink w:anchor="_Toc231484984" w:history="1">
             <w:r>
               <w:rPr>
                 <w:rStyle w:val="Hipervnculo"/>
@@ -2919,7 +2919,7 @@
                 <w:noProof/>
                 <w:webHidden/>
               </w:rPr>
-              <w:instrText xml:space="preserve"> PAGEREF _Toc231472151 \h </w:instrText>
+              <w:instrText xml:space="preserve"> PAGEREF _Toc231484984 \h </w:instrText>
             </w:r>
             <w:r>
               <w:rPr>
@@ -2962,7 +2962,7 @@
               <w:lang w:eastAsia="es-ES"/>
             </w:rPr>
           </w:pPr>
-          <w:hyperlink w:anchor="_Toc231472152" w:history="1">
+          <w:hyperlink w:anchor="_Toc231484985" w:history="1">
             <w:r>
               <w:rPr>
                 <w:rStyle w:val="Hipervnculo"/>
@@ -2989,7 +2989,7 @@
                 <w:noProof/>
                 <w:webHidden/>
               </w:rPr>
-              <w:instrText xml:space="preserve"> PAGEREF _Toc231472152 \h </w:instrText>
+              <w:instrText xml:space="preserve"> PAGEREF _Toc231484985 \h </w:instrText>
             </w:r>
             <w:r>
               <w:rPr>
@@ -3032,7 +3032,7 @@
               <w:lang w:eastAsia="es-ES"/>
             </w:rPr>
           </w:pPr>
-          <w:hyperlink w:anchor="_Toc231472153" w:history="1">
+          <w:hyperlink w:anchor="_Toc231484986" w:history="1">
             <w:r>
               <w:rPr>
                 <w:rStyle w:val="Hipervnculo"/>
@@ -3059,7 +3059,7 @@
                 <w:noProof/>
                 <w:webHidden/>
               </w:rPr>
-              <w:instrText xml:space="preserve"> PAGEREF _Toc231472153 \h </w:instrText>
+              <w:instrText xml:space="preserve"> PAGEREF _Toc231484986 \h </w:instrText>
             </w:r>
             <w:r>
               <w:rPr>
@@ -3102,7 +3102,7 @@
               <w:lang w:eastAsia="es-ES"/>
             </w:rPr>
           </w:pPr>
-          <w:hyperlink w:anchor="_Toc231472154" w:history="1">
+          <w:hyperlink w:anchor="_Toc231484987" w:history="1">
             <w:r>
               <w:rPr>
                 <w:rStyle w:val="Hipervnculo"/>
@@ -3129,7 +3129,7 @@
                 <w:noProof/>
                 <w:webHidden/>
               </w:rPr>
-              <w:instrText xml:space="preserve"> PAGEREF _Toc231472154 \h </w:instrText>
+              <w:instrText xml:space="preserve"> PAGEREF _Toc231484987 \h </w:instrText>
             </w:r>
             <w:r>
               <w:rPr>
@@ -3172,7 +3172,7 @@
               <w:lang w:eastAsia="es-ES"/>
             </w:rPr>
           </w:pPr>
-          <w:hyperlink w:anchor="_Toc231472155" w:history="1">
+          <w:hyperlink w:anchor="_Toc231484988" w:history="1">
             <w:r>
               <w:rPr>
                 <w:rStyle w:val="Hipervnculo"/>
@@ -3199,7 +3199,7 @@
                 <w:noProof/>
                 <w:webHidden/>
               </w:rPr>
-              <w:instrText xml:space="preserve"> PAGEREF _Toc231472155 \h </w:instrText>
+              <w:instrText xml:space="preserve"> PAGEREF _Toc231484988 \h </w:instrText>
             </w:r>
             <w:r>
               <w:rPr>
@@ -3242,7 +3242,7 @@
               <w:lang w:eastAsia="es-ES"/>
             </w:rPr>
           </w:pPr>
-          <w:hyperlink w:anchor="_Toc231472156" w:history="1">
+          <w:hyperlink w:anchor="_Toc231484989" w:history="1">
             <w:r>
               <w:rPr>
                 <w:rStyle w:val="Hipervnculo"/>
@@ -3269,7 +3269,7 @@
                 <w:noProof/>
                 <w:webHidden/>
               </w:rPr>
-              <w:instrText xml:space="preserve"> PAGEREF _Toc231472156 \h </w:instrText>
+              <w:instrText xml:space="preserve"> PAGEREF _Toc231484989 \h </w:instrText>
             </w:r>
             <w:r>
               <w:rPr>
@@ -3312,7 +3312,7 @@
               <w:lang w:eastAsia="es-ES"/>
             </w:rPr>
           </w:pPr>
-          <w:hyperlink w:anchor="_Toc231472157" w:history="1">
+          <w:hyperlink w:anchor="_Toc231484990" w:history="1">
             <w:r>
               <w:rPr>
                 <w:rStyle w:val="Hipervnculo"/>
@@ -3339,7 +3339,7 @@
                 <w:noProof/>
                 <w:webHidden/>
               </w:rPr>
-              <w:instrText xml:space="preserve"> PAGEREF _Toc231472157 \h </w:instrText>
+              <w:instrText xml:space="preserve"> PAGEREF _Toc231484990 \h </w:instrText>
             </w:r>
             <w:r>
               <w:rPr>
@@ -3382,7 +3382,7 @@
               <w:lang w:eastAsia="es-ES"/>
             </w:rPr>
           </w:pPr>
-          <w:hyperlink w:anchor="_Toc231472158" w:history="1">
+          <w:hyperlink w:anchor="_Toc231484991" w:history="1">
             <w:r>
               <w:rPr>
                 <w:rStyle w:val="Hipervnculo"/>
@@ -3409,7 +3409,7 @@
                 <w:noProof/>
                 <w:webHidden/>
               </w:rPr>
-              <w:instrText xml:space="preserve"> PAGEREF _Toc231472158 \h </w:instrText>
+              <w:instrText xml:space="preserve"> PAGEREF _Toc231484991 \h </w:instrText>
             </w:r>
             <w:r>
               <w:rPr>
@@ -3452,7 +3452,7 @@
               <w:lang w:eastAsia="es-ES"/>
             </w:rPr>
           </w:pPr>
-          <w:hyperlink w:anchor="_Toc231472159" w:history="1">
+          <w:hyperlink w:anchor="_Toc231484992" w:history="1">
             <w:r>
               <w:rPr>
                 <w:rStyle w:val="Hipervnculo"/>
@@ -3479,7 +3479,7 @@
                 <w:noProof/>
                 <w:webHidden/>
               </w:rPr>
-              <w:instrText xml:space="preserve"> PAGEREF _Toc231472159 \h </w:instrText>
+              <w:instrText xml:space="preserve"> PAGEREF _Toc231484992 \h </w:instrText>
             </w:r>
             <w:r>
               <w:rPr>
@@ -3522,7 +3522,7 @@
               <w:lang w:eastAsia="es-ES"/>
             </w:rPr>
           </w:pPr>
-          <w:hyperlink w:anchor="_Toc231472160" w:history="1">
+          <w:hyperlink w:anchor="_Toc231484993" w:history="1">
             <w:r>
               <w:rPr>
                 <w:rStyle w:val="Hipervnculo"/>
@@ -3549,7 +3549,7 @@
                 <w:noProof/>
                 <w:webHidden/>
               </w:rPr>
-              <w:instrText xml:space="preserve"> PAGEREF _Toc231472160 \h </w:instrText>
+              <w:instrText xml:space="preserve"> PAGEREF _Toc231484993 \h </w:instrText>
             </w:r>
             <w:r>
               <w:rPr>
@@ -3591,7 +3591,7 @@
               <w:noProof/>
             </w:rPr>
           </w:pPr>
-          <w:hyperlink w:anchor="_Toc231472161" w:history="1">
+          <w:hyperlink w:anchor="_Toc231484994" w:history="1">
             <w:r>
               <w:rPr>
                 <w:rStyle w:val="Hipervnculo"/>
@@ -3618,7 +3618,7 @@
                 <w:noProof/>
                 <w:webHidden/>
               </w:rPr>
-              <w:instrText xml:space="preserve"> PAGEREF _Toc231472161 \h </w:instrText>
+              <w:instrText xml:space="preserve"> PAGEREF _Toc231484994 \h </w:instrText>
             </w:r>
             <w:r>
               <w:rPr>
@@ -3660,7 +3660,7 @@
               <w:noProof/>
             </w:rPr>
           </w:pPr>
-          <w:hyperlink w:anchor="_Toc231472162" w:history="1">
+          <w:hyperlink w:anchor="_Toc231484995" w:history="1">
             <w:r>
               <w:rPr>
                 <w:rStyle w:val="Hipervnculo"/>
@@ -3687,7 +3687,7 @@
                 <w:noProof/>
                 <w:webHidden/>
               </w:rPr>
-              <w:instrText xml:space="preserve"> PAGEREF _Toc231472162 \h </w:instrText>
+              <w:instrText xml:space="preserve"> PAGEREF _Toc231484995 \h </w:instrText>
             </w:r>
             <w:r>
               <w:rPr>
@@ -3729,7 +3729,7 @@
               <w:noProof/>
             </w:rPr>
           </w:pPr>
-          <w:hyperlink w:anchor="_Toc231472163" w:history="1">
+          <w:hyperlink w:anchor="_Toc231484996" w:history="1">
             <w:r>
               <w:rPr>
                 <w:rStyle w:val="Hipervnculo"/>
@@ -3756,7 +3756,7 @@
                 <w:noProof/>
                 <w:webHidden/>
               </w:rPr>
-              <w:instrText xml:space="preserve"> PAGEREF _Toc231472163 \h </w:instrText>
+              <w:instrText xml:space="preserve"> PAGEREF _Toc231484996 \h </w:instrText>
             </w:r>
             <w:r>
               <w:rPr>
@@ -3799,7 +3799,7 @@
               <w:lang w:eastAsia="es-ES"/>
             </w:rPr>
           </w:pPr>
-          <w:hyperlink w:anchor="_Toc231472164" w:history="1">
+          <w:hyperlink w:anchor="_Toc231484997" w:history="1">
             <w:r>
               <w:rPr>
                 <w:rStyle w:val="Hipervnculo"/>
@@ -3826,7 +3826,7 @@
                 <w:noProof/>
                 <w:webHidden/>
               </w:rPr>
-              <w:instrText xml:space="preserve"> PAGEREF _Toc231472164 \h </w:instrText>
+              <w:instrText xml:space="preserve"> PAGEREF _Toc231484997 \h </w:instrText>
             </w:r>
             <w:r>
               <w:rPr>
@@ -3868,7 +3868,7 @@
               <w:noProof/>
             </w:rPr>
           </w:pPr>
-          <w:hyperlink w:anchor="_Toc231472165" w:history="1">
+          <w:hyperlink w:anchor="_Toc231484998" w:history="1">
             <w:r>
               <w:rPr>
                 <w:rStyle w:val="Hipervnculo"/>
@@ -3895,7 +3895,7 @@
                 <w:noProof/>
                 <w:webHidden/>
               </w:rPr>
-              <w:instrText xml:space="preserve"> PAGEREF _Toc231472165 \h </w:instrText>
+              <w:instrText xml:space="preserve"> PAGEREF _Toc231484998 \h </w:instrText>
             </w:r>
             <w:r>
               <w:rPr>
@@ -3937,7 +3937,7 @@
               <w:noProof/>
             </w:rPr>
           </w:pPr>
-          <w:hyperlink w:anchor="_Toc231472166" w:history="1">
+          <w:hyperlink w:anchor="_Toc231484999" w:history="1">
             <w:r>
               <w:rPr>
                 <w:rStyle w:val="Hipervnculo"/>
@@ -3964,7 +3964,7 @@
                 <w:noProof/>
                 <w:webHidden/>
               </w:rPr>
-              <w:instrText xml:space="preserve"> PAGEREF _Toc231472166 \h </w:instrText>
+              <w:instrText xml:space="preserve"> PAGEREF _Toc231484999 \h </w:instrText>
             </w:r>
             <w:r>
               <w:rPr>
@@ -4007,7 +4007,7 @@
               <w:lang w:eastAsia="es-ES"/>
             </w:rPr>
           </w:pPr>
-          <w:hyperlink w:anchor="_Toc231472167" w:history="1">
+          <w:hyperlink w:anchor="_Toc231485000" w:history="1">
             <w:r>
               <w:rPr>
                 <w:rStyle w:val="Hipervnculo"/>
@@ -4034,7 +4034,7 @@
                 <w:noProof/>
                 <w:webHidden/>
               </w:rPr>
-              <w:instrText xml:space="preserve"> PAGEREF _Toc231472167 \h </w:instrText>
+              <w:instrText xml:space="preserve"> PAGEREF _Toc231485000 \h </w:instrText>
             </w:r>
             <w:r>
               <w:rPr>
@@ -4077,7 +4077,7 @@
               <w:lang w:eastAsia="es-ES"/>
             </w:rPr>
           </w:pPr>
-          <w:hyperlink w:anchor="_Toc231472168" w:history="1">
+          <w:hyperlink w:anchor="_Toc231485001" w:history="1">
             <w:r>
               <w:rPr>
                 <w:rStyle w:val="Hipervnculo"/>
@@ -4104,7 +4104,7 @@
                 <w:noProof/>
                 <w:webHidden/>
               </w:rPr>
-              <w:instrText xml:space="preserve"> PAGEREF _Toc231472168 \h </w:instrText>
+              <w:instrText xml:space="preserve"> PAGEREF _Toc231485001 \h </w:instrText>
             </w:r>
             <w:r>
               <w:rPr>
@@ -4147,7 +4147,7 @@
               <w:lang w:eastAsia="es-ES"/>
             </w:rPr>
           </w:pPr>
-          <w:hyperlink w:anchor="_Toc231472169" w:history="1">
+          <w:hyperlink w:anchor="_Toc231485002" w:history="1">
             <w:r>
               <w:rPr>
                 <w:rStyle w:val="Hipervnculo"/>
@@ -4174,7 +4174,7 @@
                 <w:noProof/>
                 <w:webHidden/>
               </w:rPr>
-              <w:instrText xml:space="preserve"> PAGEREF _Toc231472169 \h </w:instrText>
+              <w:instrText xml:space="preserve"> PAGEREF _Toc231485002 \h </w:instrText>
             </w:r>
             <w:r>
               <w:rPr>
@@ -4217,7 +4217,7 @@
               <w:lang w:eastAsia="es-ES"/>
             </w:rPr>
           </w:pPr>
-          <w:hyperlink w:anchor="_Toc231472170" w:history="1">
+          <w:hyperlink w:anchor="_Toc231485003" w:history="1">
             <w:r>
               <w:rPr>
                 <w:rStyle w:val="Hipervnculo"/>
@@ -4244,7 +4244,7 @@
                 <w:noProof/>
                 <w:webHidden/>
               </w:rPr>
-              <w:instrText xml:space="preserve"> PAGEREF _Toc231472170 \h </w:instrText>
+              <w:instrText xml:space="preserve"> PAGEREF _Toc231485003 \h </w:instrText>
             </w:r>
             <w:r>
               <w:rPr>
@@ -4287,7 +4287,7 @@
               <w:lang w:eastAsia="es-ES"/>
             </w:rPr>
           </w:pPr>
-          <w:hyperlink w:anchor="_Toc231472171" w:history="1">
+          <w:hyperlink w:anchor="_Toc231485004" w:history="1">
             <w:r>
               <w:rPr>
                 <w:rStyle w:val="Hipervnculo"/>
@@ -4314,7 +4314,7 @@
                 <w:noProof/>
                 <w:webHidden/>
               </w:rPr>
-              <w:instrText xml:space="preserve"> PAGEREF _Toc231472171 \h </w:instrText>
+              <w:instrText xml:space="preserve"> PAGEREF _Toc231485004 \h </w:instrText>
             </w:r>
             <w:r>
               <w:rPr>
@@ -4357,7 +4357,7 @@
               <w:lang w:eastAsia="es-ES"/>
             </w:rPr>
           </w:pPr>
-          <w:hyperlink w:anchor="_Toc231472172" w:history="1">
+          <w:hyperlink w:anchor="_Toc231485005" w:history="1">
             <w:r>
               <w:rPr>
                 <w:rStyle w:val="Hipervnculo"/>
@@ -4384,7 +4384,7 @@
                 <w:noProof/>
                 <w:webHidden/>
               </w:rPr>
-              <w:instrText xml:space="preserve"> PAGEREF _Toc231472172 \h </w:instrText>
+              <w:instrText xml:space="preserve"> PAGEREF _Toc231485005 \h </w:instrText>
             </w:r>
             <w:r>
               <w:rPr>
@@ -4427,7 +4427,7 @@
               <w:lang w:eastAsia="es-ES"/>
             </w:rPr>
           </w:pPr>
-          <w:hyperlink w:anchor="_Toc231472173" w:history="1">
+          <w:hyperlink w:anchor="_Toc231485006" w:history="1">
             <w:r>
               <w:rPr>
                 <w:rStyle w:val="Hipervnculo"/>
@@ -4454,7 +4454,7 @@
                 <w:noProof/>
                 <w:webHidden/>
               </w:rPr>
-              <w:instrText xml:space="preserve"> PAGEREF _Toc231472173 \h </w:instrText>
+              <w:instrText xml:space="preserve"> PAGEREF _Toc231485006 \h </w:instrText>
             </w:r>
             <w:r>
               <w:rPr>
@@ -4497,13 +4497,13 @@
               <w:lang w:eastAsia="es-ES"/>
             </w:rPr>
           </w:pPr>
-          <w:hyperlink w:anchor="_Toc231472174" w:history="1">
+          <w:hyperlink w:anchor="_Toc231485007" w:history="1">
             <w:r>
               <w:rPr>
                 <w:rStyle w:val="Hipervnculo"/>
                 <w:noProof/>
               </w:rPr>
-              <w:t>16. Usuarios de prueba</w:t>
+              <w:t>16. Problemas y retos surgidos durante el desarrollo</w:t>
             </w:r>
             <w:r>
               <w:rPr>
@@ -4524,7 +4524,7 @@
                 <w:noProof/>
                 <w:webHidden/>
               </w:rPr>
-              <w:instrText xml:space="preserve"> PAGEREF _Toc231472174 \h </w:instrText>
+              <w:instrText xml:space="preserve"> PAGEREF _Toc231485007 \h </w:instrText>
             </w:r>
             <w:r>
               <w:rPr>
@@ -4567,12 +4567,82 @@
               <w:lang w:eastAsia="es-ES"/>
             </w:rPr>
           </w:pPr>
-          <w:hyperlink w:anchor="_Toc231472175" w:history="1">
+          <w:hyperlink w:anchor="_Toc231485008" w:history="1">
             <w:r>
               <w:rPr>
                 <w:rStyle w:val="Hipervnculo"/>
                 <w:noProof/>
               </w:rPr>
+              <w:t>16. Usuarios de prueba</w:t>
+            </w:r>
+            <w:r>
+              <w:rPr>
+                <w:noProof/>
+                <w:webHidden/>
+              </w:rPr>
+              <w:tab/>
+            </w:r>
+            <w:r>
+              <w:rPr>
+                <w:noProof/>
+                <w:webHidden/>
+              </w:rPr>
+              <w:fldChar w:fldCharType="begin"/>
+            </w:r>
+            <w:r>
+              <w:rPr>
+                <w:noProof/>
+                <w:webHidden/>
+              </w:rPr>
+              <w:instrText xml:space="preserve"> PAGEREF _Toc231485008 \h </w:instrText>
+            </w:r>
+            <w:r>
+              <w:rPr>
+                <w:noProof/>
+                <w:webHidden/>
+              </w:rPr>
+            </w:r>
+            <w:r>
+              <w:rPr>
+                <w:noProof/>
+                <w:webHidden/>
+              </w:rPr>
+              <w:fldChar w:fldCharType="separate"/>
+            </w:r>
+            <w:r>
+              <w:rPr>
+                <w:noProof/>
+                <w:webHidden/>
+              </w:rPr>
+              <w:t>37</w:t>
+            </w:r>
+            <w:r>
+              <w:rPr>
+                <w:noProof/>
+                <w:webHidden/>
+              </w:rPr>
+              <w:fldChar w:fldCharType="end"/>
+            </w:r>
+          </w:hyperlink>
+        </w:p>
+        <w:p>
+          <w:pPr>
+            <w:pStyle w:val="TDC1"/>
+            <w:tabs>
+              <w:tab w:val="right" w:leader="dot" w:pos="8494"/>
+            </w:tabs>
+            <w:rPr>
+              <w:rFonts w:asciiTheme="minorHAnsi" w:eastAsiaTheme="minorEastAsia" w:hAnsiTheme="minorHAnsi"/>
+              <w:noProof/>
+              <w:lang w:eastAsia="es-ES"/>
+            </w:rPr>
+          </w:pPr>
+          <w:hyperlink w:anchor="_Toc231485009" w:history="1">
+            <w:r>
+              <w:rPr>
+                <w:rStyle w:val="Hipervnculo"/>
+                <w:noProof/>
+              </w:rPr>
               <w:t>17. Reflexión final</w:t>
             </w:r>
             <w:r>
@@ -4594,7 +4664,7 @@
                 <w:noProof/>
                 <w:webHidden/>
               </w:rPr>
-              <w:instrText xml:space="preserve"> PAGEREF _Toc231472175 \h </w:instrText>
+              <w:instrText xml:space="preserve"> PAGEREF _Toc231485009 \h </w:instrText>
             </w:r>
             <w:r>
               <w:rPr>
@@ -4614,7 +4684,7 @@
                 <w:noProof/>
                 <w:webHidden/>
               </w:rPr>
-              <w:t>36</w:t>
+              <w:t>37</w:t>
             </w:r>
             <w:r>
               <w:rPr>
@@ -4645,7 +4715,7 @@
       <w:pPr>
         <w:pStyle w:val="Ttulo1"/>
       </w:pPr>
-      <w:bookmarkStart w:id="0" w:name="_Toc231472127"/>
+      <w:bookmarkStart w:id="0" w:name="_Toc231484960"/>
       <w:r>
         <w:lastRenderedPageBreak/>
         <w:t>1. Introducción</w:t>
@@ -4797,28 +4867,7 @@
             <w:rStyle w:val="Hipervnculo"/>
             <w:lang w:eastAsia="es-ES"/>
           </w:rPr>
-          <w:t>enl</w:t>
-        </w:r>
-        <w:r>
-          <w:rPr>
-            <w:rStyle w:val="Hipervnculo"/>
-            <w:lang w:eastAsia="es-ES"/>
-          </w:rPr>
-          <w:t>a</w:t>
-        </w:r>
-        <w:r>
-          <w:rPr>
-            <w:rStyle w:val="Hipervnculo"/>
-            <w:lang w:eastAsia="es-ES"/>
-          </w:rPr>
-          <w:t>c</w:t>
-        </w:r>
-        <w:r>
-          <w:rPr>
-            <w:rStyle w:val="Hipervnculo"/>
-            <w:lang w:eastAsia="es-ES"/>
-          </w:rPr>
-          <w:t>e</w:t>
+          <w:t>enlace</w:t>
         </w:r>
       </w:hyperlink>
       <w:r>
@@ -4839,7 +4888,7 @@
       <w:pPr>
         <w:pStyle w:val="Ttulo1"/>
       </w:pPr>
-      <w:bookmarkStart w:id="1" w:name="_Toc231472128"/>
+      <w:bookmarkStart w:id="1" w:name="_Toc231484961"/>
       <w:r>
         <w:t>2. Descripción del proyecto</w:t>
       </w:r>
@@ -4890,7 +4939,7 @@
       <w:pPr>
         <w:pStyle w:val="Ttulo2"/>
       </w:pPr>
-      <w:bookmarkStart w:id="2" w:name="_Toc231472129"/>
+      <w:bookmarkStart w:id="2" w:name="_Toc231484962"/>
       <w:r>
         <w:lastRenderedPageBreak/>
         <w:t>2.1 Usuarios del sistema</w:t>
@@ -4985,7 +5034,7 @@
       <w:pPr>
         <w:pStyle w:val="Ttulo2"/>
       </w:pPr>
-      <w:bookmarkStart w:id="3" w:name="_Toc231472130"/>
+      <w:bookmarkStart w:id="3" w:name="_Toc231484963"/>
       <w:r>
         <w:t>2.2 Funcionalidades para usuarios</w:t>
       </w:r>
@@ -5067,7 +5116,7 @@
       <w:pPr>
         <w:pStyle w:val="Ttulo2"/>
       </w:pPr>
-      <w:bookmarkStart w:id="4" w:name="_Toc231472131"/>
+      <w:bookmarkStart w:id="4" w:name="_Toc231484964"/>
       <w:r>
         <w:lastRenderedPageBreak/>
         <w:t>2.3 Funcionalidades para administradores</w:t>
@@ -5124,7 +5173,7 @@
       <w:pPr>
         <w:pStyle w:val="Ttulo1"/>
       </w:pPr>
-      <w:bookmarkStart w:id="5" w:name="_Toc231472132"/>
+      <w:bookmarkStart w:id="5" w:name="_Toc231484965"/>
       <w:r>
         <w:t>3. Objetivos del proyecto</w:t>
       </w:r>
@@ -5231,7 +5280,7 @@
       <w:pPr>
         <w:pStyle w:val="Ttulo1"/>
       </w:pPr>
-      <w:bookmarkStart w:id="6" w:name="_Toc231472133"/>
+      <w:bookmarkStart w:id="6" w:name="_Toc231484966"/>
       <w:r>
         <w:t>4. Tecnologías utilizadas</w:t>
       </w:r>
@@ -5498,7 +5547,7 @@
       <w:pPr>
         <w:pStyle w:val="Ttulo1"/>
       </w:pPr>
-      <w:bookmarkStart w:id="7" w:name="_Toc231472134"/>
+      <w:bookmarkStart w:id="7" w:name="_Toc231484967"/>
       <w:r>
         <w:t>5. Organización del equipo</w:t>
       </w:r>
@@ -5531,7 +5580,7 @@
       <w:pPr>
         <w:pStyle w:val="Ttulo1"/>
       </w:pPr>
-      <w:bookmarkStart w:id="8" w:name="_Toc231472135"/>
+      <w:bookmarkStart w:id="8" w:name="_Toc231484968"/>
       <w:r>
         <w:t>6. Planificación inicial</w:t>
       </w:r>
@@ -5694,7 +5743,7 @@
       <w:pPr>
         <w:pStyle w:val="Ttulo1"/>
       </w:pPr>
-      <w:bookmarkStart w:id="9" w:name="_Toc231472136"/>
+      <w:bookmarkStart w:id="9" w:name="_Toc231484969"/>
       <w:r>
         <w:t>7. Arquitectura del sistema</w:t>
       </w:r>
@@ -5749,7 +5798,7 @@
       <w:pPr>
         <w:pStyle w:val="Ttulo1"/>
       </w:pPr>
-      <w:bookmarkStart w:id="10" w:name="_Toc231472137"/>
+      <w:bookmarkStart w:id="10" w:name="_Toc231484970"/>
       <w:r>
         <w:t>8. Estado final y viabilidad</w:t>
       </w:r>
@@ -5808,7 +5857,7 @@
       <w:pPr>
         <w:pStyle w:val="Ttulo1"/>
       </w:pPr>
-      <w:bookmarkStart w:id="11" w:name="_Toc231472138"/>
+      <w:bookmarkStart w:id="11" w:name="_Toc231484971"/>
       <w:r>
         <w:t>9</w:t>
       </w:r>
@@ -5994,7 +6043,7 @@
       <w:pPr>
         <w:pStyle w:val="Ttulo2"/>
       </w:pPr>
-      <w:bookmarkStart w:id="12" w:name="_Toc231472139"/>
+      <w:bookmarkStart w:id="12" w:name="_Toc231484972"/>
       <w:r>
         <w:lastRenderedPageBreak/>
         <w:t>8.1 Integridad y Persistencia</w:t>
@@ -6030,7 +6079,7 @@
       <w:pPr>
         <w:pStyle w:val="Ttulo2"/>
       </w:pPr>
-      <w:bookmarkStart w:id="13" w:name="_Toc231472140"/>
+      <w:bookmarkStart w:id="13" w:name="_Toc231484973"/>
       <w:r>
         <w:t>8.2 Relaciones y esquema E/R</w:t>
       </w:r>
@@ -6259,7 +6308,7 @@
           <w:lang w:eastAsia="es-ES"/>
         </w:rPr>
       </w:pPr>
-      <w:bookmarkStart w:id="14" w:name="_Toc231472141"/>
+      <w:bookmarkStart w:id="14" w:name="_Toc231484974"/>
       <w:r>
         <w:rPr>
           <w:lang w:eastAsia="es-ES"/>
@@ -6308,7 +6357,7 @@
       <w:pPr>
         <w:pStyle w:val="Ttulo2"/>
       </w:pPr>
-      <w:bookmarkStart w:id="15" w:name="_Toc231472142"/>
+      <w:bookmarkStart w:id="15" w:name="_Toc231484975"/>
       <w:r>
         <w:lastRenderedPageBreak/>
         <w:t>10.1. Algoritmo de Organización y Normalización</w:t>
@@ -6365,7 +6414,15 @@
         <w:t xml:space="preserve">) </w:t>
       </w:r>
       <w:r>
-        <w:t>para sanear los nombres. Esta técnica es fundamental para eliminar caracteres que el sistema de archivos podría interpretar como comandos o rutas (como ../ o símbolos de sistema), garantizando la portabilidad entre servidores Linux y Windows.</w:t>
+        <w:t>para sanear los nombres. Esta técnica es fundamental para eliminar caracteres que el sistema de archivos podría interpretar como comandos o rutas (como</w:t>
+      </w:r>
+      <w:proofErr w:type="gramStart"/>
+      <w:r>
+        <w:t xml:space="preserve"> ..</w:t>
+      </w:r>
+      <w:proofErr w:type="gramEnd"/>
+      <w:r>
+        <w:t>/ o símbolos de sistema), garantizando la portabilidad entre servidores Linux y Windows.</w:t>
       </w:r>
     </w:p>
     <w:p>
@@ -6458,7 +6515,7 @@
       <w:pPr>
         <w:pStyle w:val="Ttulo2"/>
       </w:pPr>
-      <w:bookmarkStart w:id="16" w:name="_Toc231472143"/>
+      <w:bookmarkStart w:id="16" w:name="_Toc231484976"/>
       <w:r>
         <w:t>10.2. Estructura de Directorios Dinámica</w:t>
       </w:r>
@@ -6598,7 +6655,7 @@
       <w:pPr>
         <w:pStyle w:val="Ttulo2"/>
       </w:pPr>
-      <w:bookmarkStart w:id="17" w:name="_Toc231472144"/>
+      <w:bookmarkStart w:id="17" w:name="_Toc231484977"/>
       <w:r>
         <w:t>10.3. Gestión de la Integridad</w:t>
       </w:r>
@@ -6680,7 +6737,15 @@
       </w:r>
       <w:proofErr w:type="spellEnd"/>
       <w:r>
-        <w:t>(), ignorando los punteros de navegación de sistema (. y ..).</w:t>
+        <w:t>(), ignorando los punteros de navegación de sistema (. y</w:t>
+      </w:r>
+      <w:proofErr w:type="gramStart"/>
+      <w:r>
+        <w:t xml:space="preserve"> ..</w:t>
+      </w:r>
+      <w:proofErr w:type="gramEnd"/>
+      <w:r>
+        <w:t>).</w:t>
       </w:r>
     </w:p>
     <w:p>
@@ -6734,7 +6799,7 @@
       <w:pPr>
         <w:pStyle w:val="Ttulo2"/>
       </w:pPr>
-      <w:bookmarkStart w:id="18" w:name="_Toc231472145"/>
+      <w:bookmarkStart w:id="18" w:name="_Toc231484978"/>
       <w:r>
         <w:t>10.4. Explicación Técnica de Funcionamiento</w:t>
       </w:r>
@@ -6918,7 +6983,7 @@
       <w:pPr>
         <w:pStyle w:val="Ttulo2"/>
       </w:pPr>
-      <w:bookmarkStart w:id="19" w:name="_Toc231472146"/>
+      <w:bookmarkStart w:id="19" w:name="_Toc231484979"/>
       <w:r>
         <w:t>10.5. Ejemplo del Flujo de Nombres</w:t>
       </w:r>
@@ -7506,7 +7571,7 @@
       <w:pPr>
         <w:pStyle w:val="Ttulo1"/>
       </w:pPr>
-      <w:bookmarkStart w:id="20" w:name="_Toc231472147"/>
+      <w:bookmarkStart w:id="20" w:name="_Toc231484980"/>
       <w:r>
         <w:t>11. Motor de Ejecución y Gestión de Sesión</w:t>
       </w:r>
@@ -7531,7 +7596,7 @@
       <w:pPr>
         <w:pStyle w:val="Ttulo2"/>
       </w:pPr>
-      <w:bookmarkStart w:id="21" w:name="_Toc231472148"/>
+      <w:bookmarkStart w:id="21" w:name="_Toc231484981"/>
       <w:r>
         <w:t>11.1. Gestión Dinámica de Colas Privadas</w:t>
       </w:r>
@@ -7682,7 +7747,7 @@
       <w:pPr>
         <w:pStyle w:val="Ttulo2"/>
       </w:pPr>
-      <w:bookmarkStart w:id="22" w:name="_Toc231472149"/>
+      <w:bookmarkStart w:id="22" w:name="_Toc231484982"/>
       <w:r>
         <w:t>11.2. Arquitectura del Reproductor Dual</w:t>
       </w:r>
@@ -7793,7 +7858,7 @@
       <w:pPr>
         <w:pStyle w:val="Ttulo2"/>
       </w:pPr>
-      <w:bookmarkStart w:id="23" w:name="_Toc231472150"/>
+      <w:bookmarkStart w:id="23" w:name="_Toc231484983"/>
       <w:r>
         <w:t>11.3. Motor de Sincronización Avanzada</w:t>
       </w:r>
@@ -7945,7 +8010,7 @@
       <w:pPr>
         <w:pStyle w:val="Ttulo2"/>
       </w:pPr>
-      <w:bookmarkStart w:id="24" w:name="_Toc231472151"/>
+      <w:bookmarkStart w:id="24" w:name="_Toc231484984"/>
       <w:r>
         <w:t>11.4. Interfaz de Escenario</w:t>
       </w:r>
@@ -7985,7 +8050,7 @@
       <w:pPr>
         <w:pStyle w:val="Ttulo1"/>
       </w:pPr>
-      <w:bookmarkStart w:id="25" w:name="_Toc231472152"/>
+      <w:bookmarkStart w:id="25" w:name="_Toc231484985"/>
       <w:r>
         <w:t>12</w:t>
       </w:r>
@@ -8014,7 +8079,7 @@
       <w:pPr>
         <w:pStyle w:val="Ttulo2"/>
       </w:pPr>
-      <w:bookmarkStart w:id="26" w:name="_Toc231472153"/>
+      <w:bookmarkStart w:id="26" w:name="_Toc231484986"/>
       <w:r>
         <w:t>12</w:t>
       </w:r>
@@ -8147,7 +8212,7 @@
       <w:pPr>
         <w:pStyle w:val="Ttulo2"/>
       </w:pPr>
-      <w:bookmarkStart w:id="27" w:name="_Toc231472154"/>
+      <w:bookmarkStart w:id="27" w:name="_Toc231484987"/>
       <w:r>
         <w:t>12</w:t>
       </w:r>
@@ -8368,7 +8433,7 @@
       <w:pPr>
         <w:pStyle w:val="Ttulo2"/>
       </w:pPr>
-      <w:bookmarkStart w:id="28" w:name="_Toc231472155"/>
+      <w:bookmarkStart w:id="28" w:name="_Toc231484988"/>
       <w:r>
         <w:t>12</w:t>
       </w:r>
@@ -8755,7 +8820,7 @@
       <w:pPr>
         <w:pStyle w:val="Ttulo1"/>
       </w:pPr>
-      <w:bookmarkStart w:id="29" w:name="_Toc231472156"/>
+      <w:bookmarkStart w:id="29" w:name="_Toc231484989"/>
       <w:r>
         <w:t>13. Conectividad e Infraestructura de Comunicación</w:t>
       </w:r>
@@ -8782,7 +8847,7 @@
           <w:u w:val="single"/>
         </w:rPr>
       </w:pPr>
-      <w:bookmarkStart w:id="30" w:name="_Toc231472157"/>
+      <w:bookmarkStart w:id="30" w:name="_Toc231484990"/>
       <w:r>
         <w:rPr>
           <w:rStyle w:val="Ttulo2Car"/>
@@ -8859,7 +8924,7 @@
       <w:pPr>
         <w:pStyle w:val="Ttulo2"/>
       </w:pPr>
-      <w:bookmarkStart w:id="31" w:name="_Toc231472158"/>
+      <w:bookmarkStart w:id="31" w:name="_Toc231484991"/>
       <w:r>
         <w:t>13</w:t>
       </w:r>
@@ -8922,7 +8987,7 @@
       <w:pPr>
         <w:pStyle w:val="Ttulo2"/>
       </w:pPr>
-      <w:bookmarkStart w:id="32" w:name="_Toc231472159"/>
+      <w:bookmarkStart w:id="32" w:name="_Toc231484992"/>
       <w:r>
         <w:t>13</w:t>
       </w:r>
@@ -8974,7 +9039,7 @@
       <w:pPr>
         <w:pStyle w:val="Ttulo2"/>
       </w:pPr>
-      <w:bookmarkStart w:id="33" w:name="_Toc231472160"/>
+      <w:bookmarkStart w:id="33" w:name="_Toc231484993"/>
       <w:r>
         <w:t>13.4. Automatización de Infraestructura y Despliegue Continuo</w:t>
       </w:r>
@@ -9188,7 +9253,7 @@
       <w:pPr>
         <w:pStyle w:val="Ttulo3"/>
       </w:pPr>
-      <w:bookmarkStart w:id="34" w:name="_Toc231472161"/>
+      <w:bookmarkStart w:id="34" w:name="_Toc231484994"/>
       <w:r>
         <w:t xml:space="preserve">13.4.1 Crear </w:t>
       </w:r>
@@ -9324,7 +9389,7 @@
       <w:pPr>
         <w:pStyle w:val="Ttulo3"/>
       </w:pPr>
-      <w:bookmarkStart w:id="35" w:name="_Toc231472162"/>
+      <w:bookmarkStart w:id="35" w:name="_Toc231484995"/>
       <w:r>
         <w:t xml:space="preserve">13.4.2 </w:t>
       </w:r>
@@ -9673,7 +9738,7 @@
           <w:u w:val="single"/>
         </w:rPr>
       </w:pPr>
-      <w:bookmarkStart w:id="36" w:name="_Toc231472163"/>
+      <w:bookmarkStart w:id="36" w:name="_Toc231484996"/>
       <w:r>
         <w:t>13.4.3</w:t>
       </w:r>
@@ -10056,7 +10121,7 @@
       <w:pPr>
         <w:pStyle w:val="Ttulo2"/>
       </w:pPr>
-      <w:bookmarkStart w:id="37" w:name="_Toc231472164"/>
+      <w:bookmarkStart w:id="37" w:name="_Toc231484997"/>
       <w:r>
         <w:t>13.5. Tareas Programadas y Automatización de Permisos en el Servidor</w:t>
       </w:r>
@@ -10122,7 +10187,7 @@
       <w:pPr>
         <w:pStyle w:val="Ttulo3"/>
       </w:pPr>
-      <w:bookmarkStart w:id="38" w:name="_Toc231472165"/>
+      <w:bookmarkStart w:id="38" w:name="_Toc231484998"/>
       <w:r>
         <w:t>13.5.1. El problema de los permisos en un proyecto vivo</w:t>
       </w:r>
@@ -10230,7 +10295,7 @@
       <w:pPr>
         <w:pStyle w:val="Ttulo3"/>
       </w:pPr>
-      <w:bookmarkStart w:id="39" w:name="_Toc231472166"/>
+      <w:bookmarkStart w:id="39" w:name="_Toc231484999"/>
       <w:r>
         <w:t>13.5.2. La solución: Un revisor automático paso a paso</w:t>
       </w:r>
@@ -10757,7 +10822,7 @@
       <w:pPr>
         <w:pStyle w:val="Ttulo1"/>
       </w:pPr>
-      <w:bookmarkStart w:id="40" w:name="_Toc231472167"/>
+      <w:bookmarkStart w:id="40" w:name="_Toc231485000"/>
       <w:r>
         <w:t>14. Manual de incorporación de canciones al sistema de karaoke</w:t>
       </w:r>
@@ -10778,7 +10843,7 @@
       <w:pPr>
         <w:pStyle w:val="Ttulo2"/>
       </w:pPr>
-      <w:bookmarkStart w:id="41" w:name="_Toc231472168"/>
+      <w:bookmarkStart w:id="41" w:name="_Toc231485001"/>
       <w:r>
         <w:t>14.1. Obtención de la canción</w:t>
       </w:r>
@@ -10919,7 +10984,7 @@
       <w:pPr>
         <w:pStyle w:val="Ttulo2"/>
       </w:pPr>
-      <w:bookmarkStart w:id="42" w:name="_Toc231472169"/>
+      <w:bookmarkStart w:id="42" w:name="_Toc231485002"/>
       <w:r>
         <w:t xml:space="preserve">14.2. Procesamiento de audio con </w:t>
       </w:r>
@@ -11373,7 +11438,7 @@
       <w:pPr>
         <w:pStyle w:val="Ttulo2"/>
       </w:pPr>
-      <w:bookmarkStart w:id="43" w:name="_Toc231472170"/>
+      <w:bookmarkStart w:id="43" w:name="_Toc231485003"/>
       <w:r>
         <w:t>14.3. Generación y sincronización de la letra</w:t>
       </w:r>
@@ -12042,7 +12107,7 @@
       <w:pPr>
         <w:pStyle w:val="Ttulo2"/>
       </w:pPr>
-      <w:bookmarkStart w:id="44" w:name="_Toc231472171"/>
+      <w:bookmarkStart w:id="44" w:name="_Toc231485004"/>
       <w:r>
         <w:t>14.4. Alta de la canción en el sistema de administración</w:t>
       </w:r>
@@ -12652,7 +12717,7 @@
       <w:pPr>
         <w:pStyle w:val="Ttulo2"/>
       </w:pPr>
-      <w:bookmarkStart w:id="45" w:name="_Toc231472172"/>
+      <w:bookmarkStart w:id="45" w:name="_Toc231485005"/>
       <w:r>
         <w:lastRenderedPageBreak/>
         <w:t>14.5. Comprobación final</w:t>
@@ -12753,7 +12818,7 @@
       <w:pPr>
         <w:pStyle w:val="Ttulo1"/>
       </w:pPr>
-      <w:bookmarkStart w:id="46" w:name="_Toc231472173"/>
+      <w:bookmarkStart w:id="46" w:name="_Toc231485006"/>
       <w:r>
         <w:t xml:space="preserve">15. Alternativa de pago para generación automática de karaoke: </w:t>
       </w:r>
@@ -13309,9 +13374,11 @@
       <w:pPr>
         <w:pStyle w:val="Ttulo1"/>
       </w:pPr>
+      <w:bookmarkStart w:id="47" w:name="_Toc231485007"/>
       <w:r>
         <w:t>16. Problemas y retos surgidos durante el desarrollo</w:t>
       </w:r>
+      <w:bookmarkEnd w:id="47"/>
     </w:p>
     <w:p/>
     <w:p>
@@ -13466,11 +13533,11 @@
       <w:pPr>
         <w:pStyle w:val="Ttulo1"/>
       </w:pPr>
-      <w:bookmarkStart w:id="47" w:name="_Toc231472174"/>
+      <w:bookmarkStart w:id="48" w:name="_Toc231485008"/>
       <w:r>
         <w:t>16. Usuarios de prueba</w:t>
       </w:r>
-      <w:bookmarkEnd w:id="47"/>
+      <w:bookmarkEnd w:id="48"/>
     </w:p>
     <w:p/>
     <w:p>
@@ -13634,7 +13701,7 @@
       <w:pPr>
         <w:pStyle w:val="Ttulo1"/>
       </w:pPr>
-      <w:bookmarkStart w:id="48" w:name="_Toc231472175"/>
+      <w:bookmarkStart w:id="49" w:name="_Toc231485009"/>
       <w:r>
         <w:t>1</w:t>
       </w:r>
@@ -13647,7 +13714,7 @@
       <w:r>
         <w:t>Reflexión final</w:t>
       </w:r>
-      <w:bookmarkEnd w:id="48"/>
+      <w:bookmarkEnd w:id="49"/>
     </w:p>
     <w:p/>
     <w:p>

</xml_diff>